<commit_message>
docs: VAL.1 시스템 Validation 신설, HVT를 HWE.3-4로 정정, 요구 폴더명 정리
- VAL-PLT-001 시스템 Validation 명세서 신설 (VAL.1, V&V 최상단 — 고객요구 대비 실차 시연 확인)

- 10_HWE.4 -> 10_HWE.3-4 (HVT가 HW 설계검증 HV-14·15 + HW 요구검증 HV-01~13 모두 커버)

- 폴더명 정리: 01 고객요구사항·02 시스템요구사항·03 SW요구사항·04 HW요구사항, .gitignore에 Word 잠금파일 추가

Co-Authored-By: Claude Opus 4.8 <noreply@anthropic.com>
</commit_message>
<xml_diff>
--- a/docs/05_SWE.2_SW아키텍처/ICD-PLT-001_인터페이스명세서_v1.0.docx
+++ b/docs/05_SWE.2_SW아키텍처/ICD-PLT-001_인터페이스명세서_v1.0.docx
@@ -209,21 +209,11 @@
             </w:tcMar>
           </w:tcPr>
           <w:p>
-            <w:pPr>
-              <w:rPr>
-                <w:rFonts w:hint="eastAsia"/>
-              </w:rPr>
-            </w:pPr>
             <w:r>
               <w:rPr>
                 <w:rFonts w:eastAsia="Arial"/>
               </w:rPr>
               <w:t>v1.0</w:t>
-            </w:r>
-            <w:r>
-              <w:rPr>
-                <w:rFonts w:hint="eastAsia"/>
-              </w:rPr>
             </w:r>
           </w:p>
         </w:tc>
@@ -396,11 +386,16 @@
             </w:tcMar>
           </w:tcPr>
           <w:p>
-            <w:r>
-              <w:rPr>
-                <w:rFonts w:ascii="Arial Unicode MS" w:eastAsia="Arial Unicode MS" w:hAnsi="Arial Unicode MS" w:cs="Arial Unicode MS"/>
-              </w:rPr>
-              <w:t>미정</w:t>
+            <w:pPr>
+              <w:rPr>
+                <w:rFonts w:hint="eastAsia"/>
+              </w:rPr>
+            </w:pPr>
+            <w:r>
+              <w:rPr>
+                <w:rFonts w:ascii="Arial Unicode MS" w:hAnsi="Arial Unicode MS" w:cs="Arial Unicode MS" w:hint="eastAsia"/>
+              </w:rPr>
+              <w:t>허지욱</w:t>
             </w:r>
           </w:p>
         </w:tc>
@@ -455,21 +450,11 @@
             </w:tcMar>
           </w:tcPr>
           <w:p>
-            <w:pPr>
-              <w:rPr>
-                <w:rFonts w:hint="eastAsia"/>
-              </w:rPr>
-            </w:pPr>
             <w:r>
               <w:rPr>
                 <w:rFonts w:ascii="맑은 고딕" w:eastAsia="맑은 고딕" w:hAnsi="맑은 고딕" w:cs="맑은 고딕" w:hint="eastAsia"/>
               </w:rPr>
               <w:t>승인 (Approved) · Baseline 2026-06-12</w:t>
-            </w:r>
-            <w:r>
-              <w:rPr>
-                <w:rFonts w:ascii="Arial Unicode MS" w:hAnsi="Arial Unicode MS" w:cs="Arial Unicode MS" w:hint="eastAsia"/>
-              </w:rPr>
             </w:r>
           </w:p>
         </w:tc>
@@ -1602,28 +1587,6 @@
         </w:rPr>
         <w:t>•  내부: 메시지 버스 토픽 7종 (차량 내부 전용 — 단일 프로세스 공유메모리)</w:t>
       </w:r>
-      <w:r>
-        <w:rPr>
-          <w:rFonts w:ascii="Arial Unicode MS" w:eastAsia="Arial Unicode MS" w:hAnsi="Arial Unicode MS" w:cs="Arial Unicode MS"/>
-          <w:color w:val="1155CC"/>
-        </w:rPr>
-      </w:r>
-      <w:r>
-        <w:rPr>
-          <w:rFonts w:ascii="Arial Unicode MS" w:eastAsia="Arial Unicode MS" w:hAnsi="Arial Unicode MS" w:cs="Arial Unicode MS"/>
-        </w:rPr>
-      </w:r>
-      <w:r>
-        <w:rPr>
-          <w:rFonts w:eastAsia="Arial"/>
-          <w:color w:val="1155CC"/>
-        </w:rPr>
-      </w:r>
-      <w:r>
-        <w:rPr>
-          <w:rFonts w:ascii="Arial Unicode MS" w:eastAsia="Arial Unicode MS" w:hAnsi="Arial Unicode MS" w:cs="Arial Unicode MS"/>
-        </w:rPr>
-      </w:r>
     </w:p>
     <w:p>
       <w:pPr>
@@ -1647,17 +1610,6 @@
           <w:rFonts w:ascii="Arial Unicode MS" w:eastAsia="Arial Unicode MS" w:hAnsi="Arial Unicode MS" w:cs="Arial Unicode MS"/>
         </w:rPr>
         <w:t>•  HW: 센서·액추에이터 신호 (CSI, GPIO, PWM — HWD-PLT-001 3.2 핀 할당 연계)</w:t>
-      </w:r>
-      <w:r>
-        <w:rPr>
-          <w:rFonts w:eastAsia="Arial"/>
-          <w:color w:val="3C78D8"/>
-        </w:rPr>
-      </w:r>
-      <w:r>
-        <w:rPr>
-          <w:rFonts w:ascii="Arial Unicode MS" w:eastAsia="Arial Unicode MS" w:hAnsi="Arial Unicode MS" w:cs="Arial Unicode MS"/>
-        </w:rPr>
       </w:r>
     </w:p>
     <w:p/>
@@ -2173,6 +2125,7 @@
                 <w:sz w:val="18"/>
                 <w:szCs w:val="18"/>
               </w:rPr>
+              <w:lastRenderedPageBreak/>
               <w:t>CACC</w:t>
             </w:r>
           </w:p>
@@ -2444,8 +2397,8 @@
       </w:tblPr>
       <w:tblGrid>
         <w:gridCol w:w="900"/>
-        <w:gridCol w:w="1100"/>
-        <w:gridCol w:w="2100"/>
+        <w:gridCol w:w="1647"/>
+        <w:gridCol w:w="1553"/>
         <w:gridCol w:w="2426"/>
         <w:gridCol w:w="1200"/>
         <w:gridCol w:w="1300"/>
@@ -2486,7 +2439,7 @@
         </w:tc>
         <w:tc>
           <w:tcPr>
-            <w:tcW w:w="1100" w:type="dxa"/>
+            <w:tcW w:w="1647" w:type="dxa"/>
             <w:tcBorders>
               <w:top w:val="single" w:sz="4" w:space="0" w:color="FFFFFF"/>
               <w:left w:val="single" w:sz="4" w:space="0" w:color="FFFFFF"/>
@@ -2519,7 +2472,7 @@
         </w:tc>
         <w:tc>
           <w:tcPr>
-            <w:tcW w:w="2100" w:type="dxa"/>
+            <w:tcW w:w="1553" w:type="dxa"/>
             <w:tcBorders>
               <w:top w:val="single" w:sz="4" w:space="0" w:color="FFFFFF"/>
               <w:left w:val="single" w:sz="4" w:space="0" w:color="FFFFFF"/>
@@ -2688,7 +2641,7 @@
         </w:tc>
         <w:tc>
           <w:tcPr>
-            <w:tcW w:w="1100" w:type="dxa"/>
+            <w:tcW w:w="1647" w:type="dxa"/>
             <w:tcBorders>
               <w:top w:val="single" w:sz="4" w:space="0" w:color="CCCCCC"/>
               <w:left w:val="single" w:sz="4" w:space="0" w:color="CCCCCC"/>
@@ -2721,23 +2674,26 @@
         </w:tc>
         <w:tc>
           <w:tcPr>
-            <w:tcW w:w="2100" w:type="dxa"/>
-            <w:tcBorders>
-              <w:top w:val="single" w:sz="4" w:space="0" w:color="CCCCCC"/>
-              <w:left w:val="single" w:sz="4" w:space="0" w:color="CCCCCC"/>
-              <w:bottom w:val="single" w:sz="4" w:space="0" w:color="CCCCCC"/>
-              <w:right w:val="single" w:sz="4" w:space="0" w:color="CCCCCC"/>
-            </w:tcBorders>
-            <w:shd w:val="clear" w:color="auto" w:fill="DEEAF1"/>
-            <w:tcMar>
-              <w:top w:w="60" w:type="dxa"/>
-              <w:left w:w="140" w:type="dxa"/>
-              <w:bottom w:w="60" w:type="dxa"/>
-              <w:right w:w="140" w:type="dxa"/>
-            </w:tcMar>
-            <w:vAlign w:val="center"/>
-          </w:tcPr>
-          <w:p>
+            <w:tcW w:w="1553" w:type="dxa"/>
+            <w:tcBorders>
+              <w:top w:val="single" w:sz="4" w:space="0" w:color="CCCCCC"/>
+              <w:left w:val="single" w:sz="4" w:space="0" w:color="CCCCCC"/>
+              <w:bottom w:val="single" w:sz="4" w:space="0" w:color="CCCCCC"/>
+              <w:right w:val="single" w:sz="4" w:space="0" w:color="CCCCCC"/>
+            </w:tcBorders>
+            <w:shd w:val="clear" w:color="auto" w:fill="DEEAF1"/>
+            <w:tcMar>
+              <w:top w:w="60" w:type="dxa"/>
+              <w:left w:w="140" w:type="dxa"/>
+              <w:bottom w:w="60" w:type="dxa"/>
+              <w:right w:w="140" w:type="dxa"/>
+            </w:tcMar>
+            <w:vAlign w:val="center"/>
+          </w:tcPr>
+          <w:p>
+            <w:pPr>
+              <w:jc w:val="center"/>
+            </w:pPr>
             <w:r>
               <w:rPr>
                 <w:rFonts w:ascii="Arial Unicode MS" w:eastAsia="Arial Unicode MS" w:hAnsi="Arial Unicode MS" w:cs="Arial Unicode MS"/>
@@ -2778,22 +2734,6 @@
                 <w:szCs w:val="18"/>
               </w:rPr>
               <w:t>인지</w:t>
-            </w:r>
-            <w:r>
-              <w:rPr>
-                <w:rFonts w:ascii="Arial Unicode MS" w:hAnsi="Arial Unicode MS" w:cs="Arial Unicode MS" w:hint="eastAsia"/>
-                <w:color w:val="000000"/>
-                <w:sz w:val="18"/>
-                <w:szCs w:val="18"/>
-              </w:rPr>
-            </w:r>
-            <w:r>
-              <w:rPr>
-                <w:rFonts w:ascii="Arial Unicode MS" w:eastAsia="Arial Unicode MS" w:hAnsi="Arial Unicode MS" w:cs="Arial Unicode MS"/>
-                <w:color w:val="000000"/>
-                <w:sz w:val="18"/>
-                <w:szCs w:val="18"/>
-              </w:rPr>
             </w:r>
           </w:p>
         </w:tc>
@@ -2902,7 +2842,7 @@
         </w:tc>
         <w:tc>
           <w:tcPr>
-            <w:tcW w:w="1100" w:type="dxa"/>
+            <w:tcW w:w="1647" w:type="dxa"/>
             <w:tcBorders>
               <w:top w:val="single" w:sz="4" w:space="0" w:color="CCCCCC"/>
               <w:left w:val="single" w:sz="4" w:space="0" w:color="CCCCCC"/>
@@ -2935,7 +2875,7 @@
         </w:tc>
         <w:tc>
           <w:tcPr>
-            <w:tcW w:w="2100" w:type="dxa"/>
+            <w:tcW w:w="1553" w:type="dxa"/>
             <w:tcBorders>
               <w:top w:val="single" w:sz="4" w:space="0" w:color="CCCCCC"/>
               <w:left w:val="single" w:sz="4" w:space="0" w:color="CCCCCC"/>
@@ -2952,6 +2892,9 @@
             <w:vAlign w:val="center"/>
           </w:tcPr>
           <w:p>
+            <w:pPr>
+              <w:jc w:val="center"/>
+            </w:pPr>
             <w:r>
               <w:rPr>
                 <w:rFonts w:ascii="Arial Unicode MS" w:eastAsia="Arial Unicode MS" w:hAnsi="Arial Unicode MS" w:cs="Arial Unicode MS"/>
@@ -2992,30 +2935,6 @@
                 <w:szCs w:val="18"/>
               </w:rPr>
               <w:t>판단</w:t>
-            </w:r>
-            <w:r>
-              <w:rPr>
-                <w:rFonts w:ascii="Arial Unicode MS" w:eastAsia="Arial Unicode MS" w:hAnsi="Arial Unicode MS" w:cs="Arial Unicode MS"/>
-                <w:color w:val="000000"/>
-                <w:sz w:val="18"/>
-                <w:szCs w:val="18"/>
-              </w:rPr>
-            </w:r>
-            <w:r>
-              <w:rPr>
-                <w:rFonts w:ascii="Arial Unicode MS" w:hAnsi="Arial Unicode MS" w:cs="Arial Unicode MS" w:hint="eastAsia"/>
-                <w:color w:val="000000"/>
-                <w:sz w:val="18"/>
-                <w:szCs w:val="18"/>
-              </w:rPr>
-            </w:r>
-            <w:r>
-              <w:rPr>
-                <w:rFonts w:ascii="Arial Unicode MS" w:eastAsia="Arial Unicode MS" w:hAnsi="Arial Unicode MS" w:cs="Arial Unicode MS"/>
-                <w:color w:val="000000"/>
-                <w:sz w:val="18"/>
-                <w:szCs w:val="18"/>
-              </w:rPr>
             </w:r>
           </w:p>
         </w:tc>
@@ -3124,7 +3043,7 @@
         </w:tc>
         <w:tc>
           <w:tcPr>
-            <w:tcW w:w="1100" w:type="dxa"/>
+            <w:tcW w:w="1647" w:type="dxa"/>
             <w:tcBorders>
               <w:top w:val="single" w:sz="4" w:space="0" w:color="CCCCCC"/>
               <w:left w:val="single" w:sz="4" w:space="0" w:color="CCCCCC"/>
@@ -3157,23 +3076,26 @@
         </w:tc>
         <w:tc>
           <w:tcPr>
-            <w:tcW w:w="2100" w:type="dxa"/>
-            <w:tcBorders>
-              <w:top w:val="single" w:sz="4" w:space="0" w:color="CCCCCC"/>
-              <w:left w:val="single" w:sz="4" w:space="0" w:color="CCCCCC"/>
-              <w:bottom w:val="single" w:sz="4" w:space="0" w:color="CCCCCC"/>
-              <w:right w:val="single" w:sz="4" w:space="0" w:color="CCCCCC"/>
-            </w:tcBorders>
-            <w:shd w:val="clear" w:color="auto" w:fill="DEEAF1"/>
-            <w:tcMar>
-              <w:top w:w="60" w:type="dxa"/>
-              <w:left w:w="140" w:type="dxa"/>
-              <w:bottom w:w="60" w:type="dxa"/>
-              <w:right w:w="140" w:type="dxa"/>
-            </w:tcMar>
-            <w:vAlign w:val="center"/>
-          </w:tcPr>
-          <w:p>
+            <w:tcW w:w="1553" w:type="dxa"/>
+            <w:tcBorders>
+              <w:top w:val="single" w:sz="4" w:space="0" w:color="CCCCCC"/>
+              <w:left w:val="single" w:sz="4" w:space="0" w:color="CCCCCC"/>
+              <w:bottom w:val="single" w:sz="4" w:space="0" w:color="CCCCCC"/>
+              <w:right w:val="single" w:sz="4" w:space="0" w:color="CCCCCC"/>
+            </w:tcBorders>
+            <w:shd w:val="clear" w:color="auto" w:fill="DEEAF1"/>
+            <w:tcMar>
+              <w:top w:w="60" w:type="dxa"/>
+              <w:left w:w="140" w:type="dxa"/>
+              <w:bottom w:w="60" w:type="dxa"/>
+              <w:right w:w="140" w:type="dxa"/>
+            </w:tcMar>
+            <w:vAlign w:val="center"/>
+          </w:tcPr>
+          <w:p>
+            <w:pPr>
+              <w:jc w:val="center"/>
+            </w:pPr>
             <w:r>
               <w:rPr>
                 <w:rFonts w:ascii="Arial Unicode MS" w:eastAsia="Arial Unicode MS" w:hAnsi="Arial Unicode MS" w:cs="Arial Unicode MS"/>
@@ -3214,22 +3136,6 @@
                 <w:szCs w:val="18"/>
               </w:rPr>
               <w:t>판단</w:t>
-            </w:r>
-            <w:r>
-              <w:rPr>
-                <w:rFonts w:ascii="Arial Unicode MS" w:hAnsi="Arial Unicode MS" w:cs="Arial Unicode MS" w:hint="eastAsia"/>
-                <w:color w:val="000000"/>
-                <w:sz w:val="18"/>
-                <w:szCs w:val="18"/>
-              </w:rPr>
-            </w:r>
-            <w:r>
-              <w:rPr>
-                <w:rFonts w:ascii="Arial Unicode MS" w:eastAsia="Arial Unicode MS" w:hAnsi="Arial Unicode MS" w:cs="Arial Unicode MS"/>
-                <w:color w:val="000000"/>
-                <w:sz w:val="18"/>
-                <w:szCs w:val="18"/>
-              </w:rPr>
             </w:r>
           </w:p>
         </w:tc>
@@ -3338,7 +3244,7 @@
         </w:tc>
         <w:tc>
           <w:tcPr>
-            <w:tcW w:w="1100" w:type="dxa"/>
+            <w:tcW w:w="1647" w:type="dxa"/>
             <w:tcBorders>
               <w:top w:val="single" w:sz="4" w:space="0" w:color="CCCCCC"/>
               <w:left w:val="single" w:sz="4" w:space="0" w:color="CCCCCC"/>
@@ -3371,7 +3277,7 @@
         </w:tc>
         <w:tc>
           <w:tcPr>
-            <w:tcW w:w="2100" w:type="dxa"/>
+            <w:tcW w:w="1553" w:type="dxa"/>
             <w:tcBorders>
               <w:top w:val="single" w:sz="4" w:space="0" w:color="CCCCCC"/>
               <w:left w:val="single" w:sz="4" w:space="0" w:color="CCCCCC"/>
@@ -3388,6 +3294,9 @@
             <w:vAlign w:val="center"/>
           </w:tcPr>
           <w:p>
+            <w:pPr>
+              <w:jc w:val="center"/>
+            </w:pPr>
             <w:r>
               <w:rPr>
                 <w:rFonts w:ascii="Arial Unicode MS" w:eastAsia="Arial Unicode MS" w:hAnsi="Arial Unicode MS" w:cs="Arial Unicode MS"/>
@@ -3422,7 +3331,7 @@
           <w:p>
             <w:pPr>
               <w:rPr>
-                <w:rFonts w:ascii="Arial Unicode MS" w:hAnsi="Arial Unicode MS" w:cs="Arial Unicode MS"/>
+                <w:rFonts w:ascii="Arial Unicode MS" w:hAnsi="Arial Unicode MS" w:cs="Arial Unicode MS" w:hint="eastAsia"/>
                 <w:color w:val="000000"/>
                 <w:sz w:val="18"/>
                 <w:szCs w:val="18"/>
@@ -3438,21 +3347,7 @@
               <w:t>주행</w:t>
             </w:r>
           </w:p>
-          <w:p>
-            <w:pPr>
-              <w:rPr>
-                <w:rFonts w:hint="eastAsia"/>
-              </w:rPr>
-            </w:pPr>
-            <w:r>
-              <w:rPr>
-                <w:rFonts w:ascii="Arial Unicode MS" w:hAnsi="Arial Unicode MS" w:cs="Arial Unicode MS" w:hint="eastAsia"/>
-                <w:color w:val="000000"/>
-                <w:sz w:val="18"/>
-                <w:szCs w:val="18"/>
-              </w:rPr>
-            </w:r>
-          </w:p>
+          <w:p/>
         </w:tc>
         <w:tc>
           <w:tcPr>
@@ -3559,7 +3454,7 @@
         </w:tc>
         <w:tc>
           <w:tcPr>
-            <w:tcW w:w="1100" w:type="dxa"/>
+            <w:tcW w:w="1647" w:type="dxa"/>
             <w:tcBorders>
               <w:top w:val="single" w:sz="4" w:space="0" w:color="CCCCCC"/>
               <w:left w:val="single" w:sz="4" w:space="0" w:color="CCCCCC"/>
@@ -3592,23 +3487,26 @@
         </w:tc>
         <w:tc>
           <w:tcPr>
-            <w:tcW w:w="2100" w:type="dxa"/>
-            <w:tcBorders>
-              <w:top w:val="single" w:sz="4" w:space="0" w:color="CCCCCC"/>
-              <w:left w:val="single" w:sz="4" w:space="0" w:color="CCCCCC"/>
-              <w:bottom w:val="single" w:sz="4" w:space="0" w:color="CCCCCC"/>
-              <w:right w:val="single" w:sz="4" w:space="0" w:color="CCCCCC"/>
-            </w:tcBorders>
-            <w:shd w:val="clear" w:color="auto" w:fill="DEEAF1"/>
-            <w:tcMar>
-              <w:top w:w="60" w:type="dxa"/>
-              <w:left w:w="140" w:type="dxa"/>
-              <w:bottom w:w="60" w:type="dxa"/>
-              <w:right w:w="140" w:type="dxa"/>
-            </w:tcMar>
-            <w:vAlign w:val="center"/>
-          </w:tcPr>
-          <w:p>
+            <w:tcW w:w="1553" w:type="dxa"/>
+            <w:tcBorders>
+              <w:top w:val="single" w:sz="4" w:space="0" w:color="CCCCCC"/>
+              <w:left w:val="single" w:sz="4" w:space="0" w:color="CCCCCC"/>
+              <w:bottom w:val="single" w:sz="4" w:space="0" w:color="CCCCCC"/>
+              <w:right w:val="single" w:sz="4" w:space="0" w:color="CCCCCC"/>
+            </w:tcBorders>
+            <w:shd w:val="clear" w:color="auto" w:fill="DEEAF1"/>
+            <w:tcMar>
+              <w:top w:w="60" w:type="dxa"/>
+              <w:left w:w="140" w:type="dxa"/>
+              <w:bottom w:w="60" w:type="dxa"/>
+              <w:right w:w="140" w:type="dxa"/>
+            </w:tcMar>
+            <w:vAlign w:val="center"/>
+          </w:tcPr>
+          <w:p>
+            <w:pPr>
+              <w:jc w:val="center"/>
+            </w:pPr>
             <w:r>
               <w:rPr>
                 <w:rFonts w:ascii="Arial Unicode MS" w:eastAsia="Arial Unicode MS" w:hAnsi="Arial Unicode MS" w:cs="Arial Unicode MS"/>
@@ -3643,7 +3541,7 @@
           <w:p>
             <w:pPr>
               <w:rPr>
-                <w:rFonts w:ascii="Arial Unicode MS" w:hAnsi="Arial Unicode MS" w:cs="Arial Unicode MS"/>
+                <w:rFonts w:ascii="Arial Unicode MS" w:hAnsi="Arial Unicode MS" w:cs="Arial Unicode MS" w:hint="eastAsia"/>
                 <w:color w:val="000000"/>
                 <w:sz w:val="18"/>
                 <w:szCs w:val="18"/>
@@ -3658,30 +3556,8 @@
               </w:rPr>
               <w:t>통신</w:t>
             </w:r>
-            <w:r>
-              <w:rPr>
-                <w:rFonts w:ascii="Arial Unicode MS" w:hAnsi="Arial Unicode MS" w:cs="Arial Unicode MS" w:hint="eastAsia"/>
-                <w:color w:val="000000"/>
-                <w:sz w:val="18"/>
-                <w:szCs w:val="18"/>
-              </w:rPr>
-            </w:r>
-          </w:p>
-          <w:p>
-            <w:pPr>
-              <w:rPr>
-                <w:rFonts w:hint="eastAsia"/>
-              </w:rPr>
-            </w:pPr>
-            <w:r>
-              <w:rPr>
-                <w:rFonts w:ascii="Arial Unicode MS" w:hAnsi="Arial Unicode MS" w:cs="Arial Unicode MS" w:hint="eastAsia"/>
-                <w:color w:val="000000"/>
-                <w:sz w:val="18"/>
-                <w:szCs w:val="18"/>
-              </w:rPr>
-            </w:r>
-          </w:p>
+          </w:p>
+          <w:p/>
         </w:tc>
         <w:tc>
           <w:tcPr>
@@ -3788,7 +3664,7 @@
         </w:tc>
         <w:tc>
           <w:tcPr>
-            <w:tcW w:w="1100" w:type="dxa"/>
+            <w:tcW w:w="1647" w:type="dxa"/>
             <w:tcBorders>
               <w:top w:val="single" w:sz="4" w:space="0" w:color="CCCCCC"/>
               <w:left w:val="single" w:sz="4" w:space="0" w:color="CCCCCC"/>
@@ -3821,7 +3697,7 @@
         </w:tc>
         <w:tc>
           <w:tcPr>
-            <w:tcW w:w="2100" w:type="dxa"/>
+            <w:tcW w:w="1553" w:type="dxa"/>
             <w:tcBorders>
               <w:top w:val="single" w:sz="4" w:space="0" w:color="CCCCCC"/>
               <w:left w:val="single" w:sz="4" w:space="0" w:color="CCCCCC"/>
@@ -3838,6 +3714,9 @@
             <w:vAlign w:val="center"/>
           </w:tcPr>
           <w:p>
+            <w:pPr>
+              <w:jc w:val="center"/>
+            </w:pPr>
             <w:r>
               <w:rPr>
                 <w:rFonts w:ascii="Arial Unicode MS" w:eastAsia="Arial Unicode MS" w:hAnsi="Arial Unicode MS" w:cs="Arial Unicode MS"/>
@@ -3878,22 +3757,6 @@
                 <w:szCs w:val="18"/>
               </w:rPr>
               <w:t>통신</w:t>
-            </w:r>
-            <w:r>
-              <w:rPr>
-                <w:rFonts w:ascii="Arial Unicode MS" w:hAnsi="Arial Unicode MS" w:cs="Arial Unicode MS" w:hint="eastAsia"/>
-                <w:color w:val="000000"/>
-                <w:sz w:val="18"/>
-                <w:szCs w:val="18"/>
-              </w:rPr>
-            </w:r>
-            <w:r>
-              <w:rPr>
-                <w:rFonts w:ascii="Arial Unicode MS" w:eastAsia="Arial Unicode MS" w:hAnsi="Arial Unicode MS" w:cs="Arial Unicode MS"/>
-                <w:color w:val="000000"/>
-                <w:sz w:val="18"/>
-                <w:szCs w:val="18"/>
-              </w:rPr>
             </w:r>
           </w:p>
         </w:tc>
@@ -4002,7 +3865,7 @@
         </w:tc>
         <w:tc>
           <w:tcPr>
-            <w:tcW w:w="1100" w:type="dxa"/>
+            <w:tcW w:w="1647" w:type="dxa"/>
             <w:tcBorders>
               <w:top w:val="single" w:sz="4" w:space="0" w:color="CCCCCC"/>
               <w:left w:val="single" w:sz="4" w:space="0" w:color="CCCCCC"/>
@@ -4035,23 +3898,26 @@
         </w:tc>
         <w:tc>
           <w:tcPr>
-            <w:tcW w:w="2100" w:type="dxa"/>
-            <w:tcBorders>
-              <w:top w:val="single" w:sz="4" w:space="0" w:color="CCCCCC"/>
-              <w:left w:val="single" w:sz="4" w:space="0" w:color="CCCCCC"/>
-              <w:bottom w:val="single" w:sz="4" w:space="0" w:color="CCCCCC"/>
-              <w:right w:val="single" w:sz="4" w:space="0" w:color="CCCCCC"/>
-            </w:tcBorders>
-            <w:shd w:val="clear" w:color="auto" w:fill="DEEAF1"/>
-            <w:tcMar>
-              <w:top w:w="60" w:type="dxa"/>
-              <w:left w:w="140" w:type="dxa"/>
-              <w:bottom w:w="60" w:type="dxa"/>
-              <w:right w:w="140" w:type="dxa"/>
-            </w:tcMar>
-            <w:vAlign w:val="center"/>
-          </w:tcPr>
-          <w:p>
+            <w:tcW w:w="1553" w:type="dxa"/>
+            <w:tcBorders>
+              <w:top w:val="single" w:sz="4" w:space="0" w:color="CCCCCC"/>
+              <w:left w:val="single" w:sz="4" w:space="0" w:color="CCCCCC"/>
+              <w:bottom w:val="single" w:sz="4" w:space="0" w:color="CCCCCC"/>
+              <w:right w:val="single" w:sz="4" w:space="0" w:color="CCCCCC"/>
+            </w:tcBorders>
+            <w:shd w:val="clear" w:color="auto" w:fill="DEEAF1"/>
+            <w:tcMar>
+              <w:top w:w="60" w:type="dxa"/>
+              <w:left w:w="140" w:type="dxa"/>
+              <w:bottom w:w="60" w:type="dxa"/>
+              <w:right w:w="140" w:type="dxa"/>
+            </w:tcMar>
+            <w:vAlign w:val="center"/>
+          </w:tcPr>
+          <w:p>
+            <w:pPr>
+              <w:jc w:val="center"/>
+            </w:pPr>
             <w:r>
               <w:rPr>
                 <w:rFonts w:ascii="Arial Unicode MS" w:eastAsia="Arial Unicode MS" w:hAnsi="Arial Unicode MS" w:cs="Arial Unicode MS"/>
@@ -4200,7 +4066,7 @@
         </w:tc>
         <w:tc>
           <w:tcPr>
-            <w:tcW w:w="1100" w:type="dxa"/>
+            <w:tcW w:w="1647" w:type="dxa"/>
             <w:tcBorders>
               <w:top w:val="single" w:sz="4" w:space="0" w:color="CCCCCC"/>
               <w:left w:val="single" w:sz="4" w:space="0" w:color="CCCCCC"/>
@@ -4233,7 +4099,7 @@
         </w:tc>
         <w:tc>
           <w:tcPr>
-            <w:tcW w:w="2100" w:type="dxa"/>
+            <w:tcW w:w="1553" w:type="dxa"/>
             <w:tcBorders>
               <w:top w:val="single" w:sz="4" w:space="0" w:color="CCCCCC"/>
               <w:left w:val="single" w:sz="4" w:space="0" w:color="CCCCCC"/>
@@ -4250,6 +4116,9 @@
             <w:vAlign w:val="center"/>
           </w:tcPr>
           <w:p>
+            <w:pPr>
+              <w:jc w:val="center"/>
+            </w:pPr>
             <w:r>
               <w:rPr>
                 <w:rFonts w:ascii="Arial Unicode MS" w:eastAsia="Arial Unicode MS" w:hAnsi="Arial Unicode MS" w:cs="Arial Unicode MS"/>
@@ -4398,7 +4267,7 @@
         </w:tc>
         <w:tc>
           <w:tcPr>
-            <w:tcW w:w="1100" w:type="dxa"/>
+            <w:tcW w:w="1647" w:type="dxa"/>
             <w:tcBorders>
               <w:top w:val="single" w:sz="4" w:space="0" w:color="CCCCCC"/>
               <w:left w:val="single" w:sz="4" w:space="0" w:color="CCCCCC"/>
@@ -4431,23 +4300,26 @@
         </w:tc>
         <w:tc>
           <w:tcPr>
-            <w:tcW w:w="2100" w:type="dxa"/>
-            <w:tcBorders>
-              <w:top w:val="single" w:sz="4" w:space="0" w:color="CCCCCC"/>
-              <w:left w:val="single" w:sz="4" w:space="0" w:color="CCCCCC"/>
-              <w:bottom w:val="single" w:sz="4" w:space="0" w:color="CCCCCC"/>
-              <w:right w:val="single" w:sz="4" w:space="0" w:color="CCCCCC"/>
-            </w:tcBorders>
-            <w:shd w:val="clear" w:color="auto" w:fill="DEEAF1"/>
-            <w:tcMar>
-              <w:top w:w="60" w:type="dxa"/>
-              <w:left w:w="140" w:type="dxa"/>
-              <w:bottom w:w="60" w:type="dxa"/>
-              <w:right w:w="140" w:type="dxa"/>
-            </w:tcMar>
-            <w:vAlign w:val="center"/>
-          </w:tcPr>
-          <w:p>
+            <w:tcW w:w="1553" w:type="dxa"/>
+            <w:tcBorders>
+              <w:top w:val="single" w:sz="4" w:space="0" w:color="CCCCCC"/>
+              <w:left w:val="single" w:sz="4" w:space="0" w:color="CCCCCC"/>
+              <w:bottom w:val="single" w:sz="4" w:space="0" w:color="CCCCCC"/>
+              <w:right w:val="single" w:sz="4" w:space="0" w:color="CCCCCC"/>
+            </w:tcBorders>
+            <w:shd w:val="clear" w:color="auto" w:fill="DEEAF1"/>
+            <w:tcMar>
+              <w:top w:w="60" w:type="dxa"/>
+              <w:left w:w="140" w:type="dxa"/>
+              <w:bottom w:w="60" w:type="dxa"/>
+              <w:right w:w="140" w:type="dxa"/>
+            </w:tcMar>
+            <w:vAlign w:val="center"/>
+          </w:tcPr>
+          <w:p>
+            <w:pPr>
+              <w:jc w:val="center"/>
+            </w:pPr>
             <w:r>
               <w:rPr>
                 <w:rFonts w:ascii="Arial Unicode MS" w:eastAsia="Arial Unicode MS" w:hAnsi="Arial Unicode MS" w:cs="Arial Unicode MS"/>
@@ -4488,38 +4360,6 @@
                 <w:szCs w:val="18"/>
               </w:rPr>
               <w:t>카메라</w:t>
-            </w:r>
-            <w:r>
-              <w:rPr>
-                <w:rFonts w:ascii="Arial Unicode MS" w:hAnsi="Arial Unicode MS" w:cs="Arial Unicode MS" w:hint="eastAsia"/>
-                <w:color w:val="000000"/>
-                <w:sz w:val="18"/>
-                <w:szCs w:val="18"/>
-              </w:rPr>
-            </w:r>
-            <w:r>
-              <w:rPr>
-                <w:rFonts w:ascii="Arial Unicode MS" w:eastAsia="Arial Unicode MS" w:hAnsi="Arial Unicode MS" w:cs="Arial Unicode MS"/>
-                <w:color w:val="000000"/>
-                <w:sz w:val="18"/>
-                <w:szCs w:val="18"/>
-              </w:rPr>
-            </w:r>
-            <w:r>
-              <w:rPr>
-                <w:rFonts w:ascii="Arial Unicode MS" w:hAnsi="Arial Unicode MS" w:cs="Arial Unicode MS" w:hint="eastAsia"/>
-                <w:color w:val="000000"/>
-                <w:sz w:val="18"/>
-                <w:szCs w:val="18"/>
-              </w:rPr>
-            </w:r>
-            <w:r>
-              <w:rPr>
-                <w:rFonts w:ascii="Arial Unicode MS" w:eastAsia="Arial Unicode MS" w:hAnsi="Arial Unicode MS" w:cs="Arial Unicode MS"/>
-                <w:color w:val="000000"/>
-                <w:sz w:val="18"/>
-                <w:szCs w:val="18"/>
-              </w:rPr>
             </w:r>
           </w:p>
         </w:tc>
@@ -4628,7 +4468,7 @@
         </w:tc>
         <w:tc>
           <w:tcPr>
-            <w:tcW w:w="1100" w:type="dxa"/>
+            <w:tcW w:w="1647" w:type="dxa"/>
             <w:tcBorders>
               <w:top w:val="single" w:sz="4" w:space="0" w:color="CCCCCC"/>
               <w:left w:val="single" w:sz="4" w:space="0" w:color="CCCCCC"/>
@@ -4661,7 +4501,7 @@
         </w:tc>
         <w:tc>
           <w:tcPr>
-            <w:tcW w:w="2100" w:type="dxa"/>
+            <w:tcW w:w="1553" w:type="dxa"/>
             <w:tcBorders>
               <w:top w:val="single" w:sz="4" w:space="0" w:color="CCCCCC"/>
               <w:left w:val="single" w:sz="4" w:space="0" w:color="CCCCCC"/>
@@ -4678,6 +4518,9 @@
             <w:vAlign w:val="center"/>
           </w:tcPr>
           <w:p>
+            <w:pPr>
+              <w:jc w:val="center"/>
+            </w:pPr>
             <w:r>
               <w:rPr>
                 <w:rFonts w:ascii="Arial Unicode MS" w:eastAsia="Arial Unicode MS" w:hAnsi="Arial Unicode MS" w:cs="Arial Unicode MS"/>
@@ -4826,7 +4669,7 @@
         </w:tc>
         <w:tc>
           <w:tcPr>
-            <w:tcW w:w="1100" w:type="dxa"/>
+            <w:tcW w:w="1647" w:type="dxa"/>
             <w:tcBorders>
               <w:top w:val="single" w:sz="4" w:space="0" w:color="CCCCCC"/>
               <w:left w:val="single" w:sz="4" w:space="0" w:color="CCCCCC"/>
@@ -4859,23 +4702,26 @@
         </w:tc>
         <w:tc>
           <w:tcPr>
-            <w:tcW w:w="2100" w:type="dxa"/>
-            <w:tcBorders>
-              <w:top w:val="single" w:sz="4" w:space="0" w:color="CCCCCC"/>
-              <w:left w:val="single" w:sz="4" w:space="0" w:color="CCCCCC"/>
-              <w:bottom w:val="single" w:sz="4" w:space="0" w:color="CCCCCC"/>
-              <w:right w:val="single" w:sz="4" w:space="0" w:color="CCCCCC"/>
-            </w:tcBorders>
-            <w:shd w:val="clear" w:color="auto" w:fill="DEEAF1"/>
-            <w:tcMar>
-              <w:top w:w="60" w:type="dxa"/>
-              <w:left w:w="140" w:type="dxa"/>
-              <w:bottom w:w="60" w:type="dxa"/>
-              <w:right w:w="140" w:type="dxa"/>
-            </w:tcMar>
-            <w:vAlign w:val="center"/>
-          </w:tcPr>
-          <w:p>
+            <w:tcW w:w="1553" w:type="dxa"/>
+            <w:tcBorders>
+              <w:top w:val="single" w:sz="4" w:space="0" w:color="CCCCCC"/>
+              <w:left w:val="single" w:sz="4" w:space="0" w:color="CCCCCC"/>
+              <w:bottom w:val="single" w:sz="4" w:space="0" w:color="CCCCCC"/>
+              <w:right w:val="single" w:sz="4" w:space="0" w:color="CCCCCC"/>
+            </w:tcBorders>
+            <w:shd w:val="clear" w:color="auto" w:fill="DEEAF1"/>
+            <w:tcMar>
+              <w:top w:w="60" w:type="dxa"/>
+              <w:left w:w="140" w:type="dxa"/>
+              <w:bottom w:w="60" w:type="dxa"/>
+              <w:right w:w="140" w:type="dxa"/>
+            </w:tcMar>
+            <w:vAlign w:val="center"/>
+          </w:tcPr>
+          <w:p>
+            <w:pPr>
+              <w:jc w:val="center"/>
+            </w:pPr>
             <w:r>
               <w:rPr>
                 <w:rFonts w:ascii="Arial Unicode MS" w:eastAsia="Arial Unicode MS" w:hAnsi="Arial Unicode MS" w:cs="Arial Unicode MS"/>
@@ -5024,7 +4870,7 @@
         </w:tc>
         <w:tc>
           <w:tcPr>
-            <w:tcW w:w="1100" w:type="dxa"/>
+            <w:tcW w:w="1647" w:type="dxa"/>
             <w:tcBorders>
               <w:top w:val="single" w:sz="4" w:space="0" w:color="CCCCCC"/>
               <w:left w:val="single" w:sz="4" w:space="0" w:color="CCCCCC"/>
@@ -5057,7 +4903,7 @@
         </w:tc>
         <w:tc>
           <w:tcPr>
-            <w:tcW w:w="2100" w:type="dxa"/>
+            <w:tcW w:w="1553" w:type="dxa"/>
             <w:tcBorders>
               <w:top w:val="single" w:sz="4" w:space="0" w:color="CCCCCC"/>
               <w:left w:val="single" w:sz="4" w:space="0" w:color="CCCCCC"/>
@@ -5074,6 +4920,9 @@
             <w:vAlign w:val="center"/>
           </w:tcPr>
           <w:p>
+            <w:pPr>
+              <w:jc w:val="center"/>
+            </w:pPr>
             <w:r>
               <w:rPr>
                 <w:rFonts w:ascii="Arial Unicode MS" w:eastAsia="Arial Unicode MS" w:hAnsi="Arial Unicode MS" w:cs="Arial Unicode MS"/>
@@ -5237,16 +5086,16 @@
         <w:tblLook w:val="0000" w:firstRow="0" w:lastRow="0" w:firstColumn="0" w:lastColumn="0" w:noHBand="0" w:noVBand="0"/>
       </w:tblPr>
       <w:tblGrid>
-        <w:gridCol w:w="900"/>
-        <w:gridCol w:w="1300"/>
-        <w:gridCol w:w="2000"/>
+        <w:gridCol w:w="1696"/>
+        <w:gridCol w:w="1701"/>
+        <w:gridCol w:w="803"/>
         <w:gridCol w:w="3226"/>
         <w:gridCol w:w="1600"/>
       </w:tblGrid>
       <w:tr>
         <w:tc>
           <w:tcPr>
-            <w:tcW w:w="900" w:type="dxa"/>
+            <w:tcW w:w="1696" w:type="dxa"/>
             <w:tcBorders>
               <w:top w:val="single" w:sz="4" w:space="0" w:color="FFFFFF"/>
               <w:left w:val="single" w:sz="4" w:space="0" w:color="FFFFFF"/>
@@ -5273,13 +5122,14 @@
                 <w:bCs/>
                 <w:color w:val="FFFFFF"/>
               </w:rPr>
+              <w:lastRenderedPageBreak/>
               <w:t>필드</w:t>
             </w:r>
           </w:p>
         </w:tc>
         <w:tc>
           <w:tcPr>
-            <w:tcW w:w="1300" w:type="dxa"/>
+            <w:tcW w:w="1701" w:type="dxa"/>
             <w:tcBorders>
               <w:top w:val="single" w:sz="4" w:space="0" w:color="FFFFFF"/>
               <w:left w:val="single" w:sz="4" w:space="0" w:color="FFFFFF"/>
@@ -5312,7 +5162,7 @@
         </w:tc>
         <w:tc>
           <w:tcPr>
-            <w:tcW w:w="2000" w:type="dxa"/>
+            <w:tcW w:w="803" w:type="dxa"/>
             <w:tcBorders>
               <w:top w:val="single" w:sz="4" w:space="0" w:color="FFFFFF"/>
               <w:left w:val="single" w:sz="4" w:space="0" w:color="FFFFFF"/>
@@ -5413,7 +5263,7 @@
       <w:tr>
         <w:tc>
           <w:tcPr>
-            <w:tcW w:w="900" w:type="dxa"/>
+            <w:tcW w:w="1696" w:type="dxa"/>
             <w:tcBorders>
               <w:top w:val="single" w:sz="4" w:space="0" w:color="CCCCCC"/>
               <w:left w:val="single" w:sz="4" w:space="0" w:color="CCCCCC"/>
@@ -5448,7 +5298,7 @@
         </w:tc>
         <w:tc>
           <w:tcPr>
-            <w:tcW w:w="1300" w:type="dxa"/>
+            <w:tcW w:w="1701" w:type="dxa"/>
             <w:tcBorders>
               <w:top w:val="single" w:sz="4" w:space="0" w:color="CCCCCC"/>
               <w:left w:val="single" w:sz="4" w:space="0" w:color="CCCCCC"/>
@@ -5480,33 +5330,39 @@
         </w:tc>
         <w:tc>
           <w:tcPr>
-            <w:tcW w:w="2000" w:type="dxa"/>
-            <w:tcBorders>
-              <w:top w:val="single" w:sz="4" w:space="0" w:color="CCCCCC"/>
-              <w:left w:val="single" w:sz="4" w:space="0" w:color="CCCCCC"/>
-              <w:bottom w:val="single" w:sz="4" w:space="0" w:color="CCCCCC"/>
-              <w:right w:val="single" w:sz="4" w:space="0" w:color="CCCCCC"/>
-            </w:tcBorders>
-            <w:shd w:val="clear" w:color="auto" w:fill="DEEAF1"/>
-            <w:tcMar>
-              <w:top w:w="60" w:type="dxa"/>
-              <w:left w:w="140" w:type="dxa"/>
-              <w:bottom w:w="60" w:type="dxa"/>
-              <w:right w:w="140" w:type="dxa"/>
-            </w:tcMar>
-            <w:vAlign w:val="center"/>
-          </w:tcPr>
-          <w:p>
-            <w:r>
-              <w:rPr>
-                <w:rFonts w:ascii="Arial Unicode MS" w:eastAsia="Arial Unicode MS" w:hAnsi="Arial Unicode MS" w:cs="Arial Unicode MS"/>
-                <w:b/>
-                <w:bCs/>
-                <w:color w:val="000000"/>
-                <w:sz w:val="18"/>
-                <w:szCs w:val="18"/>
-              </w:rPr>
-              <w:t>m</w:t>
+            <w:tcW w:w="803" w:type="dxa"/>
+            <w:tcBorders>
+              <w:top w:val="single" w:sz="4" w:space="0" w:color="CCCCCC"/>
+              <w:left w:val="single" w:sz="4" w:space="0" w:color="CCCCCC"/>
+              <w:bottom w:val="single" w:sz="4" w:space="0" w:color="CCCCCC"/>
+              <w:right w:val="single" w:sz="4" w:space="0" w:color="CCCCCC"/>
+            </w:tcBorders>
+            <w:shd w:val="clear" w:color="auto" w:fill="DEEAF1"/>
+            <w:tcMar>
+              <w:top w:w="60" w:type="dxa"/>
+              <w:left w:w="140" w:type="dxa"/>
+              <w:bottom w:w="60" w:type="dxa"/>
+              <w:right w:w="140" w:type="dxa"/>
+            </w:tcMar>
+            <w:vAlign w:val="center"/>
+          </w:tcPr>
+          <w:p>
+            <w:pPr>
+              <w:jc w:val="center"/>
+              <w:rPr>
+                <w:rFonts w:hint="eastAsia"/>
+              </w:rPr>
+            </w:pPr>
+            <w:r>
+              <w:rPr>
+                <w:rFonts w:ascii="맑은 고딕" w:eastAsia="맑은 고딕" w:hAnsi="맑은 고딕" w:cs="맑은 고딕" w:hint="eastAsia"/>
+                <w:b/>
+                <w:bCs/>
+                <w:color w:val="000000"/>
+                <w:sz w:val="18"/>
+                <w:szCs w:val="18"/>
+              </w:rPr>
+              <w:t>cm</w:t>
             </w:r>
           </w:p>
         </w:tc>
@@ -5529,11 +5385,6 @@
             <w:vAlign w:val="center"/>
           </w:tcPr>
           <w:p>
-            <w:pPr>
-              <w:rPr>
-                <w:rFonts w:hint="eastAsia"/>
-              </w:rPr>
-            </w:pPr>
             <w:r>
               <w:rPr>
                 <w:rFonts w:ascii="Arial Unicode MS" w:eastAsia="Arial Unicode MS" w:hAnsi="Arial Unicode MS" w:cs="Arial Unicode MS"/>
@@ -5542,14 +5393,6 @@
                 <w:szCs w:val="18"/>
               </w:rPr>
               <w:t>TBD (트랙 실측)</w:t>
-            </w:r>
-            <w:r>
-              <w:rPr>
-                <w:rFonts w:ascii="Arial Unicode MS" w:hAnsi="Arial Unicode MS" w:cs="Arial Unicode MS" w:hint="eastAsia"/>
-                <w:color w:val="000000"/>
-                <w:sz w:val="18"/>
-                <w:szCs w:val="18"/>
-              </w:rPr>
             </w:r>
           </w:p>
         </w:tc>
@@ -5587,7 +5430,7 @@
       <w:tr>
         <w:tc>
           <w:tcPr>
-            <w:tcW w:w="900" w:type="dxa"/>
+            <w:tcW w:w="1696" w:type="dxa"/>
             <w:tcBorders>
               <w:top w:val="single" w:sz="4" w:space="0" w:color="CCCCCC"/>
               <w:left w:val="single" w:sz="4" w:space="0" w:color="CCCCCC"/>
@@ -5622,7 +5465,7 @@
         </w:tc>
         <w:tc>
           <w:tcPr>
-            <w:tcW w:w="1300" w:type="dxa"/>
+            <w:tcW w:w="1701" w:type="dxa"/>
             <w:tcBorders>
               <w:top w:val="single" w:sz="4" w:space="0" w:color="CCCCCC"/>
               <w:left w:val="single" w:sz="4" w:space="0" w:color="CCCCCC"/>
@@ -5654,7 +5497,7 @@
         </w:tc>
         <w:tc>
           <w:tcPr>
-            <w:tcW w:w="2000" w:type="dxa"/>
+            <w:tcW w:w="803" w:type="dxa"/>
             <w:tcBorders>
               <w:top w:val="single" w:sz="4" w:space="0" w:color="CCCCCC"/>
               <w:left w:val="single" w:sz="4" w:space="0" w:color="CCCCCC"/>
@@ -5671,6 +5514,9 @@
             <w:vAlign w:val="center"/>
           </w:tcPr>
           <w:p>
+            <w:pPr>
+              <w:jc w:val="center"/>
+            </w:pPr>
             <w:r>
               <w:rPr>
                 <w:rFonts w:ascii="Arial Unicode MS" w:eastAsia="Arial Unicode MS" w:hAnsi="Arial Unicode MS" w:cs="Arial Unicode MS"/>
@@ -5748,7 +5594,7 @@
       <w:tr>
         <w:tc>
           <w:tcPr>
-            <w:tcW w:w="900" w:type="dxa"/>
+            <w:tcW w:w="1696" w:type="dxa"/>
             <w:tcBorders>
               <w:top w:val="single" w:sz="4" w:space="0" w:color="CCCCCC"/>
               <w:left w:val="single" w:sz="4" w:space="0" w:color="CCCCCC"/>
@@ -5783,7 +5629,7 @@
         </w:tc>
         <w:tc>
           <w:tcPr>
-            <w:tcW w:w="1300" w:type="dxa"/>
+            <w:tcW w:w="1701" w:type="dxa"/>
             <w:tcBorders>
               <w:top w:val="single" w:sz="4" w:space="0" w:color="CCCCCC"/>
               <w:left w:val="single" w:sz="4" w:space="0" w:color="CCCCCC"/>
@@ -5815,23 +5661,26 @@
         </w:tc>
         <w:tc>
           <w:tcPr>
-            <w:tcW w:w="2000" w:type="dxa"/>
-            <w:tcBorders>
-              <w:top w:val="single" w:sz="4" w:space="0" w:color="CCCCCC"/>
-              <w:left w:val="single" w:sz="4" w:space="0" w:color="CCCCCC"/>
-              <w:bottom w:val="single" w:sz="4" w:space="0" w:color="CCCCCC"/>
-              <w:right w:val="single" w:sz="4" w:space="0" w:color="CCCCCC"/>
-            </w:tcBorders>
-            <w:shd w:val="clear" w:color="auto" w:fill="DEEAF1"/>
-            <w:tcMar>
-              <w:top w:w="60" w:type="dxa"/>
-              <w:left w:w="140" w:type="dxa"/>
-              <w:bottom w:w="60" w:type="dxa"/>
-              <w:right w:w="140" w:type="dxa"/>
-            </w:tcMar>
-            <w:vAlign w:val="center"/>
-          </w:tcPr>
-          <w:p>
+            <w:tcW w:w="803" w:type="dxa"/>
+            <w:tcBorders>
+              <w:top w:val="single" w:sz="4" w:space="0" w:color="CCCCCC"/>
+              <w:left w:val="single" w:sz="4" w:space="0" w:color="CCCCCC"/>
+              <w:bottom w:val="single" w:sz="4" w:space="0" w:color="CCCCCC"/>
+              <w:right w:val="single" w:sz="4" w:space="0" w:color="CCCCCC"/>
+            </w:tcBorders>
+            <w:shd w:val="clear" w:color="auto" w:fill="DEEAF1"/>
+            <w:tcMar>
+              <w:top w:w="60" w:type="dxa"/>
+              <w:left w:w="140" w:type="dxa"/>
+              <w:bottom w:w="60" w:type="dxa"/>
+              <w:right w:w="140" w:type="dxa"/>
+            </w:tcMar>
+            <w:vAlign w:val="center"/>
+          </w:tcPr>
+          <w:p>
+            <w:pPr>
+              <w:jc w:val="center"/>
+            </w:pPr>
             <w:r>
               <w:rPr>
                 <w:rFonts w:ascii="Arial Unicode MS" w:eastAsia="Arial Unicode MS" w:hAnsi="Arial Unicode MS" w:cs="Arial Unicode MS"/>
@@ -5909,7 +5758,7 @@
       <w:tr>
         <w:tc>
           <w:tcPr>
-            <w:tcW w:w="900" w:type="dxa"/>
+            <w:tcW w:w="1696" w:type="dxa"/>
             <w:tcBorders>
               <w:top w:val="single" w:sz="4" w:space="0" w:color="CCCCCC"/>
               <w:left w:val="single" w:sz="4" w:space="0" w:color="CCCCCC"/>
@@ -5944,7 +5793,7 @@
         </w:tc>
         <w:tc>
           <w:tcPr>
-            <w:tcW w:w="1300" w:type="dxa"/>
+            <w:tcW w:w="1701" w:type="dxa"/>
             <w:tcBorders>
               <w:top w:val="single" w:sz="4" w:space="0" w:color="CCCCCC"/>
               <w:left w:val="single" w:sz="4" w:space="0" w:color="CCCCCC"/>
@@ -5976,23 +5825,26 @@
         </w:tc>
         <w:tc>
           <w:tcPr>
-            <w:tcW w:w="2000" w:type="dxa"/>
-            <w:tcBorders>
-              <w:top w:val="single" w:sz="4" w:space="0" w:color="CCCCCC"/>
-              <w:left w:val="single" w:sz="4" w:space="0" w:color="CCCCCC"/>
-              <w:bottom w:val="single" w:sz="4" w:space="0" w:color="CCCCCC"/>
-              <w:right w:val="single" w:sz="4" w:space="0" w:color="CCCCCC"/>
-            </w:tcBorders>
-            <w:shd w:val="clear" w:color="auto" w:fill="DEEAF1"/>
-            <w:tcMar>
-              <w:top w:w="60" w:type="dxa"/>
-              <w:left w:w="140" w:type="dxa"/>
-              <w:bottom w:w="60" w:type="dxa"/>
-              <w:right w:w="140" w:type="dxa"/>
-            </w:tcMar>
-            <w:vAlign w:val="center"/>
-          </w:tcPr>
-          <w:p>
+            <w:tcW w:w="803" w:type="dxa"/>
+            <w:tcBorders>
+              <w:top w:val="single" w:sz="4" w:space="0" w:color="CCCCCC"/>
+              <w:left w:val="single" w:sz="4" w:space="0" w:color="CCCCCC"/>
+              <w:bottom w:val="single" w:sz="4" w:space="0" w:color="CCCCCC"/>
+              <w:right w:val="single" w:sz="4" w:space="0" w:color="CCCCCC"/>
+            </w:tcBorders>
+            <w:shd w:val="clear" w:color="auto" w:fill="DEEAF1"/>
+            <w:tcMar>
+              <w:top w:w="60" w:type="dxa"/>
+              <w:left w:w="140" w:type="dxa"/>
+              <w:bottom w:w="60" w:type="dxa"/>
+              <w:right w:w="140" w:type="dxa"/>
+            </w:tcMar>
+            <w:vAlign w:val="center"/>
+          </w:tcPr>
+          <w:p>
+            <w:pPr>
+              <w:jc w:val="center"/>
+            </w:pPr>
             <w:r>
               <w:rPr>
                 <w:rFonts w:ascii="Arial Unicode MS" w:eastAsia="Arial Unicode MS" w:hAnsi="Arial Unicode MS" w:cs="Arial Unicode MS"/>
@@ -6070,7 +5922,7 @@
       <w:tr>
         <w:tc>
           <w:tcPr>
-            <w:tcW w:w="900" w:type="dxa"/>
+            <w:tcW w:w="1696" w:type="dxa"/>
             <w:tcBorders>
               <w:top w:val="single" w:sz="4" w:space="0" w:color="CCCCCC"/>
               <w:left w:val="single" w:sz="4" w:space="0" w:color="CCCCCC"/>
@@ -6105,7 +5957,7 @@
         </w:tc>
         <w:tc>
           <w:tcPr>
-            <w:tcW w:w="1300" w:type="dxa"/>
+            <w:tcW w:w="1701" w:type="dxa"/>
             <w:tcBorders>
               <w:top w:val="single" w:sz="4" w:space="0" w:color="CCCCCC"/>
               <w:left w:val="single" w:sz="4" w:space="0" w:color="CCCCCC"/>
@@ -6137,23 +5989,26 @@
         </w:tc>
         <w:tc>
           <w:tcPr>
-            <w:tcW w:w="2000" w:type="dxa"/>
-            <w:tcBorders>
-              <w:top w:val="single" w:sz="4" w:space="0" w:color="CCCCCC"/>
-              <w:left w:val="single" w:sz="4" w:space="0" w:color="CCCCCC"/>
-              <w:bottom w:val="single" w:sz="4" w:space="0" w:color="CCCCCC"/>
-              <w:right w:val="single" w:sz="4" w:space="0" w:color="CCCCCC"/>
-            </w:tcBorders>
-            <w:shd w:val="clear" w:color="auto" w:fill="DEEAF1"/>
-            <w:tcMar>
-              <w:top w:w="60" w:type="dxa"/>
-              <w:left w:w="140" w:type="dxa"/>
-              <w:bottom w:w="60" w:type="dxa"/>
-              <w:right w:w="140" w:type="dxa"/>
-            </w:tcMar>
-            <w:vAlign w:val="center"/>
-          </w:tcPr>
-          <w:p>
+            <w:tcW w:w="803" w:type="dxa"/>
+            <w:tcBorders>
+              <w:top w:val="single" w:sz="4" w:space="0" w:color="CCCCCC"/>
+              <w:left w:val="single" w:sz="4" w:space="0" w:color="CCCCCC"/>
+              <w:bottom w:val="single" w:sz="4" w:space="0" w:color="CCCCCC"/>
+              <w:right w:val="single" w:sz="4" w:space="0" w:color="CCCCCC"/>
+            </w:tcBorders>
+            <w:shd w:val="clear" w:color="auto" w:fill="DEEAF1"/>
+            <w:tcMar>
+              <w:top w:w="60" w:type="dxa"/>
+              <w:left w:w="140" w:type="dxa"/>
+              <w:bottom w:w="60" w:type="dxa"/>
+              <w:right w:w="140" w:type="dxa"/>
+            </w:tcMar>
+            <w:vAlign w:val="center"/>
+          </w:tcPr>
+          <w:p>
+            <w:pPr>
+              <w:jc w:val="center"/>
+            </w:pPr>
             <w:r>
               <w:rPr>
                 <w:rFonts w:ascii="Arial Unicode MS" w:eastAsia="Arial Unicode MS" w:hAnsi="Arial Unicode MS" w:cs="Arial Unicode MS"/>
@@ -6186,11 +6041,6 @@
             <w:vAlign w:val="center"/>
           </w:tcPr>
           <w:p>
-            <w:pPr>
-              <w:rPr>
-                <w:rFonts w:hint="eastAsia"/>
-              </w:rPr>
-            </w:pPr>
             <w:r>
               <w:rPr>
                 <w:rFonts w:ascii="Arial Unicode MS" w:eastAsia="Arial Unicode MS" w:hAnsi="Arial Unicode MS" w:cs="Arial Unicode MS"/>
@@ -6199,14 +6049,6 @@
                 <w:szCs w:val="18"/>
               </w:rPr>
               <w:t>클래스 목록 TBD</w:t>
-            </w:r>
-            <w:r>
-              <w:rPr>
-                <w:rFonts w:ascii="Arial Unicode MS" w:hAnsi="Arial Unicode MS" w:cs="Arial Unicode MS" w:hint="eastAsia"/>
-                <w:color w:val="000000"/>
-                <w:sz w:val="18"/>
-                <w:szCs w:val="18"/>
-              </w:rPr>
             </w:r>
           </w:p>
         </w:tc>
@@ -6244,7 +6086,7 @@
       <w:tr>
         <w:tc>
           <w:tcPr>
-            <w:tcW w:w="900" w:type="dxa"/>
+            <w:tcW w:w="1696" w:type="dxa"/>
             <w:tcBorders>
               <w:top w:val="single" w:sz="4" w:space="0" w:color="CCCCCC"/>
               <w:left w:val="single" w:sz="4" w:space="0" w:color="CCCCCC"/>
@@ -6279,7 +6121,7 @@
         </w:tc>
         <w:tc>
           <w:tcPr>
-            <w:tcW w:w="1300" w:type="dxa"/>
+            <w:tcW w:w="1701" w:type="dxa"/>
             <w:tcBorders>
               <w:top w:val="single" w:sz="4" w:space="0" w:color="CCCCCC"/>
               <w:left w:val="single" w:sz="4" w:space="0" w:color="CCCCCC"/>
@@ -6311,23 +6153,26 @@
         </w:tc>
         <w:tc>
           <w:tcPr>
-            <w:tcW w:w="2000" w:type="dxa"/>
-            <w:tcBorders>
-              <w:top w:val="single" w:sz="4" w:space="0" w:color="CCCCCC"/>
-              <w:left w:val="single" w:sz="4" w:space="0" w:color="CCCCCC"/>
-              <w:bottom w:val="single" w:sz="4" w:space="0" w:color="CCCCCC"/>
-              <w:right w:val="single" w:sz="4" w:space="0" w:color="CCCCCC"/>
-            </w:tcBorders>
-            <w:shd w:val="clear" w:color="auto" w:fill="DEEAF1"/>
-            <w:tcMar>
-              <w:top w:w="60" w:type="dxa"/>
-              <w:left w:w="140" w:type="dxa"/>
-              <w:bottom w:w="60" w:type="dxa"/>
-              <w:right w:w="140" w:type="dxa"/>
-            </w:tcMar>
-            <w:vAlign w:val="center"/>
-          </w:tcPr>
-          <w:p>
+            <w:tcW w:w="803" w:type="dxa"/>
+            <w:tcBorders>
+              <w:top w:val="single" w:sz="4" w:space="0" w:color="CCCCCC"/>
+              <w:left w:val="single" w:sz="4" w:space="0" w:color="CCCCCC"/>
+              <w:bottom w:val="single" w:sz="4" w:space="0" w:color="CCCCCC"/>
+              <w:right w:val="single" w:sz="4" w:space="0" w:color="CCCCCC"/>
+            </w:tcBorders>
+            <w:shd w:val="clear" w:color="auto" w:fill="DEEAF1"/>
+            <w:tcMar>
+              <w:top w:w="60" w:type="dxa"/>
+              <w:left w:w="140" w:type="dxa"/>
+              <w:bottom w:w="60" w:type="dxa"/>
+              <w:right w:w="140" w:type="dxa"/>
+            </w:tcMar>
+            <w:vAlign w:val="center"/>
+          </w:tcPr>
+          <w:p>
+            <w:pPr>
+              <w:jc w:val="center"/>
+            </w:pPr>
             <w:r>
               <w:rPr>
                 <w:rFonts w:ascii="Arial Unicode MS" w:eastAsia="Arial Unicode MS" w:hAnsi="Arial Unicode MS" w:cs="Arial Unicode MS"/>
@@ -6360,11 +6205,6 @@
             <w:vAlign w:val="center"/>
           </w:tcPr>
           <w:p>
-            <w:pPr>
-              <w:rPr>
-                <w:rFonts w:hint="eastAsia"/>
-              </w:rPr>
-            </w:pPr>
             <w:r>
               <w:rPr>
                 <w:rFonts w:ascii="Arial Unicode MS" w:eastAsia="Arial Unicode MS" w:hAnsi="Arial Unicode MS" w:cs="Arial Unicode MS"/>
@@ -6373,14 +6213,6 @@
                 <w:szCs w:val="18"/>
               </w:rPr>
               <w:t>true/false</w:t>
-            </w:r>
-            <w:r>
-              <w:rPr>
-                <w:rFonts w:ascii="Arial Unicode MS" w:hAnsi="Arial Unicode MS" w:cs="Arial Unicode MS" w:hint="eastAsia"/>
-                <w:color w:val="000000"/>
-                <w:sz w:val="18"/>
-                <w:szCs w:val="18"/>
-              </w:rPr>
             </w:r>
           </w:p>
         </w:tc>
@@ -6418,7 +6250,7 @@
       <w:tr>
         <w:tc>
           <w:tcPr>
-            <w:tcW w:w="900" w:type="dxa"/>
+            <w:tcW w:w="1696" w:type="dxa"/>
             <w:tcBorders>
               <w:top w:val="single" w:sz="4" w:space="0" w:color="CCCCCC"/>
               <w:left w:val="single" w:sz="4" w:space="0" w:color="CCCCCC"/>
@@ -6453,7 +6285,7 @@
         </w:tc>
         <w:tc>
           <w:tcPr>
-            <w:tcW w:w="1300" w:type="dxa"/>
+            <w:tcW w:w="1701" w:type="dxa"/>
             <w:tcBorders>
               <w:top w:val="single" w:sz="4" w:space="0" w:color="CCCCCC"/>
               <w:left w:val="single" w:sz="4" w:space="0" w:color="CCCCCC"/>
@@ -6485,23 +6317,26 @@
         </w:tc>
         <w:tc>
           <w:tcPr>
-            <w:tcW w:w="2000" w:type="dxa"/>
-            <w:tcBorders>
-              <w:top w:val="single" w:sz="4" w:space="0" w:color="CCCCCC"/>
-              <w:left w:val="single" w:sz="4" w:space="0" w:color="CCCCCC"/>
-              <w:bottom w:val="single" w:sz="4" w:space="0" w:color="CCCCCC"/>
-              <w:right w:val="single" w:sz="4" w:space="0" w:color="CCCCCC"/>
-            </w:tcBorders>
-            <w:shd w:val="clear" w:color="auto" w:fill="DEEAF1"/>
-            <w:tcMar>
-              <w:top w:w="60" w:type="dxa"/>
-              <w:left w:w="140" w:type="dxa"/>
-              <w:bottom w:w="60" w:type="dxa"/>
-              <w:right w:w="140" w:type="dxa"/>
-            </w:tcMar>
-            <w:vAlign w:val="center"/>
-          </w:tcPr>
-          <w:p>
+            <w:tcW w:w="803" w:type="dxa"/>
+            <w:tcBorders>
+              <w:top w:val="single" w:sz="4" w:space="0" w:color="CCCCCC"/>
+              <w:left w:val="single" w:sz="4" w:space="0" w:color="CCCCCC"/>
+              <w:bottom w:val="single" w:sz="4" w:space="0" w:color="CCCCCC"/>
+              <w:right w:val="single" w:sz="4" w:space="0" w:color="CCCCCC"/>
+            </w:tcBorders>
+            <w:shd w:val="clear" w:color="auto" w:fill="DEEAF1"/>
+            <w:tcMar>
+              <w:top w:w="60" w:type="dxa"/>
+              <w:left w:w="140" w:type="dxa"/>
+              <w:bottom w:w="60" w:type="dxa"/>
+              <w:right w:w="140" w:type="dxa"/>
+            </w:tcMar>
+            <w:vAlign w:val="center"/>
+          </w:tcPr>
+          <w:p>
+            <w:pPr>
+              <w:jc w:val="center"/>
+            </w:pPr>
             <w:r>
               <w:rPr>
                 <w:rFonts w:ascii="Arial Unicode MS" w:eastAsia="Arial Unicode MS" w:hAnsi="Arial Unicode MS" w:cs="Arial Unicode MS"/>
@@ -6534,11 +6369,6 @@
             <w:vAlign w:val="center"/>
           </w:tcPr>
           <w:p>
-            <w:pPr>
-              <w:rPr>
-                <w:rFonts w:hint="eastAsia"/>
-              </w:rPr>
-            </w:pPr>
             <w:r>
               <w:rPr>
                 <w:rFonts w:ascii="Arial Unicode MS" w:eastAsia="Arial Unicode MS" w:hAnsi="Arial Unicode MS" w:cs="Arial Unicode MS"/>
@@ -6547,14 +6377,6 @@
                 <w:szCs w:val="18"/>
               </w:rPr>
               <w:t>true/false</w:t>
-            </w:r>
-            <w:r>
-              <w:rPr>
-                <w:rFonts w:ascii="Arial Unicode MS" w:hAnsi="Arial Unicode MS" w:cs="Arial Unicode MS" w:hint="eastAsia"/>
-                <w:color w:val="000000"/>
-                <w:sz w:val="18"/>
-                <w:szCs w:val="18"/>
-              </w:rPr>
             </w:r>
           </w:p>
         </w:tc>
@@ -6618,16 +6440,16 @@
         <w:tblLook w:val="0000" w:firstRow="0" w:lastRow="0" w:firstColumn="0" w:lastColumn="0" w:noHBand="0" w:noVBand="0"/>
       </w:tblPr>
       <w:tblGrid>
-        <w:gridCol w:w="900"/>
-        <w:gridCol w:w="1300"/>
-        <w:gridCol w:w="2000"/>
+        <w:gridCol w:w="1696"/>
+        <w:gridCol w:w="1701"/>
+        <w:gridCol w:w="803"/>
         <w:gridCol w:w="3226"/>
         <w:gridCol w:w="1600"/>
       </w:tblGrid>
       <w:tr>
         <w:tc>
           <w:tcPr>
-            <w:tcW w:w="900" w:type="dxa"/>
+            <w:tcW w:w="1696" w:type="dxa"/>
             <w:tcBorders>
               <w:top w:val="single" w:sz="4" w:space="0" w:color="FFFFFF"/>
               <w:left w:val="single" w:sz="4" w:space="0" w:color="FFFFFF"/>
@@ -6660,7 +6482,7 @@
         </w:tc>
         <w:tc>
           <w:tcPr>
-            <w:tcW w:w="1300" w:type="dxa"/>
+            <w:tcW w:w="1701" w:type="dxa"/>
             <w:tcBorders>
               <w:top w:val="single" w:sz="4" w:space="0" w:color="FFFFFF"/>
               <w:left w:val="single" w:sz="4" w:space="0" w:color="FFFFFF"/>
@@ -6693,7 +6515,7 @@
         </w:tc>
         <w:tc>
           <w:tcPr>
-            <w:tcW w:w="2000" w:type="dxa"/>
+            <w:tcW w:w="803" w:type="dxa"/>
             <w:tcBorders>
               <w:top w:val="single" w:sz="4" w:space="0" w:color="FFFFFF"/>
               <w:left w:val="single" w:sz="4" w:space="0" w:color="FFFFFF"/>
@@ -6794,7 +6616,7 @@
       <w:tr>
         <w:tc>
           <w:tcPr>
-            <w:tcW w:w="900" w:type="dxa"/>
+            <w:tcW w:w="1696" w:type="dxa"/>
             <w:tcBorders>
               <w:top w:val="single" w:sz="4" w:space="0" w:color="CCCCCC"/>
               <w:left w:val="single" w:sz="4" w:space="0" w:color="CCCCCC"/>
@@ -6829,7 +6651,7 @@
         </w:tc>
         <w:tc>
           <w:tcPr>
-            <w:tcW w:w="1300" w:type="dxa"/>
+            <w:tcW w:w="1701" w:type="dxa"/>
             <w:tcBorders>
               <w:top w:val="single" w:sz="4" w:space="0" w:color="CCCCCC"/>
               <w:left w:val="single" w:sz="4" w:space="0" w:color="CCCCCC"/>
@@ -6861,7 +6683,7 @@
         </w:tc>
         <w:tc>
           <w:tcPr>
-            <w:tcW w:w="2000" w:type="dxa"/>
+            <w:tcW w:w="803" w:type="dxa"/>
             <w:tcBorders>
               <w:top w:val="single" w:sz="4" w:space="0" w:color="CCCCCC"/>
               <w:left w:val="single" w:sz="4" w:space="0" w:color="CCCCCC"/>
@@ -6910,11 +6732,6 @@
             <w:vAlign w:val="center"/>
           </w:tcPr>
           <w:p>
-            <w:pPr>
-              <w:rPr>
-                <w:rFonts w:hint="eastAsia"/>
-              </w:rPr>
-            </w:pPr>
             <w:r>
               <w:rPr>
                 <w:rFonts w:ascii="Arial Unicode MS" w:eastAsia="Arial Unicode MS" w:hAnsi="Arial Unicode MS" w:cs="Arial Unicode MS"/>
@@ -6923,14 +6740,6 @@
                 <w:szCs w:val="18"/>
               </w:rPr>
               <w:t>0=추종 1=변경 2=정지 3=서행 4=개방</w:t>
-            </w:r>
-            <w:r>
-              <w:rPr>
-                <w:rFonts w:ascii="Arial Unicode MS" w:hAnsi="Arial Unicode MS" w:cs="Arial Unicode MS" w:hint="eastAsia"/>
-                <w:color w:val="000000"/>
-                <w:sz w:val="18"/>
-                <w:szCs w:val="18"/>
-              </w:rPr>
             </w:r>
           </w:p>
         </w:tc>
@@ -6968,7 +6777,7 @@
       <w:tr>
         <w:tc>
           <w:tcPr>
-            <w:tcW w:w="900" w:type="dxa"/>
+            <w:tcW w:w="1696" w:type="dxa"/>
             <w:tcBorders>
               <w:top w:val="single" w:sz="4" w:space="0" w:color="CCCCCC"/>
               <w:left w:val="single" w:sz="4" w:space="0" w:color="CCCCCC"/>
@@ -7003,7 +6812,7 @@
         </w:tc>
         <w:tc>
           <w:tcPr>
-            <w:tcW w:w="1300" w:type="dxa"/>
+            <w:tcW w:w="1701" w:type="dxa"/>
             <w:tcBorders>
               <w:top w:val="single" w:sz="4" w:space="0" w:color="CCCCCC"/>
               <w:left w:val="single" w:sz="4" w:space="0" w:color="CCCCCC"/>
@@ -7035,7 +6844,7 @@
         </w:tc>
         <w:tc>
           <w:tcPr>
-            <w:tcW w:w="2000" w:type="dxa"/>
+            <w:tcW w:w="803" w:type="dxa"/>
             <w:tcBorders>
               <w:top w:val="single" w:sz="4" w:space="0" w:color="CCCCCC"/>
               <w:left w:val="single" w:sz="4" w:space="0" w:color="CCCCCC"/>
@@ -7155,16 +6964,16 @@
         <w:tblLook w:val="0000" w:firstRow="0" w:lastRow="0" w:firstColumn="0" w:lastColumn="0" w:noHBand="0" w:noVBand="0"/>
       </w:tblPr>
       <w:tblGrid>
-        <w:gridCol w:w="900"/>
-        <w:gridCol w:w="1300"/>
-        <w:gridCol w:w="2000"/>
+        <w:gridCol w:w="1980"/>
+        <w:gridCol w:w="1417"/>
+        <w:gridCol w:w="803"/>
         <w:gridCol w:w="3226"/>
         <w:gridCol w:w="1600"/>
       </w:tblGrid>
       <w:tr>
         <w:tc>
           <w:tcPr>
-            <w:tcW w:w="900" w:type="dxa"/>
+            <w:tcW w:w="1980" w:type="dxa"/>
             <w:tcBorders>
               <w:top w:val="single" w:sz="4" w:space="0" w:color="FFFFFF"/>
               <w:left w:val="single" w:sz="4" w:space="0" w:color="FFFFFF"/>
@@ -7197,7 +7006,7 @@
         </w:tc>
         <w:tc>
           <w:tcPr>
-            <w:tcW w:w="1300" w:type="dxa"/>
+            <w:tcW w:w="1417" w:type="dxa"/>
             <w:tcBorders>
               <w:top w:val="single" w:sz="4" w:space="0" w:color="FFFFFF"/>
               <w:left w:val="single" w:sz="4" w:space="0" w:color="FFFFFF"/>
@@ -7230,7 +7039,7 @@
         </w:tc>
         <w:tc>
           <w:tcPr>
-            <w:tcW w:w="2000" w:type="dxa"/>
+            <w:tcW w:w="803" w:type="dxa"/>
             <w:tcBorders>
               <w:top w:val="single" w:sz="4" w:space="0" w:color="FFFFFF"/>
               <w:left w:val="single" w:sz="4" w:space="0" w:color="FFFFFF"/>
@@ -7331,7 +7140,7 @@
       <w:tr>
         <w:tc>
           <w:tcPr>
-            <w:tcW w:w="900" w:type="dxa"/>
+            <w:tcW w:w="1980" w:type="dxa"/>
             <w:tcBorders>
               <w:top w:val="single" w:sz="4" w:space="0" w:color="CCCCCC"/>
               <w:left w:val="single" w:sz="4" w:space="0" w:color="CCCCCC"/>
@@ -7366,7 +7175,7 @@
         </w:tc>
         <w:tc>
           <w:tcPr>
-            <w:tcW w:w="1300" w:type="dxa"/>
+            <w:tcW w:w="1417" w:type="dxa"/>
             <w:tcBorders>
               <w:top w:val="single" w:sz="4" w:space="0" w:color="CCCCCC"/>
               <w:left w:val="single" w:sz="4" w:space="0" w:color="CCCCCC"/>
@@ -7398,7 +7207,7 @@
         </w:tc>
         <w:tc>
           <w:tcPr>
-            <w:tcW w:w="2000" w:type="dxa"/>
+            <w:tcW w:w="803" w:type="dxa"/>
             <w:tcBorders>
               <w:top w:val="single" w:sz="4" w:space="0" w:color="CCCCCC"/>
               <w:left w:val="single" w:sz="4" w:space="0" w:color="CCCCCC"/>
@@ -7447,11 +7256,6 @@
             <w:vAlign w:val="center"/>
           </w:tcPr>
           <w:p>
-            <w:pPr>
-              <w:rPr>
-                <w:rFonts w:hint="eastAsia"/>
-              </w:rPr>
-            </w:pPr>
             <w:r>
               <w:rPr>
                 <w:rFonts w:ascii="Arial Unicode MS" w:eastAsia="Arial Unicode MS" w:hAnsi="Arial Unicode MS" w:cs="Arial Unicode MS"/>
@@ -7460,14 +7264,6 @@
                 <w:szCs w:val="18"/>
               </w:rPr>
               <w:t>0=정상 1=축퇴 2=비상정지</w:t>
-            </w:r>
-            <w:r>
-              <w:rPr>
-                <w:rFonts w:ascii="Arial Unicode MS" w:hAnsi="Arial Unicode MS" w:cs="Arial Unicode MS" w:hint="eastAsia"/>
-                <w:color w:val="000000"/>
-                <w:sz w:val="18"/>
-                <w:szCs w:val="18"/>
-              </w:rPr>
             </w:r>
           </w:p>
         </w:tc>
@@ -7505,7 +7301,7 @@
       <w:tr>
         <w:tc>
           <w:tcPr>
-            <w:tcW w:w="900" w:type="dxa"/>
+            <w:tcW w:w="1980" w:type="dxa"/>
             <w:tcBorders>
               <w:top w:val="single" w:sz="4" w:space="0" w:color="CCCCCC"/>
               <w:left w:val="single" w:sz="4" w:space="0" w:color="CCCCCC"/>
@@ -7540,7 +7336,7 @@
         </w:tc>
         <w:tc>
           <w:tcPr>
-            <w:tcW w:w="1300" w:type="dxa"/>
+            <w:tcW w:w="1417" w:type="dxa"/>
             <w:tcBorders>
               <w:top w:val="single" w:sz="4" w:space="0" w:color="CCCCCC"/>
               <w:left w:val="single" w:sz="4" w:space="0" w:color="CCCCCC"/>
@@ -7572,7 +7368,7 @@
         </w:tc>
         <w:tc>
           <w:tcPr>
-            <w:tcW w:w="2000" w:type="dxa"/>
+            <w:tcW w:w="803" w:type="dxa"/>
             <w:tcBorders>
               <w:top w:val="single" w:sz="4" w:space="0" w:color="CCCCCC"/>
               <w:left w:val="single" w:sz="4" w:space="0" w:color="CCCCCC"/>
@@ -7672,7 +7468,21 @@
         <w:rPr>
           <w:rFonts w:ascii="Arial Unicode MS" w:eastAsia="Arial Unicode MS" w:hAnsi="Arial Unicode MS" w:cs="Arial Unicode MS"/>
         </w:rPr>
-        <w:t>3.4 IF-B4 motion/ego_state — 자차 상태</w:t>
+        <w:t>3.4 IF-B4 motion/</w:t>
+      </w:r>
+      <w:proofErr w:type="spellStart"/>
+      <w:r>
+        <w:rPr>
+          <w:rFonts w:ascii="Arial Unicode MS" w:eastAsia="Arial Unicode MS" w:hAnsi="Arial Unicode MS" w:cs="Arial Unicode MS"/>
+        </w:rPr>
+        <w:t>ego_state</w:t>
+      </w:r>
+      <w:proofErr w:type="spellEnd"/>
+      <w:r>
+        <w:rPr>
+          <w:rFonts w:ascii="Arial Unicode MS" w:eastAsia="Arial Unicode MS" w:hAnsi="Arial Unicode MS" w:cs="Arial Unicode MS"/>
+        </w:rPr>
+        <w:t xml:space="preserve"> — 자차 상태</w:t>
       </w:r>
     </w:p>
     <w:p>
@@ -7703,16 +7513,16 @@
         <w:tblLook w:val="0000" w:firstRow="0" w:lastRow="0" w:firstColumn="0" w:lastColumn="0" w:noHBand="0" w:noVBand="0"/>
       </w:tblPr>
       <w:tblGrid>
-        <w:gridCol w:w="900"/>
-        <w:gridCol w:w="1300"/>
-        <w:gridCol w:w="2000"/>
+        <w:gridCol w:w="1980"/>
+        <w:gridCol w:w="1417"/>
+        <w:gridCol w:w="803"/>
         <w:gridCol w:w="3226"/>
         <w:gridCol w:w="1600"/>
       </w:tblGrid>
       <w:tr>
         <w:tc>
           <w:tcPr>
-            <w:tcW w:w="900" w:type="dxa"/>
+            <w:tcW w:w="1980" w:type="dxa"/>
             <w:tcBorders>
               <w:top w:val="single" w:sz="4" w:space="0" w:color="FFFFFF"/>
               <w:left w:val="single" w:sz="4" w:space="0" w:color="FFFFFF"/>
@@ -7745,7 +7555,7 @@
         </w:tc>
         <w:tc>
           <w:tcPr>
-            <w:tcW w:w="1300" w:type="dxa"/>
+            <w:tcW w:w="1417" w:type="dxa"/>
             <w:tcBorders>
               <w:top w:val="single" w:sz="4" w:space="0" w:color="FFFFFF"/>
               <w:left w:val="single" w:sz="4" w:space="0" w:color="FFFFFF"/>
@@ -7778,7 +7588,7 @@
         </w:tc>
         <w:tc>
           <w:tcPr>
-            <w:tcW w:w="2000" w:type="dxa"/>
+            <w:tcW w:w="803" w:type="dxa"/>
             <w:tcBorders>
               <w:top w:val="single" w:sz="4" w:space="0" w:color="FFFFFF"/>
               <w:left w:val="single" w:sz="4" w:space="0" w:color="FFFFFF"/>
@@ -7879,7 +7689,7 @@
       <w:tr>
         <w:tc>
           <w:tcPr>
-            <w:tcW w:w="900" w:type="dxa"/>
+            <w:tcW w:w="1980" w:type="dxa"/>
             <w:tcBorders>
               <w:top w:val="single" w:sz="4" w:space="0" w:color="CCCCCC"/>
               <w:left w:val="single" w:sz="4" w:space="0" w:color="CCCCCC"/>
@@ -7914,7 +7724,7 @@
         </w:tc>
         <w:tc>
           <w:tcPr>
-            <w:tcW w:w="1300" w:type="dxa"/>
+            <w:tcW w:w="1417" w:type="dxa"/>
             <w:tcBorders>
               <w:top w:val="single" w:sz="4" w:space="0" w:color="CCCCCC"/>
               <w:left w:val="single" w:sz="4" w:space="0" w:color="CCCCCC"/>
@@ -7946,7 +7756,7 @@
         </w:tc>
         <w:tc>
           <w:tcPr>
-            <w:tcW w:w="2000" w:type="dxa"/>
+            <w:tcW w:w="803" w:type="dxa"/>
             <w:tcBorders>
               <w:top w:val="single" w:sz="4" w:space="0" w:color="CCCCCC"/>
               <w:left w:val="single" w:sz="4" w:space="0" w:color="CCCCCC"/>
@@ -7995,11 +7805,6 @@
             <w:vAlign w:val="center"/>
           </w:tcPr>
           <w:p>
-            <w:pPr>
-              <w:rPr>
-                <w:rFonts w:hint="eastAsia"/>
-              </w:rPr>
-            </w:pPr>
             <w:r>
               <w:rPr>
                 <w:rFonts w:ascii="Arial Unicode MS" w:eastAsia="Arial Unicode MS" w:hAnsi="Arial Unicode MS" w:cs="Arial Unicode MS"/>
@@ -8008,14 +7813,6 @@
                 <w:szCs w:val="18"/>
               </w:rPr>
               <w:t>0.0~1.0</w:t>
-            </w:r>
-            <w:r>
-              <w:rPr>
-                <w:rFonts w:ascii="Arial Unicode MS" w:hAnsi="Arial Unicode MS" w:cs="Arial Unicode MS" w:hint="eastAsia"/>
-                <w:color w:val="000000"/>
-                <w:sz w:val="18"/>
-                <w:szCs w:val="18"/>
-              </w:rPr>
             </w:r>
           </w:p>
         </w:tc>
@@ -8053,7 +7850,7 @@
       <w:tr>
         <w:tc>
           <w:tcPr>
-            <w:tcW w:w="900" w:type="dxa"/>
+            <w:tcW w:w="1980" w:type="dxa"/>
             <w:tcBorders>
               <w:top w:val="single" w:sz="4" w:space="0" w:color="CCCCCC"/>
               <w:left w:val="single" w:sz="4" w:space="0" w:color="CCCCCC"/>
@@ -8082,13 +7879,14 @@
                 <w:sz w:val="18"/>
                 <w:szCs w:val="18"/>
               </w:rPr>
+              <w:lastRenderedPageBreak/>
               <w:t>steer_cmd</w:t>
             </w:r>
           </w:p>
         </w:tc>
         <w:tc>
           <w:tcPr>
-            <w:tcW w:w="1300" w:type="dxa"/>
+            <w:tcW w:w="1417" w:type="dxa"/>
             <w:tcBorders>
               <w:top w:val="single" w:sz="4" w:space="0" w:color="CCCCCC"/>
               <w:left w:val="single" w:sz="4" w:space="0" w:color="CCCCCC"/>
@@ -8120,7 +7918,7 @@
         </w:tc>
         <w:tc>
           <w:tcPr>
-            <w:tcW w:w="2000" w:type="dxa"/>
+            <w:tcW w:w="803" w:type="dxa"/>
             <w:tcBorders>
               <w:top w:val="single" w:sz="4" w:space="0" w:color="CCCCCC"/>
               <w:left w:val="single" w:sz="4" w:space="0" w:color="CCCCCC"/>
@@ -8214,7 +8012,7 @@
       <w:tr>
         <w:tc>
           <w:tcPr>
-            <w:tcW w:w="900" w:type="dxa"/>
+            <w:tcW w:w="1980" w:type="dxa"/>
             <w:tcBorders>
               <w:top w:val="single" w:sz="4" w:space="0" w:color="CCCCCC"/>
               <w:left w:val="single" w:sz="4" w:space="0" w:color="CCCCCC"/>
@@ -8249,7 +8047,7 @@
         </w:tc>
         <w:tc>
           <w:tcPr>
-            <w:tcW w:w="1300" w:type="dxa"/>
+            <w:tcW w:w="1417" w:type="dxa"/>
             <w:tcBorders>
               <w:top w:val="single" w:sz="4" w:space="0" w:color="CCCCCC"/>
               <w:left w:val="single" w:sz="4" w:space="0" w:color="CCCCCC"/>
@@ -8281,7 +8079,7 @@
         </w:tc>
         <w:tc>
           <w:tcPr>
-            <w:tcW w:w="2000" w:type="dxa"/>
+            <w:tcW w:w="803" w:type="dxa"/>
             <w:tcBorders>
               <w:top w:val="single" w:sz="4" w:space="0" w:color="CCCCCC"/>
               <w:left w:val="single" w:sz="4" w:space="0" w:color="CCCCCC"/>
@@ -8375,7 +8173,7 @@
       <w:tr>
         <w:tc>
           <w:tcPr>
-            <w:tcW w:w="900" w:type="dxa"/>
+            <w:tcW w:w="1980" w:type="dxa"/>
             <w:tcBorders>
               <w:top w:val="single" w:sz="4" w:space="0" w:color="CCCCCC"/>
               <w:left w:val="single" w:sz="4" w:space="0" w:color="CCCCCC"/>
@@ -8410,7 +8208,7 @@
         </w:tc>
         <w:tc>
           <w:tcPr>
-            <w:tcW w:w="1300" w:type="dxa"/>
+            <w:tcW w:w="1417" w:type="dxa"/>
             <w:tcBorders>
               <w:top w:val="single" w:sz="4" w:space="0" w:color="CCCCCC"/>
               <w:left w:val="single" w:sz="4" w:space="0" w:color="CCCCCC"/>
@@ -8442,7 +8240,7 @@
         </w:tc>
         <w:tc>
           <w:tcPr>
-            <w:tcW w:w="2000" w:type="dxa"/>
+            <w:tcW w:w="803" w:type="dxa"/>
             <w:tcBorders>
               <w:top w:val="single" w:sz="4" w:space="0" w:color="CCCCCC"/>
               <w:left w:val="single" w:sz="4" w:space="0" w:color="CCCCCC"/>
@@ -8536,7 +8334,7 @@
       <w:tr>
         <w:tc>
           <w:tcPr>
-            <w:tcW w:w="900" w:type="dxa"/>
+            <w:tcW w:w="1980" w:type="dxa"/>
             <w:tcBorders>
               <w:top w:val="single" w:sz="4" w:space="0" w:color="CCCCCC"/>
               <w:left w:val="single" w:sz="4" w:space="0" w:color="CCCCCC"/>
@@ -8571,7 +8369,7 @@
         </w:tc>
         <w:tc>
           <w:tcPr>
-            <w:tcW w:w="1300" w:type="dxa"/>
+            <w:tcW w:w="1417" w:type="dxa"/>
             <w:tcBorders>
               <w:top w:val="single" w:sz="4" w:space="0" w:color="CCCCCC"/>
               <w:left w:val="single" w:sz="4" w:space="0" w:color="CCCCCC"/>
@@ -8603,7 +8401,7 @@
         </w:tc>
         <w:tc>
           <w:tcPr>
-            <w:tcW w:w="2000" w:type="dxa"/>
+            <w:tcW w:w="803" w:type="dxa"/>
             <w:tcBorders>
               <w:top w:val="single" w:sz="4" w:space="0" w:color="CCCCCC"/>
               <w:left w:val="single" w:sz="4" w:space="0" w:color="CCCCCC"/>
@@ -8652,11 +8450,6 @@
             <w:vAlign w:val="center"/>
           </w:tcPr>
           <w:p>
-            <w:pPr>
-              <w:rPr>
-                <w:rFonts w:hint="eastAsia"/>
-              </w:rPr>
-            </w:pPr>
             <w:r>
               <w:rPr>
                 <w:rFonts w:ascii="Arial Unicode MS" w:eastAsia="Arial Unicode MS" w:hAnsi="Arial Unicode MS" w:cs="Arial Unicode MS"/>
@@ -8665,14 +8458,6 @@
                 <w:szCs w:val="18"/>
               </w:rPr>
               <w:t>IF-B2와 동일</w:t>
-            </w:r>
-            <w:r>
-              <w:rPr>
-                <w:rFonts w:ascii="Arial Unicode MS" w:hAnsi="Arial Unicode MS" w:cs="Arial Unicode MS" w:hint="eastAsia"/>
-                <w:color w:val="000000"/>
-                <w:sz w:val="18"/>
-                <w:szCs w:val="18"/>
-              </w:rPr>
             </w:r>
           </w:p>
         </w:tc>
@@ -8716,7 +8501,21 @@
         <w:rPr>
           <w:rFonts w:ascii="Arial Unicode MS" w:eastAsia="Arial Unicode MS" w:hAnsi="Arial Unicode MS" w:cs="Arial Unicode MS"/>
         </w:rPr>
-        <w:t>3.5 IF-B5 v2v/leader_state · v2v/follower_state — 상대차 상태</w:t>
+        <w:t>3.5 IF-B5 v2v/</w:t>
+      </w:r>
+      <w:proofErr w:type="spellStart"/>
+      <w:r>
+        <w:rPr>
+          <w:rFonts w:ascii="Arial Unicode MS" w:eastAsia="Arial Unicode MS" w:hAnsi="Arial Unicode MS" w:cs="Arial Unicode MS"/>
+        </w:rPr>
+        <w:t>leader_state</w:t>
+      </w:r>
+      <w:proofErr w:type="spellEnd"/>
+      <w:r>
+        <w:rPr>
+          <w:rFonts w:ascii="Arial Unicode MS" w:eastAsia="Arial Unicode MS" w:hAnsi="Arial Unicode MS" w:cs="Arial Unicode MS"/>
+        </w:rPr>
+        <w:t xml:space="preserve"> · v2v/follower_state — 상대차 상태</w:t>
       </w:r>
     </w:p>
     <w:p>
@@ -8747,16 +8546,16 @@
         <w:tblLook w:val="0000" w:firstRow="0" w:lastRow="0" w:firstColumn="0" w:lastColumn="0" w:noHBand="0" w:noVBand="0"/>
       </w:tblPr>
       <w:tblGrid>
-        <w:gridCol w:w="900"/>
-        <w:gridCol w:w="1300"/>
-        <w:gridCol w:w="2000"/>
+        <w:gridCol w:w="2122"/>
+        <w:gridCol w:w="1275"/>
+        <w:gridCol w:w="803"/>
         <w:gridCol w:w="3226"/>
         <w:gridCol w:w="1600"/>
       </w:tblGrid>
       <w:tr>
         <w:tc>
           <w:tcPr>
-            <w:tcW w:w="900" w:type="dxa"/>
+            <w:tcW w:w="2122" w:type="dxa"/>
             <w:tcBorders>
               <w:top w:val="single" w:sz="4" w:space="0" w:color="FFFFFF"/>
               <w:left w:val="single" w:sz="4" w:space="0" w:color="FFFFFF"/>
@@ -8789,7 +8588,7 @@
         </w:tc>
         <w:tc>
           <w:tcPr>
-            <w:tcW w:w="1300" w:type="dxa"/>
+            <w:tcW w:w="1275" w:type="dxa"/>
             <w:tcBorders>
               <w:top w:val="single" w:sz="4" w:space="0" w:color="FFFFFF"/>
               <w:left w:val="single" w:sz="4" w:space="0" w:color="FFFFFF"/>
@@ -8822,7 +8621,7 @@
         </w:tc>
         <w:tc>
           <w:tcPr>
-            <w:tcW w:w="2000" w:type="dxa"/>
+            <w:tcW w:w="803" w:type="dxa"/>
             <w:tcBorders>
               <w:top w:val="single" w:sz="4" w:space="0" w:color="FFFFFF"/>
               <w:left w:val="single" w:sz="4" w:space="0" w:color="FFFFFF"/>
@@ -8923,7 +8722,7 @@
       <w:tr>
         <w:tc>
           <w:tcPr>
-            <w:tcW w:w="900" w:type="dxa"/>
+            <w:tcW w:w="2122" w:type="dxa"/>
             <w:tcBorders>
               <w:top w:val="single" w:sz="4" w:space="0" w:color="CCCCCC"/>
               <w:left w:val="single" w:sz="4" w:space="0" w:color="CCCCCC"/>
@@ -8958,7 +8757,7 @@
         </w:tc>
         <w:tc>
           <w:tcPr>
-            <w:tcW w:w="1300" w:type="dxa"/>
+            <w:tcW w:w="1275" w:type="dxa"/>
             <w:tcBorders>
               <w:top w:val="single" w:sz="4" w:space="0" w:color="CCCCCC"/>
               <w:left w:val="single" w:sz="4" w:space="0" w:color="CCCCCC"/>
@@ -8990,7 +8789,7 @@
         </w:tc>
         <w:tc>
           <w:tcPr>
-            <w:tcW w:w="2000" w:type="dxa"/>
+            <w:tcW w:w="803" w:type="dxa"/>
             <w:tcBorders>
               <w:top w:val="single" w:sz="4" w:space="0" w:color="CCCCCC"/>
               <w:left w:val="single" w:sz="4" w:space="0" w:color="CCCCCC"/>
@@ -9039,11 +8838,6 @@
             <w:vAlign w:val="center"/>
           </w:tcPr>
           <w:p>
-            <w:pPr>
-              <w:rPr>
-                <w:rFonts w:hint="eastAsia"/>
-              </w:rPr>
-            </w:pPr>
             <w:r>
               <w:rPr>
                 <w:rFonts w:ascii="Arial Unicode MS" w:eastAsia="Arial Unicode MS" w:hAnsi="Arial Unicode MS" w:cs="Arial Unicode MS"/>
@@ -9052,14 +8846,6 @@
                 <w:szCs w:val="18"/>
               </w:rPr>
               <w:t>-</w:t>
-            </w:r>
-            <w:r>
-              <w:rPr>
-                <w:rFonts w:ascii="Arial Unicode MS" w:hAnsi="Arial Unicode MS" w:cs="Arial Unicode MS" w:hint="eastAsia"/>
-                <w:color w:val="000000"/>
-                <w:sz w:val="18"/>
-                <w:szCs w:val="18"/>
-              </w:rPr>
             </w:r>
           </w:p>
         </w:tc>
@@ -9097,7 +8883,7 @@
       <w:tr>
         <w:tc>
           <w:tcPr>
-            <w:tcW w:w="900" w:type="dxa"/>
+            <w:tcW w:w="2122" w:type="dxa"/>
             <w:tcBorders>
               <w:top w:val="single" w:sz="4" w:space="0" w:color="CCCCCC"/>
               <w:left w:val="single" w:sz="4" w:space="0" w:color="CCCCCC"/>
@@ -9132,7 +8918,7 @@
         </w:tc>
         <w:tc>
           <w:tcPr>
-            <w:tcW w:w="1300" w:type="dxa"/>
+            <w:tcW w:w="1275" w:type="dxa"/>
             <w:tcBorders>
               <w:top w:val="single" w:sz="4" w:space="0" w:color="CCCCCC"/>
               <w:left w:val="single" w:sz="4" w:space="0" w:color="CCCCCC"/>
@@ -9164,7 +8950,7 @@
         </w:tc>
         <w:tc>
           <w:tcPr>
-            <w:tcW w:w="2000" w:type="dxa"/>
+            <w:tcW w:w="803" w:type="dxa"/>
             <w:tcBorders>
               <w:top w:val="single" w:sz="4" w:space="0" w:color="CCCCCC"/>
               <w:left w:val="single" w:sz="4" w:space="0" w:color="CCCCCC"/>
@@ -9258,7 +9044,7 @@
       <w:tr>
         <w:tc>
           <w:tcPr>
-            <w:tcW w:w="900" w:type="dxa"/>
+            <w:tcW w:w="2122" w:type="dxa"/>
             <w:tcBorders>
               <w:top w:val="single" w:sz="4" w:space="0" w:color="CCCCCC"/>
               <w:left w:val="single" w:sz="4" w:space="0" w:color="CCCCCC"/>
@@ -9293,7 +9079,7 @@
         </w:tc>
         <w:tc>
           <w:tcPr>
-            <w:tcW w:w="1300" w:type="dxa"/>
+            <w:tcW w:w="1275" w:type="dxa"/>
             <w:tcBorders>
               <w:top w:val="single" w:sz="4" w:space="0" w:color="CCCCCC"/>
               <w:left w:val="single" w:sz="4" w:space="0" w:color="CCCCCC"/>
@@ -9325,7 +9111,7 @@
         </w:tc>
         <w:tc>
           <w:tcPr>
-            <w:tcW w:w="2000" w:type="dxa"/>
+            <w:tcW w:w="803" w:type="dxa"/>
             <w:tcBorders>
               <w:top w:val="single" w:sz="4" w:space="0" w:color="CCCCCC"/>
               <w:left w:val="single" w:sz="4" w:space="0" w:color="CCCCCC"/>
@@ -9419,7 +9205,7 @@
       <w:tr>
         <w:tc>
           <w:tcPr>
-            <w:tcW w:w="900" w:type="dxa"/>
+            <w:tcW w:w="2122" w:type="dxa"/>
             <w:tcBorders>
               <w:top w:val="single" w:sz="4" w:space="0" w:color="CCCCCC"/>
               <w:left w:val="single" w:sz="4" w:space="0" w:color="CCCCCC"/>
@@ -9454,7 +9240,7 @@
         </w:tc>
         <w:tc>
           <w:tcPr>
-            <w:tcW w:w="1300" w:type="dxa"/>
+            <w:tcW w:w="1275" w:type="dxa"/>
             <w:tcBorders>
               <w:top w:val="single" w:sz="4" w:space="0" w:color="CCCCCC"/>
               <w:left w:val="single" w:sz="4" w:space="0" w:color="CCCCCC"/>
@@ -9486,7 +9272,7 @@
         </w:tc>
         <w:tc>
           <w:tcPr>
-            <w:tcW w:w="2000" w:type="dxa"/>
+            <w:tcW w:w="803" w:type="dxa"/>
             <w:tcBorders>
               <w:top w:val="single" w:sz="4" w:space="0" w:color="CCCCCC"/>
               <w:left w:val="single" w:sz="4" w:space="0" w:color="CCCCCC"/>
@@ -9586,7 +9372,21 @@
         <w:rPr>
           <w:rFonts w:ascii="Arial Unicode MS" w:eastAsia="Arial Unicode MS" w:hAnsi="Arial Unicode MS" w:cs="Arial Unicode MS"/>
         </w:rPr>
-        <w:t>3.6 IF-B6 v2v/link_status — 링크 상태</w:t>
+        <w:t>3.6 IF-B6 v2v/</w:t>
+      </w:r>
+      <w:proofErr w:type="spellStart"/>
+      <w:r>
+        <w:rPr>
+          <w:rFonts w:ascii="Arial Unicode MS" w:eastAsia="Arial Unicode MS" w:hAnsi="Arial Unicode MS" w:cs="Arial Unicode MS"/>
+        </w:rPr>
+        <w:t>link_status</w:t>
+      </w:r>
+      <w:proofErr w:type="spellEnd"/>
+      <w:r>
+        <w:rPr>
+          <w:rFonts w:ascii="Arial Unicode MS" w:eastAsia="Arial Unicode MS" w:hAnsi="Arial Unicode MS" w:cs="Arial Unicode MS"/>
+        </w:rPr>
+        <w:t xml:space="preserve"> — 링크 상태</w:t>
       </w:r>
     </w:p>
     <w:tbl>
@@ -9606,16 +9406,16 @@
         <w:tblLook w:val="0000" w:firstRow="0" w:lastRow="0" w:firstColumn="0" w:lastColumn="0" w:noHBand="0" w:noVBand="0"/>
       </w:tblPr>
       <w:tblGrid>
-        <w:gridCol w:w="900"/>
-        <w:gridCol w:w="1300"/>
-        <w:gridCol w:w="2000"/>
+        <w:gridCol w:w="1980"/>
+        <w:gridCol w:w="1417"/>
+        <w:gridCol w:w="803"/>
         <w:gridCol w:w="3226"/>
         <w:gridCol w:w="1600"/>
       </w:tblGrid>
       <w:tr>
         <w:tc>
           <w:tcPr>
-            <w:tcW w:w="900" w:type="dxa"/>
+            <w:tcW w:w="1980" w:type="dxa"/>
             <w:tcBorders>
               <w:top w:val="single" w:sz="4" w:space="0" w:color="FFFFFF"/>
               <w:left w:val="single" w:sz="4" w:space="0" w:color="FFFFFF"/>
@@ -9648,7 +9448,7 @@
         </w:tc>
         <w:tc>
           <w:tcPr>
-            <w:tcW w:w="1300" w:type="dxa"/>
+            <w:tcW w:w="1417" w:type="dxa"/>
             <w:tcBorders>
               <w:top w:val="single" w:sz="4" w:space="0" w:color="FFFFFF"/>
               <w:left w:val="single" w:sz="4" w:space="0" w:color="FFFFFF"/>
@@ -9681,7 +9481,7 @@
         </w:tc>
         <w:tc>
           <w:tcPr>
-            <w:tcW w:w="2000" w:type="dxa"/>
+            <w:tcW w:w="803" w:type="dxa"/>
             <w:tcBorders>
               <w:top w:val="single" w:sz="4" w:space="0" w:color="FFFFFF"/>
               <w:left w:val="single" w:sz="4" w:space="0" w:color="FFFFFF"/>
@@ -9782,7 +9582,7 @@
       <w:tr>
         <w:tc>
           <w:tcPr>
-            <w:tcW w:w="900" w:type="dxa"/>
+            <w:tcW w:w="1980" w:type="dxa"/>
             <w:tcBorders>
               <w:top w:val="single" w:sz="4" w:space="0" w:color="CCCCCC"/>
               <w:left w:val="single" w:sz="4" w:space="0" w:color="CCCCCC"/>
@@ -9817,7 +9617,7 @@
         </w:tc>
         <w:tc>
           <w:tcPr>
-            <w:tcW w:w="1300" w:type="dxa"/>
+            <w:tcW w:w="1417" w:type="dxa"/>
             <w:tcBorders>
               <w:top w:val="single" w:sz="4" w:space="0" w:color="CCCCCC"/>
               <w:left w:val="single" w:sz="4" w:space="0" w:color="CCCCCC"/>
@@ -9849,7 +9649,7 @@
         </w:tc>
         <w:tc>
           <w:tcPr>
-            <w:tcW w:w="2000" w:type="dxa"/>
+            <w:tcW w:w="803" w:type="dxa"/>
             <w:tcBorders>
               <w:top w:val="single" w:sz="4" w:space="0" w:color="CCCCCC"/>
               <w:left w:val="single" w:sz="4" w:space="0" w:color="CCCCCC"/>
@@ -9898,11 +9698,6 @@
             <w:vAlign w:val="center"/>
           </w:tcPr>
           <w:p>
-            <w:pPr>
-              <w:rPr>
-                <w:rFonts w:hint="eastAsia"/>
-              </w:rPr>
-            </w:pPr>
             <w:r>
               <w:rPr>
                 <w:rFonts w:ascii="Arial Unicode MS" w:eastAsia="Arial Unicode MS" w:hAnsi="Arial Unicode MS" w:cs="Arial Unicode MS"/>
@@ -9911,14 +9706,6 @@
                 <w:szCs w:val="18"/>
               </w:rPr>
               <w:t>0=정상 1=지연 2=두절</w:t>
-            </w:r>
-            <w:r>
-              <w:rPr>
-                <w:rFonts w:ascii="Arial Unicode MS" w:hAnsi="Arial Unicode MS" w:cs="Arial Unicode MS" w:hint="eastAsia"/>
-                <w:color w:val="000000"/>
-                <w:sz w:val="18"/>
-                <w:szCs w:val="18"/>
-              </w:rPr>
             </w:r>
           </w:p>
         </w:tc>
@@ -9956,7 +9743,7 @@
       <w:tr>
         <w:tc>
           <w:tcPr>
-            <w:tcW w:w="900" w:type="dxa"/>
+            <w:tcW w:w="1980" w:type="dxa"/>
             <w:tcBorders>
               <w:top w:val="single" w:sz="4" w:space="0" w:color="CCCCCC"/>
               <w:left w:val="single" w:sz="4" w:space="0" w:color="CCCCCC"/>
@@ -9991,7 +9778,7 @@
         </w:tc>
         <w:tc>
           <w:tcPr>
-            <w:tcW w:w="1300" w:type="dxa"/>
+            <w:tcW w:w="1417" w:type="dxa"/>
             <w:tcBorders>
               <w:top w:val="single" w:sz="4" w:space="0" w:color="CCCCCC"/>
               <w:left w:val="single" w:sz="4" w:space="0" w:color="CCCCCC"/>
@@ -10023,7 +9810,7 @@
         </w:tc>
         <w:tc>
           <w:tcPr>
-            <w:tcW w:w="2000" w:type="dxa"/>
+            <w:tcW w:w="803" w:type="dxa"/>
             <w:tcBorders>
               <w:top w:val="single" w:sz="4" w:space="0" w:color="CCCCCC"/>
               <w:left w:val="single" w:sz="4" w:space="0" w:color="CCCCCC"/>
@@ -10117,7 +9904,7 @@
       <w:tr>
         <w:tc>
           <w:tcPr>
-            <w:tcW w:w="900" w:type="dxa"/>
+            <w:tcW w:w="1980" w:type="dxa"/>
             <w:tcBorders>
               <w:top w:val="single" w:sz="4" w:space="0" w:color="CCCCCC"/>
               <w:left w:val="single" w:sz="4" w:space="0" w:color="CCCCCC"/>
@@ -10152,7 +9939,7 @@
         </w:tc>
         <w:tc>
           <w:tcPr>
-            <w:tcW w:w="1300" w:type="dxa"/>
+            <w:tcW w:w="1417" w:type="dxa"/>
             <w:tcBorders>
               <w:top w:val="single" w:sz="4" w:space="0" w:color="CCCCCC"/>
               <w:left w:val="single" w:sz="4" w:space="0" w:color="CCCCCC"/>
@@ -10184,7 +9971,7 @@
         </w:tc>
         <w:tc>
           <w:tcPr>
-            <w:tcW w:w="2000" w:type="dxa"/>
+            <w:tcW w:w="803" w:type="dxa"/>
             <w:tcBorders>
               <w:top w:val="single" w:sz="4" w:space="0" w:color="CCCCCC"/>
               <w:left w:val="single" w:sz="4" w:space="0" w:color="CCCCCC"/>
@@ -10297,7 +10084,14 @@
         <w:rPr>
           <w:rFonts w:ascii="Arial Unicode MS" w:eastAsia="Arial Unicode MS" w:hAnsi="Arial Unicode MS" w:cs="Arial Unicode MS"/>
         </w:rPr>
-        <w:t>포트: 선행 차량(192.168.0.11) 송신 → follower(192.168.0.12):5005, 후행 차량(192.168.0.12) 송신 → leader(192.168.0.11):5006. 교환 데이터는 측정 운동상태가 아니라 명령·의도와 추정값이다 (CONS-05). 페이로드 뒤에 HMAC-SHA256 32B를 첨부한다(PSK 32B, 양 차량 동일·오프라인 배포). 수신측은 HMAC 불일치·seq 비단조 패킷을 폐기한다.</w:t>
+        <w:t>포트: 선행 차량(192.168.0.11) 송신 → follower(192.168.0.12):5005, 후행 차량(192.168.0.12) 송신 → leader(192.168.0.11):5006. 교환 데이터는 측정 운동상태가 아니라 명령·의도와 추정값이다 (CONS-</w:t>
+      </w:r>
+      <w:r>
+        <w:rPr>
+          <w:rFonts w:ascii="Arial Unicode MS" w:eastAsia="Arial Unicode MS" w:hAnsi="Arial Unicode MS" w:cs="Arial Unicode MS"/>
+        </w:rPr>
+        <w:lastRenderedPageBreak/>
+        <w:t>05). 페이로드 뒤에 HMAC-SHA256 32B를 첨부한다(PSK 32B, 양 차량 동일·오프라인 배포). 수신측은 HMAC 불일치·seq 비단조 패킷을 폐기한다.</w:t>
       </w:r>
     </w:p>
     <w:p>
@@ -10329,8 +10123,8 @@
       </w:tblPr>
       <w:tblGrid>
         <w:gridCol w:w="900"/>
-        <w:gridCol w:w="1100"/>
-        <w:gridCol w:w="2100"/>
+        <w:gridCol w:w="2214"/>
+        <w:gridCol w:w="986"/>
         <w:gridCol w:w="2426"/>
         <w:gridCol w:w="1200"/>
         <w:gridCol w:w="1300"/>
@@ -10371,7 +10165,7 @@
         </w:tc>
         <w:tc>
           <w:tcPr>
-            <w:tcW w:w="1100" w:type="dxa"/>
+            <w:tcW w:w="2214" w:type="dxa"/>
             <w:tcBorders>
               <w:top w:val="single" w:sz="4" w:space="0" w:color="FFFFFF"/>
               <w:left w:val="single" w:sz="4" w:space="0" w:color="FFFFFF"/>
@@ -10404,7 +10198,7 @@
         </w:tc>
         <w:tc>
           <w:tcPr>
-            <w:tcW w:w="2100" w:type="dxa"/>
+            <w:tcW w:w="986" w:type="dxa"/>
             <w:tcBorders>
               <w:top w:val="single" w:sz="4" w:space="0" w:color="FFFFFF"/>
               <w:left w:val="single" w:sz="4" w:space="0" w:color="FFFFFF"/>
@@ -10573,7 +10367,7 @@
         </w:tc>
         <w:tc>
           <w:tcPr>
-            <w:tcW w:w="1100" w:type="dxa"/>
+            <w:tcW w:w="2214" w:type="dxa"/>
             <w:tcBorders>
               <w:top w:val="single" w:sz="4" w:space="0" w:color="CCCCCC"/>
               <w:left w:val="single" w:sz="4" w:space="0" w:color="CCCCCC"/>
@@ -10606,7 +10400,7 @@
         </w:tc>
         <w:tc>
           <w:tcPr>
-            <w:tcW w:w="2100" w:type="dxa"/>
+            <w:tcW w:w="986" w:type="dxa"/>
             <w:tcBorders>
               <w:top w:val="single" w:sz="4" w:space="0" w:color="CCCCCC"/>
               <w:left w:val="single" w:sz="4" w:space="0" w:color="CCCCCC"/>
@@ -10663,22 +10457,6 @@
                 <w:szCs w:val="18"/>
               </w:rPr>
               <w:t>1</w:t>
-            </w:r>
-            <w:r>
-              <w:rPr>
-                <w:rFonts w:ascii="Arial Unicode MS" w:hAnsi="Arial Unicode MS" w:cs="Arial Unicode MS" w:hint="eastAsia"/>
-                <w:color w:val="000000"/>
-                <w:sz w:val="18"/>
-                <w:szCs w:val="18"/>
-              </w:rPr>
-            </w:r>
-            <w:r>
-              <w:rPr>
-                <w:rFonts w:ascii="Arial Unicode MS" w:eastAsia="Arial Unicode MS" w:hAnsi="Arial Unicode MS" w:cs="Arial Unicode MS"/>
-                <w:color w:val="000000"/>
-                <w:sz w:val="18"/>
-                <w:szCs w:val="18"/>
-              </w:rPr>
             </w:r>
           </w:p>
         </w:tc>
@@ -10787,7 +10565,7 @@
         </w:tc>
         <w:tc>
           <w:tcPr>
-            <w:tcW w:w="1100" w:type="dxa"/>
+            <w:tcW w:w="2214" w:type="dxa"/>
             <w:tcBorders>
               <w:top w:val="single" w:sz="4" w:space="0" w:color="CCCCCC"/>
               <w:left w:val="single" w:sz="4" w:space="0" w:color="CCCCCC"/>
@@ -10820,7 +10598,7 @@
         </w:tc>
         <w:tc>
           <w:tcPr>
-            <w:tcW w:w="2100" w:type="dxa"/>
+            <w:tcW w:w="986" w:type="dxa"/>
             <w:tcBorders>
               <w:top w:val="single" w:sz="4" w:space="0" w:color="CCCCCC"/>
               <w:left w:val="single" w:sz="4" w:space="0" w:color="CCCCCC"/>
@@ -10877,30 +10655,6 @@
                 <w:szCs w:val="18"/>
               </w:rPr>
               <w:t>1</w:t>
-            </w:r>
-            <w:r>
-              <w:rPr>
-                <w:rFonts w:ascii="Arial Unicode MS" w:eastAsia="Arial Unicode MS" w:hAnsi="Arial Unicode MS" w:cs="Arial Unicode MS"/>
-                <w:color w:val="000000"/>
-                <w:sz w:val="18"/>
-                <w:szCs w:val="18"/>
-              </w:rPr>
-            </w:r>
-            <w:r>
-              <w:rPr>
-                <w:rFonts w:ascii="Arial Unicode MS" w:hAnsi="Arial Unicode MS" w:cs="Arial Unicode MS" w:hint="eastAsia"/>
-                <w:color w:val="000000"/>
-                <w:sz w:val="18"/>
-                <w:szCs w:val="18"/>
-              </w:rPr>
-            </w:r>
-            <w:r>
-              <w:rPr>
-                <w:rFonts w:ascii="Arial Unicode MS" w:eastAsia="Arial Unicode MS" w:hAnsi="Arial Unicode MS" w:cs="Arial Unicode MS"/>
-                <w:color w:val="000000"/>
-                <w:sz w:val="18"/>
-                <w:szCs w:val="18"/>
-              </w:rPr>
             </w:r>
           </w:p>
         </w:tc>
@@ -11009,7 +10763,7 @@
         </w:tc>
         <w:tc>
           <w:tcPr>
-            <w:tcW w:w="1100" w:type="dxa"/>
+            <w:tcW w:w="2214" w:type="dxa"/>
             <w:tcBorders>
               <w:top w:val="single" w:sz="4" w:space="0" w:color="CCCCCC"/>
               <w:left w:val="single" w:sz="4" w:space="0" w:color="CCCCCC"/>
@@ -11042,7 +10796,7 @@
         </w:tc>
         <w:tc>
           <w:tcPr>
-            <w:tcW w:w="2100" w:type="dxa"/>
+            <w:tcW w:w="986" w:type="dxa"/>
             <w:tcBorders>
               <w:top w:val="single" w:sz="4" w:space="0" w:color="CCCCCC"/>
               <w:left w:val="single" w:sz="4" w:space="0" w:color="CCCCCC"/>
@@ -11099,22 +10853,6 @@
                 <w:szCs w:val="18"/>
               </w:rPr>
               <w:t>1</w:t>
-            </w:r>
-            <w:r>
-              <w:rPr>
-                <w:rFonts w:ascii="Arial Unicode MS" w:hAnsi="Arial Unicode MS" w:cs="Arial Unicode MS" w:hint="eastAsia"/>
-                <w:color w:val="000000"/>
-                <w:sz w:val="18"/>
-                <w:szCs w:val="18"/>
-              </w:rPr>
-            </w:r>
-            <w:r>
-              <w:rPr>
-                <w:rFonts w:ascii="Arial Unicode MS" w:eastAsia="Arial Unicode MS" w:hAnsi="Arial Unicode MS" w:cs="Arial Unicode MS"/>
-                <w:color w:val="000000"/>
-                <w:sz w:val="18"/>
-                <w:szCs w:val="18"/>
-              </w:rPr>
             </w:r>
           </w:p>
         </w:tc>
@@ -11223,7 +10961,7 @@
         </w:tc>
         <w:tc>
           <w:tcPr>
-            <w:tcW w:w="1100" w:type="dxa"/>
+            <w:tcW w:w="2214" w:type="dxa"/>
             <w:tcBorders>
               <w:top w:val="single" w:sz="4" w:space="0" w:color="CCCCCC"/>
               <w:left w:val="single" w:sz="4" w:space="0" w:color="CCCCCC"/>
@@ -11256,7 +10994,7 @@
         </w:tc>
         <w:tc>
           <w:tcPr>
-            <w:tcW w:w="2100" w:type="dxa"/>
+            <w:tcW w:w="986" w:type="dxa"/>
             <w:tcBorders>
               <w:top w:val="single" w:sz="4" w:space="0" w:color="CCCCCC"/>
               <w:left w:val="single" w:sz="4" w:space="0" w:color="CCCCCC"/>
@@ -11307,7 +11045,7 @@
           <w:p>
             <w:pPr>
               <w:rPr>
-                <w:rFonts w:ascii="Arial Unicode MS" w:hAnsi="Arial Unicode MS" w:cs="Arial Unicode MS"/>
+                <w:rFonts w:ascii="Arial Unicode MS" w:hAnsi="Arial Unicode MS" w:cs="Arial Unicode MS" w:hint="eastAsia"/>
                 <w:color w:val="000000"/>
                 <w:sz w:val="18"/>
                 <w:szCs w:val="18"/>
@@ -11323,21 +11061,7 @@
               <w:t>1</w:t>
             </w:r>
           </w:p>
-          <w:p>
-            <w:pPr>
-              <w:rPr>
-                <w:rFonts w:hint="eastAsia"/>
-              </w:rPr>
-            </w:pPr>
-            <w:r>
-              <w:rPr>
-                <w:rFonts w:ascii="Arial Unicode MS" w:hAnsi="Arial Unicode MS" w:cs="Arial Unicode MS" w:hint="eastAsia"/>
-                <w:color w:val="000000"/>
-                <w:sz w:val="18"/>
-                <w:szCs w:val="18"/>
-              </w:rPr>
-            </w:r>
-          </w:p>
+          <w:p/>
         </w:tc>
         <w:tc>
           <w:tcPr>
@@ -11444,7 +11168,7 @@
         </w:tc>
         <w:tc>
           <w:tcPr>
-            <w:tcW w:w="1100" w:type="dxa"/>
+            <w:tcW w:w="2214" w:type="dxa"/>
             <w:tcBorders>
               <w:top w:val="single" w:sz="4" w:space="0" w:color="CCCCCC"/>
               <w:left w:val="single" w:sz="4" w:space="0" w:color="CCCCCC"/>
@@ -11477,7 +11201,7 @@
         </w:tc>
         <w:tc>
           <w:tcPr>
-            <w:tcW w:w="2100" w:type="dxa"/>
+            <w:tcW w:w="986" w:type="dxa"/>
             <w:tcBorders>
               <w:top w:val="single" w:sz="4" w:space="0" w:color="CCCCCC"/>
               <w:left w:val="single" w:sz="4" w:space="0" w:color="CCCCCC"/>
@@ -11528,7 +11252,7 @@
           <w:p>
             <w:pPr>
               <w:rPr>
-                <w:rFonts w:ascii="Arial Unicode MS" w:hAnsi="Arial Unicode MS" w:cs="Arial Unicode MS"/>
+                <w:rFonts w:ascii="Arial Unicode MS" w:hAnsi="Arial Unicode MS" w:cs="Arial Unicode MS" w:hint="eastAsia"/>
                 <w:color w:val="000000"/>
                 <w:sz w:val="18"/>
                 <w:szCs w:val="18"/>
@@ -11543,30 +11267,8 @@
               </w:rPr>
               <w:t>2</w:t>
             </w:r>
-            <w:r>
-              <w:rPr>
-                <w:rFonts w:ascii="Arial Unicode MS" w:hAnsi="Arial Unicode MS" w:cs="Arial Unicode MS" w:hint="eastAsia"/>
-                <w:color w:val="000000"/>
-                <w:sz w:val="18"/>
-                <w:szCs w:val="18"/>
-              </w:rPr>
-            </w:r>
-          </w:p>
-          <w:p>
-            <w:pPr>
-              <w:rPr>
-                <w:rFonts w:hint="eastAsia"/>
-              </w:rPr>
-            </w:pPr>
-            <w:r>
-              <w:rPr>
-                <w:rFonts w:ascii="Arial Unicode MS" w:hAnsi="Arial Unicode MS" w:cs="Arial Unicode MS" w:hint="eastAsia"/>
-                <w:color w:val="000000"/>
-                <w:sz w:val="18"/>
-                <w:szCs w:val="18"/>
-              </w:rPr>
-            </w:r>
-          </w:p>
+          </w:p>
+          <w:p/>
         </w:tc>
         <w:tc>
           <w:tcPr>
@@ -11673,7 +11375,7 @@
         </w:tc>
         <w:tc>
           <w:tcPr>
-            <w:tcW w:w="1100" w:type="dxa"/>
+            <w:tcW w:w="2214" w:type="dxa"/>
             <w:tcBorders>
               <w:top w:val="single" w:sz="4" w:space="0" w:color="CCCCCC"/>
               <w:left w:val="single" w:sz="4" w:space="0" w:color="CCCCCC"/>
@@ -11706,7 +11408,7 @@
         </w:tc>
         <w:tc>
           <w:tcPr>
-            <w:tcW w:w="2100" w:type="dxa"/>
+            <w:tcW w:w="986" w:type="dxa"/>
             <w:tcBorders>
               <w:top w:val="single" w:sz="4" w:space="0" w:color="CCCCCC"/>
               <w:left w:val="single" w:sz="4" w:space="0" w:color="CCCCCC"/>
@@ -11763,22 +11465,6 @@
                 <w:szCs w:val="18"/>
               </w:rPr>
               <w:t>8</w:t>
-            </w:r>
-            <w:r>
-              <w:rPr>
-                <w:rFonts w:ascii="Arial Unicode MS" w:hAnsi="Arial Unicode MS" w:cs="Arial Unicode MS" w:hint="eastAsia"/>
-                <w:color w:val="000000"/>
-                <w:sz w:val="18"/>
-                <w:szCs w:val="18"/>
-              </w:rPr>
-            </w:r>
-            <w:r>
-              <w:rPr>
-                <w:rFonts w:ascii="Arial Unicode MS" w:eastAsia="Arial Unicode MS" w:hAnsi="Arial Unicode MS" w:cs="Arial Unicode MS"/>
-                <w:color w:val="000000"/>
-                <w:sz w:val="18"/>
-                <w:szCs w:val="18"/>
-              </w:rPr>
             </w:r>
           </w:p>
         </w:tc>
@@ -11887,7 +11573,7 @@
         </w:tc>
         <w:tc>
           <w:tcPr>
-            <w:tcW w:w="1100" w:type="dxa"/>
+            <w:tcW w:w="2214" w:type="dxa"/>
             <w:tcBorders>
               <w:top w:val="single" w:sz="4" w:space="0" w:color="CCCCCC"/>
               <w:left w:val="single" w:sz="4" w:space="0" w:color="CCCCCC"/>
@@ -11920,7 +11606,7 @@
         </w:tc>
         <w:tc>
           <w:tcPr>
-            <w:tcW w:w="2100" w:type="dxa"/>
+            <w:tcW w:w="986" w:type="dxa"/>
             <w:tcBorders>
               <w:top w:val="single" w:sz="4" w:space="0" w:color="CCCCCC"/>
               <w:left w:val="single" w:sz="4" w:space="0" w:color="CCCCCC"/>
@@ -12085,7 +11771,7 @@
         </w:tc>
         <w:tc>
           <w:tcPr>
-            <w:tcW w:w="1100" w:type="dxa"/>
+            <w:tcW w:w="2214" w:type="dxa"/>
             <w:tcBorders>
               <w:top w:val="single" w:sz="4" w:space="0" w:color="CCCCCC"/>
               <w:left w:val="single" w:sz="4" w:space="0" w:color="CCCCCC"/>
@@ -12118,7 +11804,7 @@
         </w:tc>
         <w:tc>
           <w:tcPr>
-            <w:tcW w:w="2100" w:type="dxa"/>
+            <w:tcW w:w="986" w:type="dxa"/>
             <w:tcBorders>
               <w:top w:val="single" w:sz="4" w:space="0" w:color="CCCCCC"/>
               <w:left w:val="single" w:sz="4" w:space="0" w:color="CCCCCC"/>
@@ -12283,7 +11969,7 @@
         </w:tc>
         <w:tc>
           <w:tcPr>
-            <w:tcW w:w="1100" w:type="dxa"/>
+            <w:tcW w:w="2214" w:type="dxa"/>
             <w:tcBorders>
               <w:top w:val="single" w:sz="4" w:space="0" w:color="CCCCCC"/>
               <w:left w:val="single" w:sz="4" w:space="0" w:color="CCCCCC"/>
@@ -12316,7 +12002,7 @@
         </w:tc>
         <w:tc>
           <w:tcPr>
-            <w:tcW w:w="2100" w:type="dxa"/>
+            <w:tcW w:w="986" w:type="dxa"/>
             <w:tcBorders>
               <w:top w:val="single" w:sz="4" w:space="0" w:color="CCCCCC"/>
               <w:left w:val="single" w:sz="4" w:space="0" w:color="CCCCCC"/>
@@ -12373,38 +12059,6 @@
                 <w:szCs w:val="18"/>
               </w:rPr>
               <w:t>4</w:t>
-            </w:r>
-            <w:r>
-              <w:rPr>
-                <w:rFonts w:ascii="Arial Unicode MS" w:hAnsi="Arial Unicode MS" w:cs="Arial Unicode MS" w:hint="eastAsia"/>
-                <w:color w:val="000000"/>
-                <w:sz w:val="18"/>
-                <w:szCs w:val="18"/>
-              </w:rPr>
-            </w:r>
-            <w:r>
-              <w:rPr>
-                <w:rFonts w:ascii="Arial Unicode MS" w:eastAsia="Arial Unicode MS" w:hAnsi="Arial Unicode MS" w:cs="Arial Unicode MS"/>
-                <w:color w:val="000000"/>
-                <w:sz w:val="18"/>
-                <w:szCs w:val="18"/>
-              </w:rPr>
-            </w:r>
-            <w:r>
-              <w:rPr>
-                <w:rFonts w:ascii="Arial Unicode MS" w:hAnsi="Arial Unicode MS" w:cs="Arial Unicode MS" w:hint="eastAsia"/>
-                <w:color w:val="000000"/>
-                <w:sz w:val="18"/>
-                <w:szCs w:val="18"/>
-              </w:rPr>
-            </w:r>
-            <w:r>
-              <w:rPr>
-                <w:rFonts w:ascii="Arial Unicode MS" w:eastAsia="Arial Unicode MS" w:hAnsi="Arial Unicode MS" w:cs="Arial Unicode MS"/>
-                <w:color w:val="000000"/>
-                <w:sz w:val="18"/>
-                <w:szCs w:val="18"/>
-              </w:rPr>
             </w:r>
           </w:p>
         </w:tc>
@@ -12513,7 +12167,7 @@
         </w:tc>
         <w:tc>
           <w:tcPr>
-            <w:tcW w:w="1100" w:type="dxa"/>
+            <w:tcW w:w="2214" w:type="dxa"/>
             <w:tcBorders>
               <w:top w:val="single" w:sz="4" w:space="0" w:color="CCCCCC"/>
               <w:left w:val="single" w:sz="4" w:space="0" w:color="CCCCCC"/>
@@ -12546,7 +12200,7 @@
         </w:tc>
         <w:tc>
           <w:tcPr>
-            <w:tcW w:w="2100" w:type="dxa"/>
+            <w:tcW w:w="986" w:type="dxa"/>
             <w:tcBorders>
               <w:top w:val="single" w:sz="4" w:space="0" w:color="CCCCCC"/>
               <w:left w:val="single" w:sz="4" w:space="0" w:color="CCCCCC"/>
@@ -12711,7 +12365,7 @@
         </w:tc>
         <w:tc>
           <w:tcPr>
-            <w:tcW w:w="1100" w:type="dxa"/>
+            <w:tcW w:w="2214" w:type="dxa"/>
             <w:tcBorders>
               <w:top w:val="single" w:sz="4" w:space="0" w:color="CCCCCC"/>
               <w:left w:val="single" w:sz="4" w:space="0" w:color="CCCCCC"/>
@@ -12744,7 +12398,7 @@
         </w:tc>
         <w:tc>
           <w:tcPr>
-            <w:tcW w:w="2100" w:type="dxa"/>
+            <w:tcW w:w="986" w:type="dxa"/>
             <w:tcBorders>
               <w:top w:val="single" w:sz="4" w:space="0" w:color="CCCCCC"/>
               <w:left w:val="single" w:sz="4" w:space="0" w:color="CCCCCC"/>
@@ -12971,6 +12625,7 @@
                 <w:bCs/>
                 <w:color w:val="FFFFFF"/>
               </w:rPr>
+              <w:lastRenderedPageBreak/>
               <w:t>ID</w:t>
             </w:r>
           </w:p>
@@ -13227,11 +12882,6 @@
             <w:vAlign w:val="center"/>
           </w:tcPr>
           <w:p>
-            <w:pPr>
-              <w:rPr>
-                <w:rFonts w:hint="eastAsia"/>
-              </w:rPr>
-            </w:pPr>
             <w:r>
               <w:rPr>
                 <w:rFonts w:ascii="Arial Unicode MS" w:eastAsia="Arial Unicode MS" w:hAnsi="Arial Unicode MS" w:cs="Arial Unicode MS"/>
@@ -13240,14 +12890,6 @@
                 <w:szCs w:val="18"/>
               </w:rPr>
               <w:t>TBD (50ms 처리 가능 범위)</w:t>
-            </w:r>
-            <w:r>
-              <w:rPr>
-                <w:rFonts w:ascii="Arial Unicode MS" w:hAnsi="Arial Unicode MS" w:cs="Arial Unicode MS" w:hint="eastAsia"/>
-                <w:color w:val="000000"/>
-                <w:sz w:val="18"/>
-                <w:szCs w:val="18"/>
-              </w:rPr>
             </w:r>
           </w:p>
         </w:tc>
@@ -13884,11 +13526,6 @@
             <w:vAlign w:val="center"/>
           </w:tcPr>
           <w:p>
-            <w:pPr>
-              <w:rPr>
-                <w:rFonts w:hint="eastAsia"/>
-              </w:rPr>
-            </w:pPr>
             <w:r>
               <w:rPr>
                 <w:rFonts w:ascii="Arial Unicode MS" w:eastAsia="Arial Unicode MS" w:hAnsi="Arial Unicode MS" w:cs="Arial Unicode MS"/>
@@ -13897,14 +13534,6 @@
                 <w:szCs w:val="18"/>
               </w:rPr>
               <w:t>주파수 TBD / 0~100%</w:t>
-            </w:r>
-            <w:r>
-              <w:rPr>
-                <w:rFonts w:ascii="Arial Unicode MS" w:hAnsi="Arial Unicode MS" w:cs="Arial Unicode MS" w:hint="eastAsia"/>
-                <w:color w:val="000000"/>
-                <w:sz w:val="18"/>
-                <w:szCs w:val="18"/>
-              </w:rPr>
             </w:r>
           </w:p>
         </w:tc>
@@ -14058,11 +13687,6 @@
             <w:vAlign w:val="center"/>
           </w:tcPr>
           <w:p>
-            <w:pPr>
-              <w:rPr>
-                <w:rFonts w:hint="eastAsia"/>
-              </w:rPr>
-            </w:pPr>
             <w:r>
               <w:rPr>
                 <w:rFonts w:ascii="Arial Unicode MS" w:eastAsia="Arial Unicode MS" w:hAnsi="Arial Unicode MS" w:cs="Arial Unicode MS"/>
@@ -14071,14 +13695,6 @@
                 <w:szCs w:val="18"/>
               </w:rPr>
               <w:t>IN1·IN2 (전진/후진/정지)</w:t>
-            </w:r>
-            <w:r>
-              <w:rPr>
-                <w:rFonts w:ascii="Arial Unicode MS" w:hAnsi="Arial Unicode MS" w:cs="Arial Unicode MS" w:hint="eastAsia"/>
-                <w:color w:val="000000"/>
-                <w:sz w:val="18"/>
-                <w:szCs w:val="18"/>
-              </w:rPr>
             </w:r>
           </w:p>
         </w:tc>
@@ -14412,22 +14028,6 @@
               </w:rPr>
               <w:t>lane_valid는 NFR-01 차선 폴백 입력</w:t>
             </w:r>
-            <w:r>
-              <w:rPr>
-                <w:rFonts w:ascii="맑은 고딕" w:eastAsia="맑은 고딕" w:hAnsi="맑은 고딕" w:cs="맑은 고딕" w:hint="eastAsia"/>
-                <w:color w:val="000000"/>
-                <w:sz w:val="18"/>
-                <w:szCs w:val="18"/>
-              </w:rPr>
-            </w:r>
-            <w:r>
-              <w:rPr>
-                <w:rFonts w:ascii="Arial Unicode MS" w:eastAsia="Arial Unicode MS" w:hAnsi="Arial Unicode MS" w:cs="Arial Unicode MS"/>
-                <w:color w:val="000000"/>
-                <w:sz w:val="18"/>
-                <w:szCs w:val="18"/>
-              </w:rPr>
-            </w:r>
           </w:p>
         </w:tc>
       </w:tr>
@@ -14551,11 +14151,6 @@
             <w:vAlign w:val="center"/>
           </w:tcPr>
           <w:p>
-            <w:pPr>
-              <w:rPr>
-                <w:rFonts w:hint="eastAsia"/>
-              </w:rPr>
-            </w:pPr>
             <w:r>
               <w:rPr>
                 <w:rFonts w:ascii="Arial Unicode MS" w:hAnsi="Arial Unicode MS" w:cs="Arial Unicode MS" w:hint="eastAsia"/>
@@ -14563,7 +14158,43 @@
                 <w:sz w:val="18"/>
                 <w:szCs w:val="18"/>
               </w:rPr>
-              <w:t>유일한 명령 경로</w:t>
+              <w:t>유일한</w:t>
+            </w:r>
+            <w:r>
+              <w:rPr>
+                <w:rFonts w:ascii="Arial Unicode MS" w:hAnsi="Arial Unicode MS" w:cs="Arial Unicode MS" w:hint="eastAsia"/>
+                <w:color w:val="000000"/>
+                <w:sz w:val="18"/>
+                <w:szCs w:val="18"/>
+              </w:rPr>
+              <w:t xml:space="preserve"> </w:t>
+            </w:r>
+            <w:r>
+              <w:rPr>
+                <w:rFonts w:ascii="Arial Unicode MS" w:hAnsi="Arial Unicode MS" w:cs="Arial Unicode MS" w:hint="eastAsia"/>
+                <w:color w:val="000000"/>
+                <w:sz w:val="18"/>
+                <w:szCs w:val="18"/>
+              </w:rPr>
+              <w:t>명령</w:t>
+            </w:r>
+            <w:r>
+              <w:rPr>
+                <w:rFonts w:ascii="Arial Unicode MS" w:hAnsi="Arial Unicode MS" w:cs="Arial Unicode MS" w:hint="eastAsia"/>
+                <w:color w:val="000000"/>
+                <w:sz w:val="18"/>
+                <w:szCs w:val="18"/>
+              </w:rPr>
+              <w:t xml:space="preserve"> </w:t>
+            </w:r>
+            <w:r>
+              <w:rPr>
+                <w:rFonts w:ascii="Arial Unicode MS" w:hAnsi="Arial Unicode MS" w:cs="Arial Unicode MS" w:hint="eastAsia"/>
+                <w:color w:val="000000"/>
+                <w:sz w:val="18"/>
+                <w:szCs w:val="18"/>
+              </w:rPr>
+              <w:t>경로</w:t>
             </w:r>
           </w:p>
         </w:tc>
@@ -15659,22 +15290,6 @@
               </w:rPr>
               <w:t>상세설계 착수 시 확정 — 본 문서 개정</w:t>
             </w:r>
-            <w:r>
-              <w:rPr>
-                <w:rFonts w:ascii="맑은 고딕" w:eastAsia="맑은 고딕" w:hAnsi="맑은 고딕" w:cs="맑은 고딕" w:hint="eastAsia"/>
-                <w:color w:val="000000"/>
-                <w:sz w:val="18"/>
-                <w:szCs w:val="18"/>
-              </w:rPr>
-            </w:r>
-            <w:r>
-              <w:rPr>
-                <w:rFonts w:ascii="Arial Unicode MS" w:eastAsia="Arial Unicode MS" w:hAnsi="Arial Unicode MS" w:cs="Arial Unicode MS"/>
-                <w:color w:val="000000"/>
-                <w:sz w:val="18"/>
-                <w:szCs w:val="18"/>
-              </w:rPr>
-            </w:r>
           </w:p>
         </w:tc>
       </w:tr>
@@ -15798,11 +15413,6 @@
             <w:vAlign w:val="center"/>
           </w:tcPr>
           <w:p>
-            <w:pPr>
-              <w:rPr>
-                <w:rFonts w:hint="eastAsia"/>
-              </w:rPr>
-            </w:pPr>
             <w:r>
               <w:rPr>
                 <w:rFonts w:ascii="Arial Unicode MS" w:hAnsi="Arial Unicode MS" w:cs="Arial Unicode MS" w:hint="eastAsia"/>
@@ -15810,7 +15420,79 @@
                 <w:sz w:val="18"/>
                 <w:szCs w:val="18"/>
               </w:rPr>
-              <w:t>트랙 실측·YOLO 학습 클래스 확정</w:t>
+              <w:t>트랙</w:t>
+            </w:r>
+            <w:r>
+              <w:rPr>
+                <w:rFonts w:ascii="Arial Unicode MS" w:hAnsi="Arial Unicode MS" w:cs="Arial Unicode MS" w:hint="eastAsia"/>
+                <w:color w:val="000000"/>
+                <w:sz w:val="18"/>
+                <w:szCs w:val="18"/>
+              </w:rPr>
+              <w:t xml:space="preserve"> </w:t>
+            </w:r>
+            <w:r>
+              <w:rPr>
+                <w:rFonts w:ascii="Arial Unicode MS" w:hAnsi="Arial Unicode MS" w:cs="Arial Unicode MS" w:hint="eastAsia"/>
+                <w:color w:val="000000"/>
+                <w:sz w:val="18"/>
+                <w:szCs w:val="18"/>
+              </w:rPr>
+              <w:t>실측·</w:t>
+            </w:r>
+            <w:r>
+              <w:rPr>
+                <w:rFonts w:ascii="Arial Unicode MS" w:hAnsi="Arial Unicode MS" w:cs="Arial Unicode MS" w:hint="eastAsia"/>
+                <w:color w:val="000000"/>
+                <w:sz w:val="18"/>
+                <w:szCs w:val="18"/>
+              </w:rPr>
+              <w:t xml:space="preserve">YOLO </w:t>
+            </w:r>
+            <w:r>
+              <w:rPr>
+                <w:rFonts w:ascii="Arial Unicode MS" w:hAnsi="Arial Unicode MS" w:cs="Arial Unicode MS" w:hint="eastAsia"/>
+                <w:color w:val="000000"/>
+                <w:sz w:val="18"/>
+                <w:szCs w:val="18"/>
+              </w:rPr>
+              <w:t>학습</w:t>
+            </w:r>
+            <w:r>
+              <w:rPr>
+                <w:rFonts w:ascii="Arial Unicode MS" w:hAnsi="Arial Unicode MS" w:cs="Arial Unicode MS" w:hint="eastAsia"/>
+                <w:color w:val="000000"/>
+                <w:sz w:val="18"/>
+                <w:szCs w:val="18"/>
+              </w:rPr>
+              <w:t xml:space="preserve"> </w:t>
+            </w:r>
+            <w:r>
+              <w:rPr>
+                <w:rFonts w:ascii="Arial Unicode MS" w:hAnsi="Arial Unicode MS" w:cs="Arial Unicode MS" w:hint="eastAsia"/>
+                <w:color w:val="000000"/>
+                <w:sz w:val="18"/>
+                <w:szCs w:val="18"/>
+              </w:rPr>
+              <w:t>클래스</w:t>
+            </w:r>
+            <w:r>
+              <w:rPr>
+                <w:rFonts w:ascii="Arial Unicode MS" w:hAnsi="Arial Unicode MS" w:cs="Arial Unicode MS" w:hint="eastAsia"/>
+                <w:color w:val="000000"/>
+                <w:sz w:val="18"/>
+                <w:szCs w:val="18"/>
+              </w:rPr>
+              <w:t xml:space="preserve"> </w:t>
+            </w:r>
+            <w:r>
+              <w:rPr>
+                <w:rFonts w:ascii="Arial Unicode MS" w:hAnsi="Arial Unicode MS" w:cs="Arial Unicode MS" w:hint="eastAsia"/>
+                <w:color w:val="000000"/>
+                <w:sz w:val="18"/>
+                <w:szCs w:val="18"/>
+              </w:rPr>
+              <w:t>확정</w:t>
             </w:r>
           </w:p>
         </w:tc>
@@ -15979,6 +15661,7 @@
                 <w:sz w:val="18"/>
                 <w:szCs w:val="18"/>
               </w:rPr>
+              <w:lastRenderedPageBreak/>
               <w:t>4</w:t>
             </w:r>
           </w:p>
@@ -16212,6 +15895,7 @@
         </w:tc>
       </w:tr>
     </w:tbl>
+    <w:p/>
     <w:sectPr>
       <w:headerReference w:type="default" r:id="rId6"/>
       <w:footerReference w:type="default" r:id="rId7"/>
@@ -16414,7 +16098,7 @@
         <w:sz w:val="16"/>
         <w:szCs w:val="16"/>
       </w:rPr>
-      <w:t>ICD-PLT-001 v1.0  |  군집주행 인터페이스 명세서</w:t>
+      <w:t xml:space="preserve">ICD-PLT-001 </w:t>
     </w:r>
     <w:proofErr w:type="gramStart"/>
     <w:r>
@@ -16424,6 +16108,7 @@
         <w:sz w:val="16"/>
         <w:szCs w:val="16"/>
       </w:rPr>
+      <w:t>v1.0  |</w:t>
     </w:r>
     <w:proofErr w:type="gramEnd"/>
     <w:r>
@@ -16433,6 +16118,7 @@
         <w:sz w:val="16"/>
         <w:szCs w:val="16"/>
       </w:rPr>
+      <w:t xml:space="preserve">  군집주행 인터페이스 명세서</w:t>
     </w:r>
   </w:p>
 </w:hdr>

</xml_diff>

<commit_message>
SCENE - Current Lane 추가, 통신 60Byte 증가
Co-Authored-By: Claude Sonnet 4.6 <noreply@anthropic.com>
</commit_message>
<xml_diff>
--- a/docs/05_SWE.2_SW아키텍처/ICD-PLT-001_인터페이스명세서_v1.0.docx
+++ b/docs/05_SWE.2_SW아키텍처/ICD-PLT-001_인터페이스명세서_v1.0.docx
@@ -1516,6 +1516,58 @@
           </w:p>
         </w:tc>
       </w:tr>
+      <w:tr>
+        <w:tc>
+          <w:tcPr>
+            <w:tcW w:type="dxa" w:w="900"/>
+          </w:tcPr>
+          <w:p>
+            <w:r>
+              <w:t>1.1</w:t>
+            </w:r>
+          </w:p>
+        </w:tc>
+        <w:tc>
+          <w:tcPr>
+            <w:tcW w:type="dxa" w:w="1320"/>
+          </w:tcPr>
+          <w:p>
+            <w:r>
+              <w:t>2026-06-15</w:t>
+            </w:r>
+          </w:p>
+        </w:tc>
+        <w:tc>
+          <w:tcPr>
+            <w:tcW w:type="dxa" w:w="1380"/>
+          </w:tcPr>
+          <w:p>
+            <w:r>
+              <w:t>허지욱</w:t>
+            </w:r>
+          </w:p>
+        </w:tc>
+        <w:tc>
+          <w:tcPr>
+            <w:tcW w:type="dxa" w:w="3615"/>
+          </w:tcPr>
+          <w:p>
+            <w:r>
+              <w:t>STATE 패킷 28B/60B 확장 — current_lane(인지 영역) 추가 + 도메인별 reserved (v2v.py·messages.py 동기)</w:t>
+            </w:r>
+          </w:p>
+        </w:tc>
+        <w:tc>
+          <w:tcPr>
+            <w:tcW w:type="dxa" w:w="1815"/>
+          </w:tcPr>
+          <w:p>
+            <w:r>
+              <w:t>변경</w:t>
+            </w:r>
+          </w:p>
+        </w:tc>
+      </w:tr>
     </w:tbl>
     <w:p/>
     <w:p>
@@ -1594,10 +1646,7 @@
         <w:ind w:left="360"/>
       </w:pPr>
       <w:r>
-        <w:rPr>
-          <w:rFonts w:ascii="Arial Unicode MS" w:eastAsia="Arial Unicode MS" w:hAnsi="Arial Unicode MS" w:cs="Arial Unicode MS"/>
-        </w:rPr>
-        <w:t>•  외부: V2V 패킷 2종 (STATE 22B / EVENT 20B + HMAC 32B, WiFi UDP)</w:t>
+        <w:t>•  외부: V2V 패킷 2종 (STATE 28B / EVENT 20B + HMAC 32B, WiFi UDP)</w:t>
       </w:r>
     </w:p>
     <w:p>
@@ -3882,17 +3931,8 @@
             <w:vAlign w:val="center"/>
           </w:tcPr>
           <w:p>
-            <w:pPr>
-              <w:jc w:val="center"/>
-            </w:pPr>
-            <w:r>
-              <w:rPr>
-                <w:rFonts w:ascii="Arial Unicode MS" w:eastAsia="Arial Unicode MS" w:hAnsi="Arial Unicode MS" w:cs="Arial Unicode MS"/>
-                <w:color w:val="000000"/>
-                <w:sz w:val="18"/>
-                <w:szCs w:val="18"/>
-              </w:rPr>
-              <w:t>STATE 패킷 (22B 페이로드+HMAC 32B=54B)</w:t>
+            <w:r>
+              <w:t>STATE 패킷 (28B 페이로드+HMAC 32B=60B)</w:t>
             </w:r>
           </w:p>
         </w:tc>
@@ -9938,10 +9978,7 @@
         <w:pStyle w:val="2"/>
       </w:pPr>
       <w:r>
-        <w:rPr>
-          <w:rFonts w:ascii="Arial Unicode MS" w:eastAsia="Arial Unicode MS" w:hAnsi="Arial Unicode MS" w:cs="Arial Unicode MS"/>
-        </w:rPr>
-        <w:t>4.1 IF-V1 STATE 패킷 — struct '!BBBHdffB' (22B) + HMAC 32B = 54B</w:t>
+        <w:t>4.1 IF-V1 STATE 패킷 — struct '!BBBHdBxBxffxxx' (28B) + HMAC 32B = 60B (도메인 섹션 + reserved)</w:t>
       </w:r>
     </w:p>
     <w:tbl>
@@ -10188,18 +10225,7 @@
             <w:vAlign w:val="center"/>
           </w:tcPr>
           <w:p>
-            <w:pPr>
-              <w:jc w:val="center"/>
-            </w:pPr>
-            <w:r>
-              <w:rPr>
-                <w:rFonts w:eastAsia="Arial"/>
-                <w:b/>
-                <w:bCs/>
-                <w:color w:val="2E75B6"/>
-                <w:sz w:val="18"/>
-                <w:szCs w:val="18"/>
-              </w:rPr>
+            <w:r>
               <w:t>0</w:t>
             </w:r>
           </w:p>
@@ -10223,16 +10249,7 @@
             <w:vAlign w:val="center"/>
           </w:tcPr>
           <w:p>
-            <w:pPr>
-              <w:jc w:val="center"/>
-            </w:pPr>
-            <w:r>
-              <w:rPr>
-                <w:rFonts w:ascii="Arial Unicode MS" w:eastAsia="Arial Unicode MS" w:hAnsi="Arial Unicode MS" w:cs="Arial Unicode MS"/>
-                <w:color w:val="000000"/>
-                <w:sz w:val="18"/>
-                <w:szCs w:val="18"/>
-              </w:rPr>
+            <w:r>
               <w:t>ver</w:t>
             </w:r>
           </w:p>
@@ -10257,14 +10274,6 @@
           </w:tcPr>
           <w:p>
             <w:r>
-              <w:rPr>
-                <w:rFonts w:ascii="Arial Unicode MS" w:eastAsia="Arial Unicode MS" w:hAnsi="Arial Unicode MS" w:cs="Arial Unicode MS"/>
-                <w:b/>
-                <w:bCs/>
-                <w:color w:val="000000"/>
-                <w:sz w:val="18"/>
-                <w:szCs w:val="18"/>
-              </w:rPr>
               <w:t>B</w:t>
             </w:r>
           </w:p>
@@ -10289,12 +10298,6 @@
           </w:tcPr>
           <w:p>
             <w:r>
-              <w:rPr>
-                <w:rFonts w:ascii="Arial Unicode MS" w:eastAsia="Arial Unicode MS" w:hAnsi="Arial Unicode MS" w:cs="Arial Unicode MS"/>
-                <w:color w:val="000000"/>
-                <w:sz w:val="18"/>
-                <w:szCs w:val="18"/>
-              </w:rPr>
               <w:t>1</w:t>
             </w:r>
           </w:p>
@@ -10318,16 +10321,7 @@
             <w:vAlign w:val="center"/>
           </w:tcPr>
           <w:p>
-            <w:pPr>
-              <w:jc w:val="center"/>
-            </w:pPr>
-            <w:r>
-              <w:rPr>
-                <w:rFonts w:eastAsia="Arial"/>
-                <w:color w:val="000000"/>
-                <w:sz w:val="18"/>
-                <w:szCs w:val="18"/>
-              </w:rPr>
+            <w:r>
               <w:t>-</w:t>
             </w:r>
           </w:p>
@@ -10351,16 +10345,7 @@
             <w:vAlign w:val="center"/>
           </w:tcPr>
           <w:p>
-            <w:pPr>
-              <w:jc w:val="center"/>
-            </w:pPr>
-            <w:r>
-              <w:rPr>
-                <w:rFonts w:ascii="Arial Unicode MS" w:eastAsia="Arial Unicode MS" w:hAnsi="Arial Unicode MS" w:cs="Arial Unicode MS"/>
-                <w:color w:val="C00000"/>
-                <w:sz w:val="18"/>
-                <w:szCs w:val="18"/>
-              </w:rPr>
+            <w:r>
               <w:t>프로토콜 버전 = 1 (구조 변경 시 증가)</w:t>
             </w:r>
           </w:p>
@@ -10386,18 +10371,7 @@
             <w:vAlign w:val="center"/>
           </w:tcPr>
           <w:p>
-            <w:pPr>
-              <w:jc w:val="center"/>
-            </w:pPr>
-            <w:r>
-              <w:rPr>
-                <w:rFonts w:eastAsia="Arial"/>
-                <w:b/>
-                <w:bCs/>
-                <w:color w:val="2E75B6"/>
-                <w:sz w:val="18"/>
-                <w:szCs w:val="18"/>
-              </w:rPr>
+            <w:r>
               <w:t>1</w:t>
             </w:r>
           </w:p>
@@ -10421,16 +10395,7 @@
             <w:vAlign w:val="center"/>
           </w:tcPr>
           <w:p>
-            <w:pPr>
-              <w:jc w:val="center"/>
-            </w:pPr>
-            <w:r>
-              <w:rPr>
-                <w:rFonts w:ascii="Arial Unicode MS" w:eastAsia="Arial Unicode MS" w:hAnsi="Arial Unicode MS" w:cs="Arial Unicode MS"/>
-                <w:color w:val="000000"/>
-                <w:sz w:val="18"/>
-                <w:szCs w:val="18"/>
-              </w:rPr>
+            <w:r>
               <w:t>type</w:t>
             </w:r>
           </w:p>
@@ -10455,14 +10420,6 @@
           </w:tcPr>
           <w:p>
             <w:r>
-              <w:rPr>
-                <w:rFonts w:ascii="Arial Unicode MS" w:eastAsia="Arial Unicode MS" w:hAnsi="Arial Unicode MS" w:cs="Arial Unicode MS"/>
-                <w:b/>
-                <w:bCs/>
-                <w:color w:val="000000"/>
-                <w:sz w:val="18"/>
-                <w:szCs w:val="18"/>
-              </w:rPr>
               <w:t>B</w:t>
             </w:r>
           </w:p>
@@ -10487,12 +10444,6 @@
           </w:tcPr>
           <w:p>
             <w:r>
-              <w:rPr>
-                <w:rFonts w:ascii="맑은 고딕" w:eastAsia="맑은 고딕" w:hAnsi="맑은 고딕" w:cs="맑은 고딕" w:hint="eastAsia"/>
-                <w:color w:val="000000"/>
-                <w:sz w:val="18"/>
-                <w:szCs w:val="18"/>
-              </w:rPr>
               <w:t>1</w:t>
             </w:r>
           </w:p>
@@ -10516,16 +10467,7 @@
             <w:vAlign w:val="center"/>
           </w:tcPr>
           <w:p>
-            <w:pPr>
-              <w:jc w:val="center"/>
-            </w:pPr>
-            <w:r>
-              <w:rPr>
-                <w:rFonts w:eastAsia="Arial"/>
-                <w:color w:val="000000"/>
-                <w:sz w:val="18"/>
-                <w:szCs w:val="18"/>
-              </w:rPr>
+            <w:r>
               <w:t>-</w:t>
             </w:r>
           </w:p>
@@ -10549,16 +10491,7 @@
             <w:vAlign w:val="center"/>
           </w:tcPr>
           <w:p>
-            <w:pPr>
-              <w:jc w:val="center"/>
-            </w:pPr>
-            <w:r>
-              <w:rPr>
-                <w:rFonts w:ascii="Arial Unicode MS" w:eastAsia="Arial Unicode MS" w:hAnsi="Arial Unicode MS" w:cs="Arial Unicode MS"/>
-                <w:color w:val="C00000"/>
-                <w:sz w:val="18"/>
-                <w:szCs w:val="18"/>
-              </w:rPr>
+            <w:r>
               <w:t>1=STATE, 2=EVENT</w:t>
             </w:r>
           </w:p>
@@ -10584,18 +10517,7 @@
             <w:vAlign w:val="center"/>
           </w:tcPr>
           <w:p>
-            <w:pPr>
-              <w:jc w:val="center"/>
-            </w:pPr>
-            <w:r>
-              <w:rPr>
-                <w:rFonts w:eastAsia="Arial"/>
-                <w:b/>
-                <w:bCs/>
-                <w:color w:val="2E75B6"/>
-                <w:sz w:val="18"/>
-                <w:szCs w:val="18"/>
-              </w:rPr>
+            <w:r>
               <w:t>2</w:t>
             </w:r>
           </w:p>
@@ -10619,16 +10541,7 @@
             <w:vAlign w:val="center"/>
           </w:tcPr>
           <w:p>
-            <w:pPr>
-              <w:jc w:val="center"/>
-            </w:pPr>
-            <w:r>
-              <w:rPr>
-                <w:rFonts w:ascii="Arial Unicode MS" w:eastAsia="Arial Unicode MS" w:hAnsi="Arial Unicode MS" w:cs="Arial Unicode MS"/>
-                <w:color w:val="000000"/>
-                <w:sz w:val="18"/>
-                <w:szCs w:val="18"/>
-              </w:rPr>
+            <w:r>
               <w:t>role</w:t>
             </w:r>
           </w:p>
@@ -10653,14 +10566,6 @@
           </w:tcPr>
           <w:p>
             <w:r>
-              <w:rPr>
-                <w:rFonts w:ascii="Arial Unicode MS" w:eastAsia="Arial Unicode MS" w:hAnsi="Arial Unicode MS" w:cs="Arial Unicode MS"/>
-                <w:b/>
-                <w:bCs/>
-                <w:color w:val="000000"/>
-                <w:sz w:val="18"/>
-                <w:szCs w:val="18"/>
-              </w:rPr>
               <w:t>B</w:t>
             </w:r>
           </w:p>
@@ -10684,25 +10589,10 @@
             <w:vAlign w:val="center"/>
           </w:tcPr>
           <w:p>
-            <w:pPr>
-              <w:rPr>
-                <w:rFonts w:ascii="Arial Unicode MS" w:hAnsi="Arial Unicode MS" w:cs="Arial Unicode MS" w:hint="eastAsia"/>
-                <w:color w:val="000000"/>
-                <w:sz w:val="18"/>
-                <w:szCs w:val="18"/>
-              </w:rPr>
-            </w:pPr>
-            <w:r>
-              <w:rPr>
-                <w:rFonts w:ascii="Arial Unicode MS" w:eastAsia="Arial Unicode MS" w:hAnsi="Arial Unicode MS" w:cs="Arial Unicode MS"/>
-                <w:color w:val="000000"/>
-                <w:sz w:val="18"/>
-                <w:szCs w:val="18"/>
-              </w:rPr>
+            <w:r>
               <w:t>1</w:t>
             </w:r>
           </w:p>
-          <w:p/>
         </w:tc>
         <w:tc>
           <w:tcPr>
@@ -10723,16 +10613,7 @@
             <w:vAlign w:val="center"/>
           </w:tcPr>
           <w:p>
-            <w:pPr>
-              <w:jc w:val="center"/>
-            </w:pPr>
-            <w:r>
-              <w:rPr>
-                <w:rFonts w:ascii="Arial Unicode MS" w:eastAsia="Arial Unicode MS" w:hAnsi="Arial Unicode MS" w:cs="Arial Unicode MS"/>
-                <w:color w:val="000000"/>
-                <w:sz w:val="18"/>
-                <w:szCs w:val="18"/>
-              </w:rPr>
+            <w:r>
               <w:t>-</w:t>
             </w:r>
           </w:p>
@@ -10756,16 +10637,7 @@
             <w:vAlign w:val="center"/>
           </w:tcPr>
           <w:p>
-            <w:pPr>
-              <w:jc w:val="center"/>
-            </w:pPr>
-            <w:r>
-              <w:rPr>
-                <w:rFonts w:ascii="Arial Unicode MS" w:eastAsia="Arial Unicode MS" w:hAnsi="Arial Unicode MS" w:cs="Arial Unicode MS"/>
-                <w:color w:val="C00000"/>
-                <w:sz w:val="18"/>
-                <w:szCs w:val="18"/>
-              </w:rPr>
+            <w:r>
               <w:t>송신 시점 역할 (1=선행, 2=후행)</w:t>
             </w:r>
           </w:p>
@@ -10791,18 +10663,7 @@
             <w:vAlign w:val="center"/>
           </w:tcPr>
           <w:p>
-            <w:pPr>
-              <w:jc w:val="center"/>
-            </w:pPr>
-            <w:r>
-              <w:rPr>
-                <w:rFonts w:eastAsia="Arial"/>
-                <w:b/>
-                <w:bCs/>
-                <w:color w:val="2E75B6"/>
-                <w:sz w:val="18"/>
-                <w:szCs w:val="18"/>
-              </w:rPr>
+            <w:r>
               <w:t>3</w:t>
             </w:r>
           </w:p>
@@ -10826,16 +10687,7 @@
             <w:vAlign w:val="center"/>
           </w:tcPr>
           <w:p>
-            <w:pPr>
-              <w:jc w:val="center"/>
-            </w:pPr>
-            <w:r>
-              <w:rPr>
-                <w:rFonts w:ascii="Arial Unicode MS" w:eastAsia="Arial Unicode MS" w:hAnsi="Arial Unicode MS" w:cs="Arial Unicode MS"/>
-                <w:color w:val="000000"/>
-                <w:sz w:val="18"/>
-                <w:szCs w:val="18"/>
-              </w:rPr>
+            <w:r>
               <w:t>seq</w:t>
             </w:r>
           </w:p>
@@ -10860,14 +10712,6 @@
           </w:tcPr>
           <w:p>
             <w:r>
-              <w:rPr>
-                <w:rFonts w:ascii="Arial Unicode MS" w:eastAsia="Arial Unicode MS" w:hAnsi="Arial Unicode MS" w:cs="Arial Unicode MS"/>
-                <w:b/>
-                <w:bCs/>
-                <w:color w:val="000000"/>
-                <w:sz w:val="18"/>
-                <w:szCs w:val="18"/>
-              </w:rPr>
               <w:t>H</w:t>
             </w:r>
           </w:p>
@@ -10891,25 +10735,10 @@
             <w:vAlign w:val="center"/>
           </w:tcPr>
           <w:p>
-            <w:pPr>
-              <w:rPr>
-                <w:rFonts w:ascii="Arial Unicode MS" w:hAnsi="Arial Unicode MS" w:cs="Arial Unicode MS" w:hint="eastAsia"/>
-                <w:color w:val="000000"/>
-                <w:sz w:val="18"/>
-                <w:szCs w:val="18"/>
-              </w:rPr>
-            </w:pPr>
-            <w:r>
-              <w:rPr>
-                <w:rFonts w:ascii="Arial Unicode MS" w:eastAsia="Arial Unicode MS" w:hAnsi="Arial Unicode MS" w:cs="Arial Unicode MS"/>
-                <w:color w:val="000000"/>
-                <w:sz w:val="18"/>
-                <w:szCs w:val="18"/>
-              </w:rPr>
+            <w:r>
               <w:t>2</w:t>
             </w:r>
           </w:p>
-          <w:p/>
         </w:tc>
         <w:tc>
           <w:tcPr>
@@ -10930,16 +10759,7 @@
             <w:vAlign w:val="center"/>
           </w:tcPr>
           <w:p>
-            <w:pPr>
-              <w:jc w:val="center"/>
-            </w:pPr>
-            <w:r>
-              <w:rPr>
-                <w:rFonts w:ascii="Arial Unicode MS" w:eastAsia="Arial Unicode MS" w:hAnsi="Arial Unicode MS" w:cs="Arial Unicode MS"/>
-                <w:color w:val="000000"/>
-                <w:sz w:val="18"/>
-                <w:szCs w:val="18"/>
-              </w:rPr>
+            <w:r>
               <w:t>-</w:t>
             </w:r>
           </w:p>
@@ -10963,16 +10783,7 @@
             <w:vAlign w:val="center"/>
           </w:tcPr>
           <w:p>
-            <w:pPr>
-              <w:jc w:val="center"/>
-            </w:pPr>
-            <w:r>
-              <w:rPr>
-                <w:rFonts w:ascii="Arial Unicode MS" w:eastAsia="Arial Unicode MS" w:hAnsi="Arial Unicode MS" w:cs="Arial Unicode MS"/>
-                <w:color w:val="C00000"/>
-                <w:sz w:val="18"/>
-                <w:szCs w:val="18"/>
-              </w:rPr>
+            <w:r>
               <w:t>단조 증가 일련번호 (65536 랩어라운드)</w:t>
             </w:r>
           </w:p>
@@ -10998,18 +10809,7 @@
             <w:vAlign w:val="center"/>
           </w:tcPr>
           <w:p>
-            <w:pPr>
-              <w:jc w:val="center"/>
-            </w:pPr>
-            <w:r>
-              <w:rPr>
-                <w:rFonts w:eastAsia="Arial"/>
-                <w:b/>
-                <w:bCs/>
-                <w:color w:val="2E75B6"/>
-                <w:sz w:val="18"/>
-                <w:szCs w:val="18"/>
-              </w:rPr>
+            <w:r>
               <w:t>5</w:t>
             </w:r>
           </w:p>
@@ -11033,17 +10833,8 @@
             <w:vAlign w:val="center"/>
           </w:tcPr>
           <w:p>
-            <w:pPr>
-              <w:jc w:val="center"/>
-            </w:pPr>
-            <w:r>
-              <w:rPr>
-                <w:rFonts w:ascii="Arial Unicode MS" w:eastAsia="Arial Unicode MS" w:hAnsi="Arial Unicode MS" w:cs="Arial Unicode MS"/>
-                <w:color w:val="000000"/>
-                <w:sz w:val="18"/>
-                <w:szCs w:val="18"/>
-              </w:rPr>
-              <w:t>t</w:t>
+            <w:r>
+              <w:t>t_tx</w:t>
             </w:r>
           </w:p>
         </w:tc>
@@ -11067,14 +10858,6 @@
           </w:tcPr>
           <w:p>
             <w:r>
-              <w:rPr>
-                <w:rFonts w:ascii="Arial Unicode MS" w:eastAsia="Arial Unicode MS" w:hAnsi="Arial Unicode MS" w:cs="Arial Unicode MS"/>
-                <w:b/>
-                <w:bCs/>
-                <w:color w:val="000000"/>
-                <w:sz w:val="18"/>
-                <w:szCs w:val="18"/>
-              </w:rPr>
               <w:t>d</w:t>
             </w:r>
           </w:p>
@@ -11099,12 +10882,6 @@
           </w:tcPr>
           <w:p>
             <w:r>
-              <w:rPr>
-                <w:rFonts w:ascii="Arial Unicode MS" w:eastAsia="Arial Unicode MS" w:hAnsi="Arial Unicode MS" w:cs="Arial Unicode MS"/>
-                <w:color w:val="000000"/>
-                <w:sz w:val="18"/>
-                <w:szCs w:val="18"/>
-              </w:rPr>
               <w:t>8</w:t>
             </w:r>
           </w:p>
@@ -11128,16 +10905,7 @@
             <w:vAlign w:val="center"/>
           </w:tcPr>
           <w:p>
-            <w:pPr>
-              <w:jc w:val="center"/>
-            </w:pPr>
-            <w:r>
-              <w:rPr>
-                <w:rFonts w:eastAsia="Arial"/>
-                <w:color w:val="000000"/>
-                <w:sz w:val="18"/>
-                <w:szCs w:val="18"/>
-              </w:rPr>
+            <w:r>
               <w:t>s</w:t>
             </w:r>
           </w:p>
@@ -11161,16 +10929,7 @@
             <w:vAlign w:val="center"/>
           </w:tcPr>
           <w:p>
-            <w:pPr>
-              <w:jc w:val="center"/>
-            </w:pPr>
-            <w:r>
-              <w:rPr>
-                <w:rFonts w:ascii="Arial Unicode MS" w:eastAsia="Arial Unicode MS" w:hAnsi="Arial Unicode MS" w:cs="Arial Unicode MS"/>
-                <w:color w:val="C00000"/>
-                <w:sz w:val="18"/>
-                <w:szCs w:val="18"/>
-              </w:rPr>
+            <w:r>
               <w:t>송신 단조 시각</w:t>
             </w:r>
           </w:p>
@@ -11196,18 +10955,7 @@
             <w:vAlign w:val="center"/>
           </w:tcPr>
           <w:p>
-            <w:pPr>
-              <w:jc w:val="center"/>
-            </w:pPr>
-            <w:r>
-              <w:rPr>
-                <w:rFonts w:eastAsia="Arial"/>
-                <w:b/>
-                <w:bCs/>
-                <w:color w:val="2E75B6"/>
-                <w:sz w:val="18"/>
-                <w:szCs w:val="18"/>
-              </w:rPr>
+            <w:r>
               <w:t>13</w:t>
             </w:r>
           </w:p>
@@ -11231,17 +10979,8 @@
             <w:vAlign w:val="center"/>
           </w:tcPr>
           <w:p>
-            <w:pPr>
-              <w:jc w:val="center"/>
-            </w:pPr>
-            <w:r>
-              <w:rPr>
-                <w:rFonts w:ascii="Arial Unicode MS" w:eastAsia="Arial Unicode MS" w:hAnsi="Arial Unicode MS" w:cs="Arial Unicode MS"/>
-                <w:color w:val="000000"/>
-                <w:sz w:val="18"/>
-                <w:szCs w:val="18"/>
-              </w:rPr>
-              <w:t>throttle_pwm</w:t>
+            <w:r>
+              <w:t>current_lane</w:t>
             </w:r>
           </w:p>
         </w:tc>
@@ -11265,15 +11004,7 @@
           </w:tcPr>
           <w:p>
             <w:r>
-              <w:rPr>
-                <w:rFonts w:ascii="Arial Unicode MS" w:eastAsia="Arial Unicode MS" w:hAnsi="Arial Unicode MS" w:cs="Arial Unicode MS"/>
-                <w:b/>
-                <w:bCs/>
-                <w:color w:val="000000"/>
-                <w:sz w:val="18"/>
-                <w:szCs w:val="18"/>
-              </w:rPr>
-              <w:t>f</w:t>
+              <w:t>B</w:t>
             </w:r>
           </w:p>
         </w:tc>
@@ -11297,13 +11028,7 @@
           </w:tcPr>
           <w:p>
             <w:r>
-              <w:rPr>
-                <w:rFonts w:ascii="Arial Unicode MS" w:eastAsia="Arial Unicode MS" w:hAnsi="Arial Unicode MS" w:cs="Arial Unicode MS"/>
-                <w:color w:val="000000"/>
-                <w:sz w:val="18"/>
-                <w:szCs w:val="18"/>
-              </w:rPr>
-              <w:t>4</w:t>
+              <w:t>1</w:t>
             </w:r>
           </w:p>
         </w:tc>
@@ -11326,17 +11051,8 @@
             <w:vAlign w:val="center"/>
           </w:tcPr>
           <w:p>
-            <w:pPr>
-              <w:jc w:val="center"/>
-            </w:pPr>
-            <w:r>
-              <w:rPr>
-                <w:rFonts w:eastAsia="Arial"/>
-                <w:color w:val="000000"/>
-                <w:sz w:val="18"/>
-                <w:szCs w:val="18"/>
-              </w:rPr>
-              <w:t>duty</w:t>
+            <w:r>
+              <w:t>-</w:t>
             </w:r>
           </w:p>
         </w:tc>
@@ -11359,17 +11075,8 @@
             <w:vAlign w:val="center"/>
           </w:tcPr>
           <w:p>
-            <w:pPr>
-              <w:jc w:val="center"/>
-            </w:pPr>
-            <w:r>
-              <w:rPr>
-                <w:rFonts w:ascii="Arial Unicode MS" w:eastAsia="Arial Unicode MS" w:hAnsi="Arial Unicode MS" w:cs="Arial Unicode MS"/>
-                <w:color w:val="C00000"/>
-                <w:sz w:val="18"/>
-                <w:szCs w:val="18"/>
-              </w:rPr>
-              <w:t>구동 PWM 듀티 -1~1, 부호=방향 (DC모터, 정확)</w:t>
+            <w:r>
+              <w:t>현재 차로 (1·2, 0=미확정) — 인지 영역</w:t>
             </w:r>
           </w:p>
         </w:tc>
@@ -11394,19 +11101,8 @@
             <w:vAlign w:val="center"/>
           </w:tcPr>
           <w:p>
-            <w:pPr>
-              <w:jc w:val="center"/>
-            </w:pPr>
-            <w:r>
-              <w:rPr>
-                <w:rFonts w:eastAsia="Arial"/>
-                <w:b/>
-                <w:bCs/>
-                <w:color w:val="2E75B6"/>
-                <w:sz w:val="18"/>
-                <w:szCs w:val="18"/>
-              </w:rPr>
-              <w:t>17</w:t>
+            <w:r>
+              <w:t>14</w:t>
             </w:r>
           </w:p>
         </w:tc>
@@ -11429,17 +11125,8 @@
             <w:vAlign w:val="center"/>
           </w:tcPr>
           <w:p>
-            <w:pPr>
-              <w:jc w:val="center"/>
-            </w:pPr>
-            <w:r>
-              <w:rPr>
-                <w:rFonts w:ascii="Arial Unicode MS" w:eastAsia="Arial Unicode MS" w:hAnsi="Arial Unicode MS" w:cs="Arial Unicode MS"/>
-                <w:color w:val="000000"/>
-                <w:sz w:val="18"/>
-                <w:szCs w:val="18"/>
-              </w:rPr>
-              <w:t>steer_pwm</w:t>
+            <w:r>
+              <w:t>(reserved)</w:t>
             </w:r>
           </w:p>
         </w:tc>
@@ -11463,15 +11150,7 @@
           </w:tcPr>
           <w:p>
             <w:r>
-              <w:rPr>
-                <w:rFonts w:ascii="Arial Unicode MS" w:eastAsia="Arial Unicode MS" w:hAnsi="Arial Unicode MS" w:cs="Arial Unicode MS"/>
-                <w:b/>
-                <w:bCs/>
-                <w:color w:val="000000"/>
-                <w:sz w:val="18"/>
-                <w:szCs w:val="18"/>
-              </w:rPr>
-              <w:t>f</w:t>
+              <w:t>x</w:t>
             </w:r>
           </w:p>
         </w:tc>
@@ -11495,13 +11174,7 @@
           </w:tcPr>
           <w:p>
             <w:r>
-              <w:rPr>
-                <w:rFonts w:ascii="Arial Unicode MS" w:eastAsia="Arial Unicode MS" w:hAnsi="Arial Unicode MS" w:cs="Arial Unicode MS"/>
-                <w:color w:val="000000"/>
-                <w:sz w:val="18"/>
-                <w:szCs w:val="18"/>
-              </w:rPr>
-              <w:t>4</w:t>
+              <w:t>1</w:t>
             </w:r>
           </w:p>
         </w:tc>
@@ -11524,17 +11197,8 @@
             <w:vAlign w:val="center"/>
           </w:tcPr>
           <w:p>
-            <w:pPr>
-              <w:jc w:val="center"/>
-            </w:pPr>
-            <w:r>
-              <w:rPr>
-                <w:rFonts w:ascii="Arial Unicode MS" w:eastAsia="Arial Unicode MS" w:hAnsi="Arial Unicode MS" w:cs="Arial Unicode MS"/>
-                <w:color w:val="000000"/>
-                <w:sz w:val="18"/>
-                <w:szCs w:val="18"/>
-              </w:rPr>
-              <w:t>정규화</w:t>
+            <w:r>
+              <w:t>-</w:t>
             </w:r>
           </w:p>
         </w:tc>
@@ -11557,17 +11221,8 @@
             <w:vAlign w:val="center"/>
           </w:tcPr>
           <w:p>
-            <w:pPr>
-              <w:jc w:val="center"/>
-            </w:pPr>
-            <w:r>
-              <w:rPr>
-                <w:rFonts w:ascii="Arial Unicode MS" w:eastAsia="Arial Unicode MS" w:hAnsi="Arial Unicode MS" w:cs="Arial Unicode MS"/>
-                <w:color w:val="C00000"/>
-                <w:sz w:val="18"/>
-                <w:szCs w:val="18"/>
-              </w:rPr>
-              <w:t>조향 PWM -1~1 (서보, 정확)</w:t>
+            <w:r>
+              <w:t>인지 예비 (송신 0·수신 무시)</w:t>
             </w:r>
           </w:p>
         </w:tc>
@@ -11592,180 +11247,438 @@
             <w:vAlign w:val="center"/>
           </w:tcPr>
           <w:p>
-            <w:pPr>
-              <w:jc w:val="center"/>
-            </w:pPr>
-            <w:r>
-              <w:rPr>
-                <w:rFonts w:eastAsia="Arial"/>
-                <w:b/>
-                <w:bCs/>
-                <w:color w:val="2E75B6"/>
-                <w:sz w:val="18"/>
-                <w:szCs w:val="18"/>
-              </w:rPr>
+            <w:r>
+              <w:t>15</w:t>
+            </w:r>
+          </w:p>
+        </w:tc>
+        <w:tc>
+          <w:tcPr>
+            <w:tcW w:w="2214" w:type="dxa"/>
+            <w:tcBorders>
+              <w:top w:val="single" w:sz="4" w:space="0" w:color="CCCCCC"/>
+              <w:left w:val="single" w:sz="4" w:space="0" w:color="CCCCCC"/>
+              <w:bottom w:val="single" w:sz="4" w:space="0" w:color="CCCCCC"/>
+              <w:right w:val="single" w:sz="4" w:space="0" w:color="CCCCCC"/>
+            </w:tcBorders>
+            <w:shd w:val="clear" w:color="auto" w:fill="DEEAF1"/>
+            <w:tcMar>
+              <w:top w:w="60" w:type="dxa"/>
+              <w:left w:w="140" w:type="dxa"/>
+              <w:bottom w:w="60" w:type="dxa"/>
+              <w:right w:w="140" w:type="dxa"/>
+            </w:tcMar>
+            <w:vAlign w:val="center"/>
+          </w:tcPr>
+          <w:p>
+            <w:r>
+              <w:t>behavior</w:t>
+            </w:r>
+          </w:p>
+        </w:tc>
+        <w:tc>
+          <w:tcPr>
+            <w:tcW w:w="986" w:type="dxa"/>
+            <w:tcBorders>
+              <w:top w:val="single" w:sz="4" w:space="0" w:color="CCCCCC"/>
+              <w:left w:val="single" w:sz="4" w:space="0" w:color="CCCCCC"/>
+              <w:bottom w:val="single" w:sz="4" w:space="0" w:color="CCCCCC"/>
+              <w:right w:val="single" w:sz="4" w:space="0" w:color="CCCCCC"/>
+            </w:tcBorders>
+            <w:shd w:val="clear" w:color="auto" w:fill="DEEAF1"/>
+            <w:tcMar>
+              <w:top w:w="60" w:type="dxa"/>
+              <w:left w:w="140" w:type="dxa"/>
+              <w:bottom w:w="60" w:type="dxa"/>
+              <w:right w:w="140" w:type="dxa"/>
+            </w:tcMar>
+            <w:vAlign w:val="center"/>
+          </w:tcPr>
+          <w:p>
+            <w:r>
+              <w:t>B</w:t>
+            </w:r>
+          </w:p>
+        </w:tc>
+        <w:tc>
+          <w:tcPr>
+            <w:tcW w:w="2426" w:type="dxa"/>
+            <w:tcBorders>
+              <w:top w:val="single" w:sz="4" w:space="0" w:color="CCCCCC"/>
+              <w:left w:val="single" w:sz="4" w:space="0" w:color="CCCCCC"/>
+              <w:bottom w:val="single" w:sz="4" w:space="0" w:color="CCCCCC"/>
+              <w:right w:val="single" w:sz="4" w:space="0" w:color="CCCCCC"/>
+            </w:tcBorders>
+            <w:shd w:val="clear" w:color="auto" w:fill="DEEAF1"/>
+            <w:tcMar>
+              <w:top w:w="60" w:type="dxa"/>
+              <w:left w:w="140" w:type="dxa"/>
+              <w:bottom w:w="60" w:type="dxa"/>
+              <w:right w:w="140" w:type="dxa"/>
+            </w:tcMar>
+            <w:vAlign w:val="center"/>
+          </w:tcPr>
+          <w:p>
+            <w:r>
+              <w:t>1</w:t>
+            </w:r>
+          </w:p>
+        </w:tc>
+        <w:tc>
+          <w:tcPr>
+            <w:tcW w:w="1200" w:type="dxa"/>
+            <w:tcBorders>
+              <w:top w:val="single" w:sz="4" w:space="0" w:color="CCCCCC"/>
+              <w:left w:val="single" w:sz="4" w:space="0" w:color="CCCCCC"/>
+              <w:bottom w:val="single" w:sz="4" w:space="0" w:color="CCCCCC"/>
+              <w:right w:val="single" w:sz="4" w:space="0" w:color="CCCCCC"/>
+            </w:tcBorders>
+            <w:shd w:val="clear" w:color="auto" w:fill="DEEAF1"/>
+            <w:tcMar>
+              <w:top w:w="60" w:type="dxa"/>
+              <w:left w:w="140" w:type="dxa"/>
+              <w:bottom w:w="60" w:type="dxa"/>
+              <w:right w:w="140" w:type="dxa"/>
+            </w:tcMar>
+            <w:vAlign w:val="center"/>
+          </w:tcPr>
+          <w:p>
+            <w:r>
+              <w:t>-</w:t>
+            </w:r>
+          </w:p>
+        </w:tc>
+        <w:tc>
+          <w:tcPr>
+            <w:tcW w:w="1300" w:type="dxa"/>
+            <w:tcBorders>
+              <w:top w:val="single" w:sz="4" w:space="0" w:color="CCCCCC"/>
+              <w:left w:val="single" w:sz="4" w:space="0" w:color="CCCCCC"/>
+              <w:bottom w:val="single" w:sz="4" w:space="0" w:color="CCCCCC"/>
+              <w:right w:val="single" w:sz="4" w:space="0" w:color="CCCCCC"/>
+            </w:tcBorders>
+            <w:shd w:val="clear" w:color="auto" w:fill="DEEAF1"/>
+            <w:tcMar>
+              <w:top w:w="60" w:type="dxa"/>
+              <w:left w:w="140" w:type="dxa"/>
+              <w:bottom w:w="60" w:type="dxa"/>
+              <w:right w:w="140" w:type="dxa"/>
+            </w:tcMar>
+            <w:vAlign w:val="center"/>
+          </w:tcPr>
+          <w:p>
+            <w:r>
+              <w:t>기동 enum (IF-B2와 동일) — 판단 영역</w:t>
+            </w:r>
+          </w:p>
+        </w:tc>
+      </w:tr>
+      <w:tr>
+        <w:tc>
+          <w:tcPr>
+            <w:tcW w:type="dxa" w:w="900"/>
+          </w:tcPr>
+          <w:p>
+            <w:r>
+              <w:t>16</w:t>
+            </w:r>
+          </w:p>
+        </w:tc>
+        <w:tc>
+          <w:tcPr>
+            <w:tcW w:type="dxa" w:w="2214"/>
+          </w:tcPr>
+          <w:p>
+            <w:r>
+              <w:t>(reserved)</w:t>
+            </w:r>
+          </w:p>
+        </w:tc>
+        <w:tc>
+          <w:tcPr>
+            <w:tcW w:type="dxa" w:w="986"/>
+          </w:tcPr>
+          <w:p>
+            <w:r>
+              <w:t>x</w:t>
+            </w:r>
+          </w:p>
+        </w:tc>
+        <w:tc>
+          <w:tcPr>
+            <w:tcW w:type="dxa" w:w="2426"/>
+          </w:tcPr>
+          <w:p>
+            <w:r>
+              <w:t>1</w:t>
+            </w:r>
+          </w:p>
+        </w:tc>
+        <w:tc>
+          <w:tcPr>
+            <w:tcW w:type="dxa" w:w="1200"/>
+          </w:tcPr>
+          <w:p>
+            <w:r>
+              <w:t>-</w:t>
+            </w:r>
+          </w:p>
+        </w:tc>
+        <w:tc>
+          <w:tcPr>
+            <w:tcW w:type="dxa" w:w="1300"/>
+          </w:tcPr>
+          <w:p>
+            <w:r>
+              <w:t>판단 예비</w:t>
+            </w:r>
+          </w:p>
+        </w:tc>
+      </w:tr>
+      <w:tr>
+        <w:tc>
+          <w:tcPr>
+            <w:tcW w:type="dxa" w:w="900"/>
+          </w:tcPr>
+          <w:p>
+            <w:r>
+              <w:t>17</w:t>
+            </w:r>
+          </w:p>
+        </w:tc>
+        <w:tc>
+          <w:tcPr>
+            <w:tcW w:type="dxa" w:w="2214"/>
+          </w:tcPr>
+          <w:p>
+            <w:r>
+              <w:t>throttle_pwm</w:t>
+            </w:r>
+          </w:p>
+        </w:tc>
+        <w:tc>
+          <w:tcPr>
+            <w:tcW w:type="dxa" w:w="986"/>
+          </w:tcPr>
+          <w:p>
+            <w:r>
+              <w:t>f</w:t>
+            </w:r>
+          </w:p>
+        </w:tc>
+        <w:tc>
+          <w:tcPr>
+            <w:tcW w:type="dxa" w:w="2426"/>
+          </w:tcPr>
+          <w:p>
+            <w:r>
+              <w:t>4</w:t>
+            </w:r>
+          </w:p>
+        </w:tc>
+        <w:tc>
+          <w:tcPr>
+            <w:tcW w:type="dxa" w:w="1200"/>
+          </w:tcPr>
+          <w:p>
+            <w:r>
+              <w:t>duty</w:t>
+            </w:r>
+          </w:p>
+        </w:tc>
+        <w:tc>
+          <w:tcPr>
+            <w:tcW w:type="dxa" w:w="1300"/>
+          </w:tcPr>
+          <w:p>
+            <w:r>
+              <w:t>구동 PWM 듀티 -1~1, 부호=방향 (DC모터) — 모션 영역</w:t>
+            </w:r>
+          </w:p>
+        </w:tc>
+      </w:tr>
+      <w:tr>
+        <w:tc>
+          <w:tcPr>
+            <w:tcW w:type="dxa" w:w="900"/>
+          </w:tcPr>
+          <w:p>
+            <w:r>
               <w:t>21</w:t>
             </w:r>
           </w:p>
         </w:tc>
         <w:tc>
           <w:tcPr>
-            <w:tcW w:w="2214" w:type="dxa"/>
-            <w:tcBorders>
-              <w:top w:val="single" w:sz="4" w:space="0" w:color="CCCCCC"/>
-              <w:left w:val="single" w:sz="4" w:space="0" w:color="CCCCCC"/>
-              <w:bottom w:val="single" w:sz="4" w:space="0" w:color="CCCCCC"/>
-              <w:right w:val="single" w:sz="4" w:space="0" w:color="CCCCCC"/>
-            </w:tcBorders>
-            <w:shd w:val="clear" w:color="auto" w:fill="DEEAF1"/>
-            <w:tcMar>
-              <w:top w:w="60" w:type="dxa"/>
-              <w:left w:w="140" w:type="dxa"/>
-              <w:bottom w:w="60" w:type="dxa"/>
-              <w:right w:w="140" w:type="dxa"/>
-            </w:tcMar>
-            <w:vAlign w:val="center"/>
-          </w:tcPr>
-          <w:p>
-            <w:pPr>
-              <w:jc w:val="center"/>
-            </w:pPr>
-            <w:r>
-              <w:rPr>
-                <w:rFonts w:ascii="Arial Unicode MS" w:eastAsia="Arial Unicode MS" w:hAnsi="Arial Unicode MS" w:cs="Arial Unicode MS"/>
-                <w:color w:val="000000"/>
-                <w:sz w:val="18"/>
-                <w:szCs w:val="18"/>
-              </w:rPr>
-              <w:t>behavior</w:t>
-            </w:r>
-          </w:p>
-        </w:tc>
-        <w:tc>
-          <w:tcPr>
-            <w:tcW w:w="986" w:type="dxa"/>
-            <w:tcBorders>
-              <w:top w:val="single" w:sz="4" w:space="0" w:color="CCCCCC"/>
-              <w:left w:val="single" w:sz="4" w:space="0" w:color="CCCCCC"/>
-              <w:bottom w:val="single" w:sz="4" w:space="0" w:color="CCCCCC"/>
-              <w:right w:val="single" w:sz="4" w:space="0" w:color="CCCCCC"/>
-            </w:tcBorders>
-            <w:shd w:val="clear" w:color="auto" w:fill="DEEAF1"/>
-            <w:tcMar>
-              <w:top w:w="60" w:type="dxa"/>
-              <w:left w:w="140" w:type="dxa"/>
-              <w:bottom w:w="60" w:type="dxa"/>
-              <w:right w:w="140" w:type="dxa"/>
-            </w:tcMar>
-            <w:vAlign w:val="center"/>
-          </w:tcPr>
-          <w:p>
-            <w:r>
-              <w:rPr>
-                <w:rFonts w:ascii="Arial Unicode MS" w:eastAsia="Arial Unicode MS" w:hAnsi="Arial Unicode MS" w:cs="Arial Unicode MS"/>
-                <w:b/>
-                <w:bCs/>
-                <w:color w:val="000000"/>
-                <w:sz w:val="18"/>
-                <w:szCs w:val="18"/>
-              </w:rPr>
-              <w:t>B</w:t>
-            </w:r>
-          </w:p>
-        </w:tc>
-        <w:tc>
-          <w:tcPr>
-            <w:tcW w:w="2426" w:type="dxa"/>
-            <w:tcBorders>
-              <w:top w:val="single" w:sz="4" w:space="0" w:color="CCCCCC"/>
-              <w:left w:val="single" w:sz="4" w:space="0" w:color="CCCCCC"/>
-              <w:bottom w:val="single" w:sz="4" w:space="0" w:color="CCCCCC"/>
-              <w:right w:val="single" w:sz="4" w:space="0" w:color="CCCCCC"/>
-            </w:tcBorders>
-            <w:shd w:val="clear" w:color="auto" w:fill="DEEAF1"/>
-            <w:tcMar>
-              <w:top w:w="60" w:type="dxa"/>
-              <w:left w:w="140" w:type="dxa"/>
-              <w:bottom w:w="60" w:type="dxa"/>
-              <w:right w:w="140" w:type="dxa"/>
-            </w:tcMar>
-            <w:vAlign w:val="center"/>
-          </w:tcPr>
-          <w:p>
-            <w:r>
-              <w:rPr>
-                <w:rFonts w:ascii="Arial Unicode MS" w:eastAsia="Arial Unicode MS" w:hAnsi="Arial Unicode MS" w:cs="Arial Unicode MS"/>
-                <w:color w:val="000000"/>
-                <w:sz w:val="18"/>
-                <w:szCs w:val="18"/>
-              </w:rPr>
+            <w:tcW w:type="dxa" w:w="2214"/>
+          </w:tcPr>
+          <w:p>
+            <w:r>
+              <w:t>steer_pwm</w:t>
+            </w:r>
+          </w:p>
+        </w:tc>
+        <w:tc>
+          <w:tcPr>
+            <w:tcW w:type="dxa" w:w="986"/>
+          </w:tcPr>
+          <w:p>
+            <w:r>
+              <w:t>f</w:t>
+            </w:r>
+          </w:p>
+        </w:tc>
+        <w:tc>
+          <w:tcPr>
+            <w:tcW w:type="dxa" w:w="2426"/>
+          </w:tcPr>
+          <w:p>
+            <w:r>
+              <w:t>4</w:t>
+            </w:r>
+          </w:p>
+        </w:tc>
+        <w:tc>
+          <w:tcPr>
+            <w:tcW w:type="dxa" w:w="1200"/>
+          </w:tcPr>
+          <w:p>
+            <w:r>
+              <w:t>정규화</w:t>
+            </w:r>
+          </w:p>
+        </w:tc>
+        <w:tc>
+          <w:tcPr>
+            <w:tcW w:type="dxa" w:w="1300"/>
+          </w:tcPr>
+          <w:p>
+            <w:r>
+              <w:t>조향 PWM -1~1 (서보)</w:t>
+            </w:r>
+          </w:p>
+        </w:tc>
+      </w:tr>
+      <w:tr>
+        <w:tc>
+          <w:tcPr>
+            <w:tcW w:type="dxa" w:w="900"/>
+          </w:tcPr>
+          <w:p>
+            <w:r>
+              <w:t>25</w:t>
+            </w:r>
+          </w:p>
+        </w:tc>
+        <w:tc>
+          <w:tcPr>
+            <w:tcW w:type="dxa" w:w="2214"/>
+          </w:tcPr>
+          <w:p>
+            <w:r>
+              <w:t>(reserved)</w:t>
+            </w:r>
+          </w:p>
+        </w:tc>
+        <w:tc>
+          <w:tcPr>
+            <w:tcW w:type="dxa" w:w="986"/>
+          </w:tcPr>
+          <w:p>
+            <w:r>
+              <w:t>x</w:t>
+            </w:r>
+          </w:p>
+        </w:tc>
+        <w:tc>
+          <w:tcPr>
+            <w:tcW w:type="dxa" w:w="2426"/>
+          </w:tcPr>
+          <w:p>
+            <w:r>
               <w:t>1</w:t>
             </w:r>
           </w:p>
         </w:tc>
         <w:tc>
           <w:tcPr>
-            <w:tcW w:w="1200" w:type="dxa"/>
-            <w:tcBorders>
-              <w:top w:val="single" w:sz="4" w:space="0" w:color="CCCCCC"/>
-              <w:left w:val="single" w:sz="4" w:space="0" w:color="CCCCCC"/>
-              <w:bottom w:val="single" w:sz="4" w:space="0" w:color="CCCCCC"/>
-              <w:right w:val="single" w:sz="4" w:space="0" w:color="CCCCCC"/>
-            </w:tcBorders>
-            <w:shd w:val="clear" w:color="auto" w:fill="DEEAF1"/>
-            <w:tcMar>
-              <w:top w:w="60" w:type="dxa"/>
-              <w:left w:w="140" w:type="dxa"/>
-              <w:bottom w:w="60" w:type="dxa"/>
-              <w:right w:w="140" w:type="dxa"/>
-            </w:tcMar>
-            <w:vAlign w:val="center"/>
-          </w:tcPr>
-          <w:p>
-            <w:pPr>
-              <w:jc w:val="center"/>
-            </w:pPr>
-            <w:r>
-              <w:rPr>
-                <w:rFonts w:eastAsia="Arial"/>
-                <w:color w:val="000000"/>
-                <w:sz w:val="18"/>
-                <w:szCs w:val="18"/>
-              </w:rPr>
+            <w:tcW w:type="dxa" w:w="1200"/>
+          </w:tcPr>
+          <w:p>
+            <w:r>
               <w:t>-</w:t>
             </w:r>
           </w:p>
         </w:tc>
         <w:tc>
           <w:tcPr>
-            <w:tcW w:w="1300" w:type="dxa"/>
-            <w:tcBorders>
-              <w:top w:val="single" w:sz="4" w:space="0" w:color="CCCCCC"/>
-              <w:left w:val="single" w:sz="4" w:space="0" w:color="CCCCCC"/>
-              <w:bottom w:val="single" w:sz="4" w:space="0" w:color="CCCCCC"/>
-              <w:right w:val="single" w:sz="4" w:space="0" w:color="CCCCCC"/>
-            </w:tcBorders>
-            <w:shd w:val="clear" w:color="auto" w:fill="DEEAF1"/>
-            <w:tcMar>
-              <w:top w:w="60" w:type="dxa"/>
-              <w:left w:w="140" w:type="dxa"/>
-              <w:bottom w:w="60" w:type="dxa"/>
-              <w:right w:w="140" w:type="dxa"/>
-            </w:tcMar>
-            <w:vAlign w:val="center"/>
-          </w:tcPr>
-          <w:p>
-            <w:pPr>
-              <w:jc w:val="center"/>
-            </w:pPr>
-            <w:r>
-              <w:rPr>
-                <w:rFonts w:ascii="Arial Unicode MS" w:eastAsia="Arial Unicode MS" w:hAnsi="Arial Unicode MS" w:cs="Arial Unicode MS"/>
-                <w:color w:val="C00000"/>
-                <w:sz w:val="18"/>
-                <w:szCs w:val="18"/>
-              </w:rPr>
-              <w:t>기동 enum (IF-B2와 동일)</w:t>
+            <w:tcW w:type="dxa" w:w="1300"/>
+          </w:tcPr>
+          <w:p>
+            <w:r>
+              <w:t>모션 예비</w:t>
+            </w:r>
+          </w:p>
+        </w:tc>
+      </w:tr>
+      <w:tr>
+        <w:tc>
+          <w:tcPr>
+            <w:tcW w:type="dxa" w:w="900"/>
+          </w:tcPr>
+          <w:p>
+            <w:r>
+              <w:t>26</w:t>
+            </w:r>
+          </w:p>
+        </w:tc>
+        <w:tc>
+          <w:tcPr>
+            <w:tcW w:type="dxa" w:w="2214"/>
+          </w:tcPr>
+          <w:p>
+            <w:r>
+              <w:t>(reserved)</w:t>
+            </w:r>
+          </w:p>
+        </w:tc>
+        <w:tc>
+          <w:tcPr>
+            <w:tcW w:type="dxa" w:w="986"/>
+          </w:tcPr>
+          <w:p>
+            <w:r>
+              <w:t>x</w:t>
+            </w:r>
+          </w:p>
+        </w:tc>
+        <w:tc>
+          <w:tcPr>
+            <w:tcW w:type="dxa" w:w="2426"/>
+          </w:tcPr>
+          <w:p>
+            <w:r>
+              <w:t>2</w:t>
+            </w:r>
+          </w:p>
+        </w:tc>
+        <w:tc>
+          <w:tcPr>
+            <w:tcW w:type="dxa" w:w="1200"/>
+          </w:tcPr>
+          <w:p>
+            <w:r>
+              <w:t>-</w:t>
+            </w:r>
+          </w:p>
+        </w:tc>
+        <w:tc>
+          <w:tcPr>
+            <w:tcW w:type="dxa" w:w="1300"/>
+          </w:tcPr>
+          <w:p>
+            <w:r>
+              <w:t>공통 확장 예비</w:t>
             </w:r>
           </w:p>
         </w:tc>

</xml_diff>

<commit_message>
docs(ICD): STATE 패킷 tx_abs(절대 송신시각) 반영
인터페이스명세서 패킷표(offset13 tx_abs uint32)·IF-B5·변경이력 v1.2 + 통신 아키텍처 PNG 12열 갱신
</commit_message>
<xml_diff>
--- a/docs/05_SWE.2_SW아키텍처/ICD-PLT-001_인터페이스명세서_v1.0.docx
+++ b/docs/05_SWE.2_SW아키텍처/ICD-PLT-001_인터페이스명세서_v1.0.docx
@@ -1554,6 +1554,58 @@
           <w:p>
             <w:r>
               <w:t>STATE 패킷 28B/60B 확장 — current_lane(인지 영역) 추가 + 도메인별 reserved (v2v.py·messages.py 동기)</w:t>
+            </w:r>
+          </w:p>
+        </w:tc>
+        <w:tc>
+          <w:tcPr>
+            <w:tcW w:type="dxa" w:w="1815"/>
+          </w:tcPr>
+          <w:p>
+            <w:r>
+              <w:t>변경</w:t>
+            </w:r>
+          </w:p>
+        </w:tc>
+      </w:tr>
+      <w:tr>
+        <w:tc>
+          <w:tcPr>
+            <w:tcW w:type="dxa" w:w="900"/>
+          </w:tcPr>
+          <w:p>
+            <w:r>
+              <w:t>1.2</w:t>
+            </w:r>
+          </w:p>
+        </w:tc>
+        <w:tc>
+          <w:tcPr>
+            <w:tcW w:type="dxa" w:w="1320"/>
+          </w:tcPr>
+          <w:p>
+            <w:r>
+              <w:t>2026-06-16</w:t>
+            </w:r>
+          </w:p>
+        </w:tc>
+        <w:tc>
+          <w:tcPr>
+            <w:tcW w:type="dxa" w:w="1380"/>
+          </w:tcPr>
+          <w:p>
+            <w:r>
+              <w:t>허지욱</w:t>
+            </w:r>
+          </w:p>
+        </w:tc>
+        <w:tc>
+          <w:tcPr>
+            <w:tcW w:type="dxa" w:w="3615"/>
+          </w:tcPr>
+          <w:p>
+            <w:r>
+              <w:t>STATE 패킷에 tx_abs(절대 송신시각, HH:mm:ss.fff=자정 기준 ms, uint32) 추가 — reserved 활용, 28B/60B 유지 (v2v.py·messages.py 동기)</w:t>
             </w:r>
           </w:p>
         </w:tc>
@@ -9244,6 +9296,58 @@
           </w:p>
         </w:tc>
       </w:tr>
+      <w:tr>
+        <w:tc>
+          <w:tcPr>
+            <w:tcW w:type="dxa" w:w="2122"/>
+          </w:tcPr>
+          <w:p>
+            <w:r>
+              <w:t>tx_abs</w:t>
+            </w:r>
+          </w:p>
+        </w:tc>
+        <w:tc>
+          <w:tcPr>
+            <w:tcW w:type="dxa" w:w="1275"/>
+          </w:tcPr>
+          <w:p>
+            <w:r>
+              <w:t>uint32</w:t>
+            </w:r>
+          </w:p>
+        </w:tc>
+        <w:tc>
+          <w:tcPr>
+            <w:tcW w:type="dxa" w:w="803"/>
+          </w:tcPr>
+          <w:p>
+            <w:r>
+              <w:t>ms</w:t>
+            </w:r>
+          </w:p>
+        </w:tc>
+        <w:tc>
+          <w:tcPr>
+            <w:tcW w:type="dxa" w:w="3226"/>
+          </w:tcPr>
+          <w:p>
+            <w:r>
+              <w:t>0~86399999</w:t>
+            </w:r>
+          </w:p>
+        </w:tc>
+        <w:tc>
+          <w:tcPr>
+            <w:tcW w:type="dxa" w:w="1600"/>
+          </w:tcPr>
+          <w:p>
+            <w:r>
+              <w:t>상대차 송신 절대시각 (HH:mm:ss.fff=자정 기준 ms) — 시계 동기 시 편도지연 산출</w:t>
+            </w:r>
+          </w:p>
+        </w:tc>
+      </w:tr>
     </w:tbl>
     <w:p>
       <w:pPr>
@@ -9978,7 +10082,7 @@
         <w:pStyle w:val="2"/>
       </w:pPr>
       <w:r>
-        <w:t>4.1 IF-V1 STATE 패킷 — struct '!BBBHdBxBxffxxx' (28B) + HMAC 32B = 60B (도메인 섹션 + reserved)</w:t>
+        <w:t>4.1 IF-V1 STATE 패킷 — struct '!BBBHdIBBffx' (28B) + HMAC 32B = 60B (절대 송신시각 tx_abs 포함)</w:t>
       </w:r>
     </w:p>
     <w:tbl>
@@ -10930,7 +11034,7 @@
           </w:tcPr>
           <w:p>
             <w:r>
-              <w:t>송신 단조 시각</w:t>
+              <w:t>송신 단조(monotonic) 시각 — 상대적, 시계 동기 가정 없음</w:t>
             </w:r>
           </w:p>
         </w:tc>
@@ -10980,7 +11084,7 @@
           </w:tcPr>
           <w:p>
             <w:r>
-              <w:t>current_lane</w:t>
+              <w:t>tx_abs</w:t>
             </w:r>
           </w:p>
         </w:tc>
@@ -11004,7 +11108,7 @@
           </w:tcPr>
           <w:p>
             <w:r>
-              <w:t>B</w:t>
+              <w:t>I</w:t>
             </w:r>
           </w:p>
         </w:tc>
@@ -11028,7 +11132,7 @@
           </w:tcPr>
           <w:p>
             <w:r>
-              <w:t>1</w:t>
+              <w:t>4</w:t>
             </w:r>
           </w:p>
         </w:tc>
@@ -11052,7 +11156,7 @@
           </w:tcPr>
           <w:p>
             <w:r>
-              <w:t>-</w:t>
+              <w:t>ms</w:t>
             </w:r>
           </w:p>
         </w:tc>
@@ -11076,7 +11180,7 @@
           </w:tcPr>
           <w:p>
             <w:r>
-              <w:t>현재 차로 (1·2, 0=미확정) — 인지 영역</w:t>
+              <w:t>송신 절대시각 = 자정 기준 ms (HH:mm:ss.fff, uint32 0~86399999)</w:t>
             </w:r>
           </w:p>
         </w:tc>
@@ -11102,7 +11206,7 @@
           </w:tcPr>
           <w:p>
             <w:r>
-              <w:t>14</w:t>
+              <w:t>17</w:t>
             </w:r>
           </w:p>
         </w:tc>
@@ -11126,7 +11230,7 @@
           </w:tcPr>
           <w:p>
             <w:r>
-              <w:t>(reserved)</w:t>
+              <w:t>current_lane</w:t>
             </w:r>
           </w:p>
         </w:tc>
@@ -11150,7 +11254,7 @@
           </w:tcPr>
           <w:p>
             <w:r>
-              <w:t>x</w:t>
+              <w:t>B</w:t>
             </w:r>
           </w:p>
         </w:tc>
@@ -11222,7 +11326,7 @@
           </w:tcPr>
           <w:p>
             <w:r>
-              <w:t>인지 예비 (송신 0·수신 무시)</w:t>
+              <w:t>현재 차로 (1·2, 0=미확정) — 인지 영역</w:t>
             </w:r>
           </w:p>
         </w:tc>
@@ -11248,7 +11352,7 @@
           </w:tcPr>
           <w:p>
             <w:r>
-              <w:t>15</w:t>
+              <w:t>18</w:t>
             </w:r>
           </w:p>
         </w:tc>
@@ -11380,7 +11484,7 @@
           </w:tcPr>
           <w:p>
             <w:r>
-              <w:t>16</w:t>
+              <w:t>19</w:t>
             </w:r>
           </w:p>
         </w:tc>
@@ -11390,7 +11494,7 @@
           </w:tcPr>
           <w:p>
             <w:r>
-              <w:t>(reserved)</w:t>
+              <w:t>throttle_pwm</w:t>
             </w:r>
           </w:p>
         </w:tc>
@@ -11400,7 +11504,7 @@
           </w:tcPr>
           <w:p>
             <w:r>
-              <w:t>x</w:t>
+              <w:t>f</w:t>
             </w:r>
           </w:p>
         </w:tc>
@@ -11410,7 +11514,7 @@
           </w:tcPr>
           <w:p>
             <w:r>
-              <w:t>1</w:t>
+              <w:t>4</w:t>
             </w:r>
           </w:p>
         </w:tc>
@@ -11420,7 +11524,7 @@
           </w:tcPr>
           <w:p>
             <w:r>
-              <w:t>-</w:t>
+              <w:t>duty</w:t>
             </w:r>
           </w:p>
         </w:tc>
@@ -11430,7 +11534,7 @@
           </w:tcPr>
           <w:p>
             <w:r>
-              <w:t>판단 예비</w:t>
+              <w:t>구동 PWM 듀티 -1~1, 부호=방향 (DC모터) — 모션 영역</w:t>
             </w:r>
           </w:p>
         </w:tc>
@@ -11442,7 +11546,7 @@
           </w:tcPr>
           <w:p>
             <w:r>
-              <w:t>17</w:t>
+              <w:t>23</w:t>
             </w:r>
           </w:p>
         </w:tc>
@@ -11452,7 +11556,7 @@
           </w:tcPr>
           <w:p>
             <w:r>
-              <w:t>throttle_pwm</w:t>
+              <w:t>steer_pwm</w:t>
             </w:r>
           </w:p>
         </w:tc>
@@ -11482,7 +11586,7 @@
           </w:tcPr>
           <w:p>
             <w:r>
-              <w:t>duty</w:t>
+              <w:t>정규화</w:t>
             </w:r>
           </w:p>
         </w:tc>
@@ -11492,7 +11596,7 @@
           </w:tcPr>
           <w:p>
             <w:r>
-              <w:t>구동 PWM 듀티 -1~1, 부호=방향 (DC모터) — 모션 영역</w:t>
+              <w:t>조향 PWM -1~1 (서보)</w:t>
             </w:r>
           </w:p>
         </w:tc>
@@ -11504,7 +11608,7 @@
           </w:tcPr>
           <w:p>
             <w:r>
-              <w:t>21</w:t>
+              <w:t>27</w:t>
             </w:r>
           </w:p>
         </w:tc>
@@ -11514,7 +11618,7 @@
           </w:tcPr>
           <w:p>
             <w:r>
-              <w:t>steer_pwm</w:t>
+              <w:t>(reserved)</w:t>
             </w:r>
           </w:p>
         </w:tc>
@@ -11524,7 +11628,7 @@
           </w:tcPr>
           <w:p>
             <w:r>
-              <w:t>f</w:t>
+              <w:t>x</w:t>
             </w:r>
           </w:p>
         </w:tc>
@@ -11534,7 +11638,7 @@
           </w:tcPr>
           <w:p>
             <w:r>
-              <w:t>4</w:t>
+              <w:t>1</w:t>
             </w:r>
           </w:p>
         </w:tc>
@@ -11544,7 +11648,7 @@
           </w:tcPr>
           <w:p>
             <w:r>
-              <w:t>정규화</w:t>
+              <w:t>-</w:t>
             </w:r>
           </w:p>
         </w:tc>
@@ -11554,131 +11658,7 @@
           </w:tcPr>
           <w:p>
             <w:r>
-              <w:t>조향 PWM -1~1 (서보)</w:t>
-            </w:r>
-          </w:p>
-        </w:tc>
-      </w:tr>
-      <w:tr>
-        <w:tc>
-          <w:tcPr>
-            <w:tcW w:type="dxa" w:w="900"/>
-          </w:tcPr>
-          <w:p>
-            <w:r>
-              <w:t>25</w:t>
-            </w:r>
-          </w:p>
-        </w:tc>
-        <w:tc>
-          <w:tcPr>
-            <w:tcW w:type="dxa" w:w="2214"/>
-          </w:tcPr>
-          <w:p>
-            <w:r>
-              <w:t>(reserved)</w:t>
-            </w:r>
-          </w:p>
-        </w:tc>
-        <w:tc>
-          <w:tcPr>
-            <w:tcW w:type="dxa" w:w="986"/>
-          </w:tcPr>
-          <w:p>
-            <w:r>
-              <w:t>x</w:t>
-            </w:r>
-          </w:p>
-        </w:tc>
-        <w:tc>
-          <w:tcPr>
-            <w:tcW w:type="dxa" w:w="2426"/>
-          </w:tcPr>
-          <w:p>
-            <w:r>
-              <w:t>1</w:t>
-            </w:r>
-          </w:p>
-        </w:tc>
-        <w:tc>
-          <w:tcPr>
-            <w:tcW w:type="dxa" w:w="1200"/>
-          </w:tcPr>
-          <w:p>
-            <w:r>
-              <w:t>-</w:t>
-            </w:r>
-          </w:p>
-        </w:tc>
-        <w:tc>
-          <w:tcPr>
-            <w:tcW w:type="dxa" w:w="1300"/>
-          </w:tcPr>
-          <w:p>
-            <w:r>
-              <w:t>모션 예비</w:t>
-            </w:r>
-          </w:p>
-        </w:tc>
-      </w:tr>
-      <w:tr>
-        <w:tc>
-          <w:tcPr>
-            <w:tcW w:type="dxa" w:w="900"/>
-          </w:tcPr>
-          <w:p>
-            <w:r>
-              <w:t>26</w:t>
-            </w:r>
-          </w:p>
-        </w:tc>
-        <w:tc>
-          <w:tcPr>
-            <w:tcW w:type="dxa" w:w="2214"/>
-          </w:tcPr>
-          <w:p>
-            <w:r>
-              <w:t>(reserved)</w:t>
-            </w:r>
-          </w:p>
-        </w:tc>
-        <w:tc>
-          <w:tcPr>
-            <w:tcW w:type="dxa" w:w="986"/>
-          </w:tcPr>
-          <w:p>
-            <w:r>
-              <w:t>x</w:t>
-            </w:r>
-          </w:p>
-        </w:tc>
-        <w:tc>
-          <w:tcPr>
-            <w:tcW w:type="dxa" w:w="2426"/>
-          </w:tcPr>
-          <w:p>
-            <w:r>
-              <w:t>2</w:t>
-            </w:r>
-          </w:p>
-        </w:tc>
-        <w:tc>
-          <w:tcPr>
-            <w:tcW w:type="dxa" w:w="1200"/>
-          </w:tcPr>
-          <w:p>
-            <w:r>
-              <w:t>-</w:t>
-            </w:r>
-          </w:p>
-        </w:tc>
-        <w:tc>
-          <w:tcPr>
-            <w:tcW w:type="dxa" w:w="1300"/>
-          </w:tcPr>
-          <w:p>
-            <w:r>
-              <w:t>공통 확장 예비</w:t>
+              <w:t>공통 확장 예비 (송신 0·수신 무시)</w:t>
             </w:r>
           </w:p>
         </w:tc>

</xml_diff>

<commit_message>
refactor: 거리 단위 cm 통일 — Scene.lane_offset/dist_front m→cm
- Scene.lane_offset_m→lane_offset_cm, dist_front_m→dist_front_cm (값 cm 기준) + ICD Scene 표 동기
- 곡률 lane_curvature_1pm 은 거리 아님 → 유지
- 팀/시뮬 맞춰야: decision.py scene.dist_front_m·SAFE_FRONT_DIST_M(0.5→50), simulator
</commit_message>
<xml_diff>
--- a/docs/05_SWE.2_SW아키텍처/ICD-PLT-001_인터페이스명세서_v1.0.docx
+++ b/docs/05_SWE.2_SW아키텍처/ICD-PLT-001_인터페이스명세서_v1.0.docx
@@ -5384,7 +5384,7 @@
                 <w:sz w:val="18"/>
                 <w:szCs w:val="18"/>
               </w:rPr>
-              <w:t>lane_offset_m</w:t>
+              <w:t>lane_offset_cm</w:t>
             </w:r>
           </w:p>
         </w:tc>
@@ -5454,7 +5454,7 @@
                 <w:sz w:val="18"/>
                 <w:szCs w:val="18"/>
               </w:rPr>
-              <w:t>m</w:t>
+              <w:t>cm</w:t>
             </w:r>
           </w:p>
         </w:tc>
@@ -6535,7 +6535,7 @@
                 <w:sz w:val="18"/>
                 <w:szCs w:val="18"/>
               </w:rPr>
-              <w:t>dist_front_m</w:t>
+              <w:t>dist_front_cm</w:t>
             </w:r>
           </w:p>
         </w:tc>
@@ -6602,7 +6602,7 @@
                 <w:sz w:val="18"/>
                 <w:szCs w:val="18"/>
               </w:rPr>
-              <w:t>m</w:t>
+              <w:t>cm</w:t>
             </w:r>
           </w:p>
         </w:tc>
@@ -14528,7 +14528,7 @@
                 <w:sz w:val="18"/>
                 <w:szCs w:val="18"/>
               </w:rPr>
-              <w:t>lane_offset_m·heading·curvature 범위, objects[] 클래스 목록</w:t>
+              <w:t>lane_offset_cm·heading·curvature 범위, objects[] 클래스 목록</w:t>
             </w:r>
           </w:p>
         </w:tc>

</xml_diff>